<commit_message>
edited relationships between classes and report
</commit_message>
<xml_diff>
--- a/ЛР 5. Рустамов ООП.docx
+++ b/ЛР 5. Рустамов ООП.docx
@@ -1178,21 +1178,10 @@
                 <w:lang w:eastAsia="ru-RU"/>
                 <w14:ligatures w14:val="none"/>
               </w:rPr>
-              <w:t>доцент к.т.н</w:t>
-            </w:r>
-          </w:p>
-        </w:tc>
-        <w:tc>
-          <w:tcPr>
-            <w:tcW w:w="240" w:type="dxa"/>
-            <w:vAlign w:val="center"/>
-          </w:tcPr>
-          <w:p>
-            <w:pPr>
-              <w:spacing w:line="240" w:lineRule="auto"/>
-              <w:ind w:firstLine="0"/>
-              <w:contextualSpacing w:val="0"/>
-              <w:jc w:val="center"/>
+              <w:t xml:space="preserve">доцент </w:t>
+            </w:r>
+            <w:proofErr w:type="spellStart"/>
+            <w:r>
               <w:rPr>
                 <w:rFonts w:ascii="Times New Roman" w:eastAsia="Times New Roman" w:hAnsi="Times New Roman" w:cs="Times New Roman"/>
                 <w:color w:val="000000"/>
@@ -1201,20 +1190,10 @@
                 <w:lang w:eastAsia="ru-RU"/>
                 <w14:ligatures w14:val="none"/>
               </w:rPr>
-            </w:pPr>
-          </w:p>
-        </w:tc>
-        <w:tc>
-          <w:tcPr>
-            <w:tcW w:w="282" w:type="dxa"/>
-            <w:vAlign w:val="center"/>
-          </w:tcPr>
-          <w:p>
-            <w:pPr>
-              <w:spacing w:line="240" w:lineRule="auto"/>
-              <w:ind w:firstLine="0"/>
-              <w:contextualSpacing w:val="0"/>
-              <w:jc w:val="center"/>
+              <w:t>к.</w:t>
+            </w:r>
+            <w:proofErr w:type="gramStart"/>
+            <w:r>
               <w:rPr>
                 <w:rFonts w:ascii="Times New Roman" w:eastAsia="Times New Roman" w:hAnsi="Times New Roman" w:cs="Times New Roman"/>
                 <w:color w:val="000000"/>
@@ -1223,14 +1202,16 @@
                 <w:lang w:eastAsia="ru-RU"/>
                 <w14:ligatures w14:val="none"/>
               </w:rPr>
-            </w:pPr>
-          </w:p>
-        </w:tc>
-        <w:tc>
-          <w:tcPr>
-            <w:tcW w:w="4153" w:type="dxa"/>
+              <w:t>т.н</w:t>
+            </w:r>
+            <w:proofErr w:type="spellEnd"/>
+            <w:proofErr w:type="gramEnd"/>
+          </w:p>
+        </w:tc>
+        <w:tc>
+          <w:tcPr>
+            <w:tcW w:w="240" w:type="dxa"/>
             <w:vAlign w:val="center"/>
-            <w:hideMark/>
           </w:tcPr>
           <w:p>
             <w:pPr>
@@ -1247,7 +1228,19 @@
                 <w14:ligatures w14:val="none"/>
               </w:rPr>
             </w:pPr>
-            <w:r>
+          </w:p>
+        </w:tc>
+        <w:tc>
+          <w:tcPr>
+            <w:tcW w:w="282" w:type="dxa"/>
+            <w:vAlign w:val="center"/>
+          </w:tcPr>
+          <w:p>
+            <w:pPr>
+              <w:spacing w:line="240" w:lineRule="auto"/>
+              <w:ind w:firstLine="0"/>
+              <w:contextualSpacing w:val="0"/>
+              <w:jc w:val="center"/>
               <w:rPr>
                 <w:rFonts w:ascii="Times New Roman" w:eastAsia="Times New Roman" w:hAnsi="Times New Roman" w:cs="Times New Roman"/>
                 <w:color w:val="000000"/>
@@ -1256,7 +1249,53 @@
                 <w:lang w:eastAsia="ru-RU"/>
                 <w14:ligatures w14:val="none"/>
               </w:rPr>
-              <w:t>Калентьев А.А.</w:t>
+            </w:pPr>
+          </w:p>
+        </w:tc>
+        <w:tc>
+          <w:tcPr>
+            <w:tcW w:w="4153" w:type="dxa"/>
+            <w:vAlign w:val="center"/>
+            <w:hideMark/>
+          </w:tcPr>
+          <w:p>
+            <w:pPr>
+              <w:spacing w:line="240" w:lineRule="auto"/>
+              <w:ind w:firstLine="0"/>
+              <w:contextualSpacing w:val="0"/>
+              <w:jc w:val="center"/>
+              <w:rPr>
+                <w:rFonts w:ascii="Times New Roman" w:eastAsia="Times New Roman" w:hAnsi="Times New Roman" w:cs="Times New Roman"/>
+                <w:color w:val="000000"/>
+                <w:kern w:val="0"/>
+                <w:szCs w:val="28"/>
+                <w:lang w:eastAsia="ru-RU"/>
+                <w14:ligatures w14:val="none"/>
+              </w:rPr>
+            </w:pPr>
+            <w:proofErr w:type="spellStart"/>
+            <w:r>
+              <w:rPr>
+                <w:rFonts w:ascii="Times New Roman" w:eastAsia="Times New Roman" w:hAnsi="Times New Roman" w:cs="Times New Roman"/>
+                <w:color w:val="000000"/>
+                <w:kern w:val="0"/>
+                <w:szCs w:val="28"/>
+                <w:lang w:eastAsia="ru-RU"/>
+                <w14:ligatures w14:val="none"/>
+              </w:rPr>
+              <w:t>Калентьев</w:t>
+            </w:r>
+            <w:proofErr w:type="spellEnd"/>
+            <w:r>
+              <w:rPr>
+                <w:rFonts w:ascii="Times New Roman" w:eastAsia="Times New Roman" w:hAnsi="Times New Roman" w:cs="Times New Roman"/>
+                <w:color w:val="000000"/>
+                <w:kern w:val="0"/>
+                <w:szCs w:val="28"/>
+                <w:lang w:eastAsia="ru-RU"/>
+                <w14:ligatures w14:val="none"/>
+              </w:rPr>
+              <w:t xml:space="preserve"> А.А.</w:t>
             </w:r>
           </w:p>
         </w:tc>
@@ -2452,7 +2491,7 @@
       </w:pPr>
       <w:r>
         <w:drawing>
-          <wp:inline distT="0" distB="0" distL="0" distR="0" wp14:anchorId="7AD332B9" wp14:editId="7283C61E">
+          <wp:inline distT="0" distB="0" distL="0" distR="0" wp14:anchorId="7AD332B9" wp14:editId="0699C61E">
             <wp:extent cx="3543300" cy="5212248"/>
             <wp:effectExtent l="0" t="0" r="0" b="0"/>
             <wp:docPr id="1595171144" name="Рисунок 3"/>
@@ -2572,10 +2611,32 @@
         <w:rPr>
           <w:lang w:val="en-US"/>
         </w:rPr>
-        <w:t xml:space="preserve"> диаграмма классов</w:t>
+        <w:t xml:space="preserve"> </w:t>
+      </w:r>
+      <w:proofErr w:type="spellStart"/>
+      <w:r>
+        <w:rPr>
+          <w:lang w:val="en-US"/>
+        </w:rPr>
+        <w:t>диаграмма</w:t>
+      </w:r>
+      <w:proofErr w:type="spellEnd"/>
+      <w:r>
+        <w:rPr>
+          <w:lang w:val="en-US"/>
+        </w:rPr>
+        <w:t xml:space="preserve"> </w:t>
+      </w:r>
+      <w:proofErr w:type="spellStart"/>
+      <w:r>
+        <w:rPr>
+          <w:lang w:val="en-US"/>
+        </w:rPr>
+        <w:t>классов</w:t>
       </w:r>
       <w:bookmarkEnd w:id="2"/>
       <w:bookmarkEnd w:id="3"/>
+      <w:proofErr w:type="spellEnd"/>
     </w:p>
     <w:p>
       <w:r>
@@ -2594,10 +2655,10 @@
       </w:pPr>
       <w:r>
         <w:drawing>
-          <wp:inline distT="0" distB="0" distL="0" distR="0" wp14:anchorId="35CB0289" wp14:editId="4E4A8336">
-            <wp:extent cx="5763380" cy="5829300"/>
-            <wp:effectExtent l="0" t="0" r="8890" b="0"/>
-            <wp:docPr id="1504887799" name="Рисунок 1"/>
+          <wp:inline distT="0" distB="0" distL="0" distR="0" wp14:anchorId="7416CD68" wp14:editId="6BD93381">
+            <wp:extent cx="5750262" cy="5830784"/>
+            <wp:effectExtent l="0" t="0" r="3175" b="0"/>
+            <wp:docPr id="1559099217" name="Рисунок 1"/>
             <wp:cNvGraphicFramePr>
               <a:graphicFrameLocks xmlns:a="http://schemas.openxmlformats.org/drawingml/2006/main" noChangeAspect="1"/>
             </wp:cNvGraphicFramePr>
@@ -2605,7 +2666,7 @@
               <a:graphicData uri="http://schemas.openxmlformats.org/drawingml/2006/picture">
                 <pic:pic xmlns:pic="http://schemas.openxmlformats.org/drawingml/2006/picture">
                   <pic:nvPicPr>
-                    <pic:cNvPr id="1504887799" name=""/>
+                    <pic:cNvPr id="1559099217" name=""/>
                     <pic:cNvPicPr/>
                   </pic:nvPicPr>
                   <pic:blipFill>
@@ -2617,7 +2678,7 @@
                   <pic:spPr>
                     <a:xfrm>
                       <a:off x="0" y="0"/>
-                      <a:ext cx="5768104" cy="5834078"/>
+                      <a:ext cx="5753277" cy="5833841"/>
                     </a:xfrm>
                     <a:prstGeom prst="rect">
                       <a:avLst/>
@@ -2674,12 +2735,20 @@
         <w:jc w:val="center"/>
       </w:pPr>
       <w:bookmarkStart w:id="4" w:name="_Toc232152815"/>
+      <w:proofErr w:type="spellStart"/>
       <w:r>
         <w:rPr>
           <w:lang w:val="en-US"/>
         </w:rPr>
         <w:lastRenderedPageBreak/>
-        <w:t xml:space="preserve">Описание </w:t>
+        <w:t>Описание</w:t>
+      </w:r>
+      <w:proofErr w:type="spellEnd"/>
+      <w:r>
+        <w:rPr>
+          <w:lang w:val="en-US"/>
+        </w:rPr>
+        <w:t xml:space="preserve"> </w:t>
       </w:r>
       <w:r>
         <w:t>связей</w:t>
@@ -2715,11 +2784,19 @@
         </w:rPr>
         <w:t xml:space="preserve"> </w:t>
       </w:r>
+      <w:proofErr w:type="spellStart"/>
       <w:r>
         <w:rPr>
           <w:lang w:val="en-US"/>
         </w:rPr>
-        <w:t>типа «</w:t>
+        <w:t>типа</w:t>
+      </w:r>
+      <w:proofErr w:type="spellEnd"/>
+      <w:r>
+        <w:rPr>
+          <w:lang w:val="en-US"/>
+        </w:rPr>
+        <w:t xml:space="preserve"> «</w:t>
       </w:r>
       <w:r>
         <w:t>тип</w:t>
@@ -2981,6 +3058,7 @@
               <w:ind w:firstLine="0"/>
               <w:jc w:val="center"/>
             </w:pPr>
+            <w:proofErr w:type="spellStart"/>
             <w:r>
               <w:rPr>
                 <w:rFonts w:ascii="Calibri" w:hAnsi="Calibri" w:cs="Calibri"/>
@@ -2990,6 +3068,7 @@
               </w:rPr>
               <w:t>VolumeFigureBase</w:t>
             </w:r>
+            <w:proofErr w:type="spellEnd"/>
           </w:p>
         </w:tc>
         <w:tc>
@@ -3005,6 +3084,7 @@
               <w:ind w:firstLine="0"/>
               <w:jc w:val="center"/>
             </w:pPr>
+            <w:proofErr w:type="spellStart"/>
             <w:r>
               <w:rPr>
                 <w:rFonts w:ascii="Calibri" w:hAnsi="Calibri" w:cs="Calibri"/>
@@ -3014,6 +3094,7 @@
               </w:rPr>
               <w:t>IVolumeFigure</w:t>
             </w:r>
+            <w:proofErr w:type="spellEnd"/>
           </w:p>
         </w:tc>
         <w:tc>
@@ -3059,7 +3140,47 @@
                 <w:sz w:val="22"/>
                 <w:szCs w:val="22"/>
               </w:rPr>
-              <w:t>Абстрактный класс VolumeFigureBase реализует интерфейс IVolumeFigure. Интерфейс задаёт общий контракт для всех объёмных фигур: наличие типа фигуры, объёма и метода получения описания.</w:t>
+              <w:t xml:space="preserve">Абстрактный класс </w:t>
+            </w:r>
+            <w:proofErr w:type="spellStart"/>
+            <w:r>
+              <w:rPr>
+                <w:rFonts w:ascii="Calibri" w:hAnsi="Calibri" w:cs="Calibri"/>
+                <w:color w:val="000000"/>
+                <w:sz w:val="22"/>
+                <w:szCs w:val="22"/>
+              </w:rPr>
+              <w:t>VolumeFigureBase</w:t>
+            </w:r>
+            <w:proofErr w:type="spellEnd"/>
+            <w:r>
+              <w:rPr>
+                <w:rFonts w:ascii="Calibri" w:hAnsi="Calibri" w:cs="Calibri"/>
+                <w:color w:val="000000"/>
+                <w:sz w:val="22"/>
+                <w:szCs w:val="22"/>
+              </w:rPr>
+              <w:t xml:space="preserve"> реализует интерфейс </w:t>
+            </w:r>
+            <w:proofErr w:type="spellStart"/>
+            <w:r>
+              <w:rPr>
+                <w:rFonts w:ascii="Calibri" w:hAnsi="Calibri" w:cs="Calibri"/>
+                <w:color w:val="000000"/>
+                <w:sz w:val="22"/>
+                <w:szCs w:val="22"/>
+              </w:rPr>
+              <w:t>IVolumeFigure</w:t>
+            </w:r>
+            <w:proofErr w:type="spellEnd"/>
+            <w:r>
+              <w:rPr>
+                <w:rFonts w:ascii="Calibri" w:hAnsi="Calibri" w:cs="Calibri"/>
+                <w:color w:val="000000"/>
+                <w:sz w:val="22"/>
+                <w:szCs w:val="22"/>
+              </w:rPr>
+              <w:t>. Интерфейс задаёт общий контракт для всех объёмных фигур: наличие типа фигуры, объёма и метода получения описания.</w:t>
             </w:r>
           </w:p>
         </w:tc>
@@ -3075,6 +3196,7 @@
               <w:ind w:firstLine="0"/>
               <w:jc w:val="center"/>
             </w:pPr>
+            <w:proofErr w:type="spellStart"/>
             <w:r>
               <w:rPr>
                 <w:rFonts w:ascii="Calibri" w:hAnsi="Calibri" w:cs="Calibri"/>
@@ -3084,6 +3206,7 @@
               </w:rPr>
               <w:t>Sphere</w:t>
             </w:r>
+            <w:proofErr w:type="spellEnd"/>
           </w:p>
         </w:tc>
         <w:tc>
@@ -3096,6 +3219,7 @@
               <w:ind w:firstLine="0"/>
               <w:jc w:val="center"/>
             </w:pPr>
+            <w:proofErr w:type="spellStart"/>
             <w:r>
               <w:rPr>
                 <w:rFonts w:ascii="Calibri" w:hAnsi="Calibri" w:cs="Calibri"/>
@@ -3105,6 +3229,7 @@
               </w:rPr>
               <w:t>VolumeFigureBase</w:t>
             </w:r>
+            <w:proofErr w:type="spellEnd"/>
           </w:p>
         </w:tc>
         <w:tc>
@@ -3147,7 +3272,47 @@
                 <w:sz w:val="22"/>
                 <w:szCs w:val="22"/>
               </w:rPr>
-              <w:t>Класс Sphere является частным случаем объёмной фигуры. Он наследует общие свойства и методы базового класса VolumeFigureBase и реализует собственную логику вычисления объёма сферы.</w:t>
+              <w:t xml:space="preserve">Класс </w:t>
+            </w:r>
+            <w:proofErr w:type="spellStart"/>
+            <w:r>
+              <w:rPr>
+                <w:rFonts w:ascii="Calibri" w:hAnsi="Calibri" w:cs="Calibri"/>
+                <w:color w:val="000000"/>
+                <w:sz w:val="22"/>
+                <w:szCs w:val="22"/>
+              </w:rPr>
+              <w:t>Sphere</w:t>
+            </w:r>
+            <w:proofErr w:type="spellEnd"/>
+            <w:r>
+              <w:rPr>
+                <w:rFonts w:ascii="Calibri" w:hAnsi="Calibri" w:cs="Calibri"/>
+                <w:color w:val="000000"/>
+                <w:sz w:val="22"/>
+                <w:szCs w:val="22"/>
+              </w:rPr>
+              <w:t xml:space="preserve"> является частным случаем объёмной фигуры. Он наследует общие свойства и методы базового класса </w:t>
+            </w:r>
+            <w:proofErr w:type="spellStart"/>
+            <w:r>
+              <w:rPr>
+                <w:rFonts w:ascii="Calibri" w:hAnsi="Calibri" w:cs="Calibri"/>
+                <w:color w:val="000000"/>
+                <w:sz w:val="22"/>
+                <w:szCs w:val="22"/>
+              </w:rPr>
+              <w:t>VolumeFigureBase</w:t>
+            </w:r>
+            <w:proofErr w:type="spellEnd"/>
+            <w:r>
+              <w:rPr>
+                <w:rFonts w:ascii="Calibri" w:hAnsi="Calibri" w:cs="Calibri"/>
+                <w:color w:val="000000"/>
+                <w:sz w:val="22"/>
+                <w:szCs w:val="22"/>
+              </w:rPr>
+              <w:t xml:space="preserve"> и реализует собственную логику вычисления объёма сферы.</w:t>
             </w:r>
           </w:p>
         </w:tc>
@@ -3163,6 +3328,7 @@
               <w:ind w:firstLine="0"/>
               <w:jc w:val="center"/>
             </w:pPr>
+            <w:proofErr w:type="spellStart"/>
             <w:r>
               <w:rPr>
                 <w:rFonts w:ascii="Calibri" w:hAnsi="Calibri" w:cs="Calibri"/>
@@ -3172,6 +3338,7 @@
               </w:rPr>
               <w:t>Pyramid</w:t>
             </w:r>
+            <w:proofErr w:type="spellEnd"/>
           </w:p>
         </w:tc>
         <w:tc>
@@ -3184,6 +3351,7 @@
               <w:ind w:firstLine="0"/>
               <w:jc w:val="center"/>
             </w:pPr>
+            <w:proofErr w:type="spellStart"/>
             <w:r>
               <w:rPr>
                 <w:rFonts w:ascii="Calibri" w:hAnsi="Calibri" w:cs="Calibri"/>
@@ -3193,6 +3361,7 @@
               </w:rPr>
               <w:t>VolumeFigureBase</w:t>
             </w:r>
+            <w:proofErr w:type="spellEnd"/>
           </w:p>
         </w:tc>
         <w:tc>
@@ -3235,7 +3404,27 @@
                 <w:sz w:val="22"/>
                 <w:szCs w:val="22"/>
               </w:rPr>
-              <w:t>Класс Pyramid является частным случаем объёмной фигуры. Он наследует общий интерфейс работы с фигурой и реализует вычисление объёма пирамиды на основе размеров основания и высоты.</w:t>
+              <w:t xml:space="preserve">Класс </w:t>
+            </w:r>
+            <w:proofErr w:type="spellStart"/>
+            <w:r>
+              <w:rPr>
+                <w:rFonts w:ascii="Calibri" w:hAnsi="Calibri" w:cs="Calibri"/>
+                <w:color w:val="000000"/>
+                <w:sz w:val="22"/>
+                <w:szCs w:val="22"/>
+              </w:rPr>
+              <w:t>Pyramid</w:t>
+            </w:r>
+            <w:proofErr w:type="spellEnd"/>
+            <w:r>
+              <w:rPr>
+                <w:rFonts w:ascii="Calibri" w:hAnsi="Calibri" w:cs="Calibri"/>
+                <w:color w:val="000000"/>
+                <w:sz w:val="22"/>
+                <w:szCs w:val="22"/>
+              </w:rPr>
+              <w:t xml:space="preserve"> является частным случаем объёмной фигуры. Он наследует общий интерфейс работы с фигурой и реализует вычисление объёма пирамиды на основе размеров основания и высоты.</w:t>
             </w:r>
           </w:p>
         </w:tc>
@@ -3251,6 +3440,7 @@
               <w:ind w:firstLine="0"/>
               <w:jc w:val="center"/>
             </w:pPr>
+            <w:proofErr w:type="spellStart"/>
             <w:r>
               <w:rPr>
                 <w:rFonts w:ascii="Calibri" w:hAnsi="Calibri" w:cs="Calibri"/>
@@ -3260,6 +3450,7 @@
               </w:rPr>
               <w:t>Parallelepiped</w:t>
             </w:r>
+            <w:proofErr w:type="spellEnd"/>
           </w:p>
         </w:tc>
         <w:tc>
@@ -3272,6 +3463,7 @@
               <w:ind w:firstLine="0"/>
               <w:jc w:val="center"/>
             </w:pPr>
+            <w:proofErr w:type="spellStart"/>
             <w:r>
               <w:rPr>
                 <w:rFonts w:ascii="Calibri" w:hAnsi="Calibri" w:cs="Calibri"/>
@@ -3281,6 +3473,7 @@
               </w:rPr>
               <w:t>VolumeFigureBase</w:t>
             </w:r>
+            <w:proofErr w:type="spellEnd"/>
           </w:p>
         </w:tc>
         <w:tc>
@@ -3323,7 +3516,27 @@
                 <w:sz w:val="22"/>
                 <w:szCs w:val="22"/>
               </w:rPr>
-              <w:t>Класс Parallelepiped является частным случаем объёмной фигуры. Он наследует базовую структуру объёмной фигуры и реализует вычисление объёма параллелепипеда по длине, ширине и высоте.</w:t>
+              <w:t xml:space="preserve">Класс </w:t>
+            </w:r>
+            <w:proofErr w:type="spellStart"/>
+            <w:r>
+              <w:rPr>
+                <w:rFonts w:ascii="Calibri" w:hAnsi="Calibri" w:cs="Calibri"/>
+                <w:color w:val="000000"/>
+                <w:sz w:val="22"/>
+                <w:szCs w:val="22"/>
+              </w:rPr>
+              <w:t>Parallelepiped</w:t>
+            </w:r>
+            <w:proofErr w:type="spellEnd"/>
+            <w:r>
+              <w:rPr>
+                <w:rFonts w:ascii="Calibri" w:hAnsi="Calibri" w:cs="Calibri"/>
+                <w:color w:val="000000"/>
+                <w:sz w:val="22"/>
+                <w:szCs w:val="22"/>
+              </w:rPr>
+              <w:t xml:space="preserve"> является частным случаем объёмной фигуры. Он наследует базовую структуру объёмной фигуры и реализует вычисление объёма параллелепипеда по длине, ширине и высоте.</w:t>
             </w:r>
           </w:p>
         </w:tc>
@@ -3533,6 +3746,7 @@
               <w:ind w:firstLine="0"/>
               <w:jc w:val="center"/>
             </w:pPr>
+            <w:proofErr w:type="spellStart"/>
             <w:r>
               <w:rPr>
                 <w:rFonts w:ascii="Calibri" w:hAnsi="Calibri" w:cs="Calibri"/>
@@ -3542,6 +3756,7 @@
               </w:rPr>
               <w:t>VolumeFiguresForm</w:t>
             </w:r>
+            <w:proofErr w:type="spellEnd"/>
           </w:p>
         </w:tc>
         <w:tc>
@@ -3557,6 +3772,7 @@
               <w:ind w:firstLine="0"/>
               <w:jc w:val="center"/>
             </w:pPr>
+            <w:proofErr w:type="spellStart"/>
             <w:r>
               <w:rPr>
                 <w:rFonts w:ascii="Calibri" w:hAnsi="Calibri" w:cs="Calibri"/>
@@ -3566,6 +3782,7 @@
               </w:rPr>
               <w:t>VolumeFigureBase</w:t>
             </w:r>
+            <w:proofErr w:type="spellEnd"/>
           </w:p>
         </w:tc>
         <w:tc>
@@ -3588,7 +3805,7 @@
                 <w:sz w:val="22"/>
                 <w:szCs w:val="22"/>
               </w:rPr>
-              <w:t>Агрегация</w:t>
+              <w:t>Композиция</w:t>
             </w:r>
           </w:p>
         </w:tc>
@@ -3611,7 +3828,27 @@
                 <w:sz w:val="22"/>
                 <w:szCs w:val="22"/>
               </w:rPr>
-              <w:t>Главная форма содержит список объёмных фигур _figures. Через этот список выполняется отображение, удаление, сохранение и загрузка фигур.</w:t>
+              <w:t>Главная форма содержит список объёмных фигур _</w:t>
+            </w:r>
+            <w:proofErr w:type="spellStart"/>
+            <w:r>
+              <w:rPr>
+                <w:rFonts w:ascii="Calibri" w:hAnsi="Calibri" w:cs="Calibri"/>
+                <w:color w:val="000000"/>
+                <w:sz w:val="22"/>
+                <w:szCs w:val="22"/>
+              </w:rPr>
+              <w:t>figures</w:t>
+            </w:r>
+            <w:proofErr w:type="spellEnd"/>
+            <w:r>
+              <w:rPr>
+                <w:rFonts w:ascii="Calibri" w:hAnsi="Calibri" w:cs="Calibri"/>
+                <w:color w:val="000000"/>
+                <w:sz w:val="22"/>
+                <w:szCs w:val="22"/>
+              </w:rPr>
+              <w:t>. Через этот список выполняется отображение, удаление, сохранение и загрузка фигур.</w:t>
             </w:r>
           </w:p>
         </w:tc>
@@ -3627,6 +3864,7 @@
               <w:ind w:firstLine="0"/>
               <w:jc w:val="center"/>
             </w:pPr>
+            <w:proofErr w:type="spellStart"/>
             <w:r>
               <w:rPr>
                 <w:rFonts w:ascii="Calibri" w:hAnsi="Calibri" w:cs="Calibri"/>
@@ -3636,6 +3874,7 @@
               </w:rPr>
               <w:t>AddFigureForm</w:t>
             </w:r>
+            <w:proofErr w:type="spellEnd"/>
           </w:p>
         </w:tc>
         <w:tc>
@@ -3648,6 +3887,7 @@
               <w:ind w:firstLine="0"/>
               <w:jc w:val="center"/>
             </w:pPr>
+            <w:proofErr w:type="spellStart"/>
             <w:r>
               <w:rPr>
                 <w:rFonts w:ascii="Calibri" w:hAnsi="Calibri" w:cs="Calibri"/>
@@ -3657,6 +3897,7 @@
               </w:rPr>
               <w:t>VolumeFigureBase</w:t>
             </w:r>
+            <w:proofErr w:type="spellEnd"/>
           </w:p>
         </w:tc>
         <w:tc>
@@ -3696,7 +3937,47 @@
                 <w:sz w:val="22"/>
                 <w:szCs w:val="22"/>
               </w:rPr>
-              <w:t>Форма добавления хранит созданную фигуру в свойстве CreatedFigure, имеющем тип VolumeFigureBase.</w:t>
+              <w:t xml:space="preserve">Форма добавления хранит созданную фигуру в свойстве </w:t>
+            </w:r>
+            <w:proofErr w:type="spellStart"/>
+            <w:r>
+              <w:rPr>
+                <w:rFonts w:ascii="Calibri" w:hAnsi="Calibri" w:cs="Calibri"/>
+                <w:color w:val="000000"/>
+                <w:sz w:val="22"/>
+                <w:szCs w:val="22"/>
+              </w:rPr>
+              <w:t>CreatedFigure</w:t>
+            </w:r>
+            <w:proofErr w:type="spellEnd"/>
+            <w:r>
+              <w:rPr>
+                <w:rFonts w:ascii="Calibri" w:hAnsi="Calibri" w:cs="Calibri"/>
+                <w:color w:val="000000"/>
+                <w:sz w:val="22"/>
+                <w:szCs w:val="22"/>
+              </w:rPr>
+              <w:t xml:space="preserve">, имеющем тип </w:t>
+            </w:r>
+            <w:proofErr w:type="spellStart"/>
+            <w:r>
+              <w:rPr>
+                <w:rFonts w:ascii="Calibri" w:hAnsi="Calibri" w:cs="Calibri"/>
+                <w:color w:val="000000"/>
+                <w:sz w:val="22"/>
+                <w:szCs w:val="22"/>
+              </w:rPr>
+              <w:t>VolumeFigureBase</w:t>
+            </w:r>
+            <w:proofErr w:type="spellEnd"/>
+            <w:r>
+              <w:rPr>
+                <w:rFonts w:ascii="Calibri" w:hAnsi="Calibri" w:cs="Calibri"/>
+                <w:color w:val="000000"/>
+                <w:sz w:val="22"/>
+                <w:szCs w:val="22"/>
+              </w:rPr>
+              <w:t>.</w:t>
             </w:r>
           </w:p>
         </w:tc>
@@ -3718,6 +3999,7 @@
                 <w:szCs w:val="22"/>
               </w:rPr>
             </w:pPr>
+            <w:proofErr w:type="spellStart"/>
             <w:r>
               <w:rPr>
                 <w:rFonts w:ascii="Calibri" w:hAnsi="Calibri" w:cs="Calibri"/>
@@ -3727,6 +4009,7 @@
               </w:rPr>
               <w:t>FindFigureForm</w:t>
             </w:r>
+            <w:proofErr w:type="spellEnd"/>
           </w:p>
         </w:tc>
         <w:tc>
@@ -3745,6 +4028,7 @@
                 <w:szCs w:val="22"/>
               </w:rPr>
             </w:pPr>
+            <w:proofErr w:type="spellStart"/>
             <w:r>
               <w:rPr>
                 <w:rFonts w:ascii="Calibri" w:hAnsi="Calibri" w:cs="Calibri"/>
@@ -3754,6 +4038,7 @@
               </w:rPr>
               <w:t>VolumeFigureBase</w:t>
             </w:r>
+            <w:proofErr w:type="spellEnd"/>
           </w:p>
         </w:tc>
         <w:tc>
@@ -3837,6 +4122,7 @@
                 <w14:ligatures w14:val="none"/>
               </w:rPr>
             </w:pPr>
+            <w:proofErr w:type="spellStart"/>
             <w:r>
               <w:rPr>
                 <w:rFonts w:ascii="Calibri" w:eastAsia="Times New Roman" w:hAnsi="Calibri" w:cs="Calibri"/>
@@ -3849,6 +4135,7 @@
               </w:rPr>
               <w:t>FiguresFileData</w:t>
             </w:r>
+            <w:proofErr w:type="spellEnd"/>
           </w:p>
         </w:tc>
         <w:tc>
@@ -3874,6 +4161,7 @@
                 <w14:ligatures w14:val="none"/>
               </w:rPr>
             </w:pPr>
+            <w:proofErr w:type="spellStart"/>
             <w:r>
               <w:rPr>
                 <w:rFonts w:ascii="Calibri" w:eastAsia="Times New Roman" w:hAnsi="Calibri" w:cs="Calibri"/>
@@ -3886,6 +4174,7 @@
               </w:rPr>
               <w:t>FigureData</w:t>
             </w:r>
+            <w:proofErr w:type="spellEnd"/>
           </w:p>
         </w:tc>
         <w:tc>
@@ -3911,6 +4200,7 @@
                 <w14:ligatures w14:val="none"/>
               </w:rPr>
             </w:pPr>
+            <w:proofErr w:type="spellStart"/>
             <w:r>
               <w:rPr>
                 <w:rFonts w:ascii="Calibri" w:eastAsia="Times New Roman" w:hAnsi="Calibri" w:cs="Calibri"/>
@@ -3923,6 +4213,7 @@
               </w:rPr>
               <w:t>Композиция</w:t>
             </w:r>
+            <w:proofErr w:type="spellEnd"/>
           </w:p>
         </w:tc>
         <w:tc>
@@ -3957,6 +4248,7 @@
               </w:rPr>
               <w:t xml:space="preserve">Класс </w:t>
             </w:r>
+            <w:proofErr w:type="spellStart"/>
             <w:r>
               <w:rPr>
                 <w:rFonts w:ascii="Calibri" w:eastAsia="Times New Roman" w:hAnsi="Calibri" w:cs="Calibri"/>
@@ -3969,6 +4261,7 @@
               </w:rPr>
               <w:t>FiguresFileData</w:t>
             </w:r>
+            <w:proofErr w:type="spellEnd"/>
             <w:r>
               <w:rPr>
                 <w:rFonts w:ascii="Calibri" w:eastAsia="Times New Roman" w:hAnsi="Calibri" w:cs="Calibri"/>
@@ -3980,6 +4273,7 @@
               </w:rPr>
               <w:t xml:space="preserve"> содержит коллекцию объектов </w:t>
             </w:r>
+            <w:proofErr w:type="spellStart"/>
             <w:r>
               <w:rPr>
                 <w:rFonts w:ascii="Calibri" w:eastAsia="Times New Roman" w:hAnsi="Calibri" w:cs="Calibri"/>
@@ -3992,6 +4286,7 @@
               </w:rPr>
               <w:t>FigureData</w:t>
             </w:r>
+            <w:proofErr w:type="spellEnd"/>
             <w:r>
               <w:rPr>
                 <w:rFonts w:ascii="Calibri" w:eastAsia="Times New Roman" w:hAnsi="Calibri" w:cs="Calibri"/>
@@ -4003,6 +4298,7 @@
               </w:rPr>
               <w:t xml:space="preserve">. Объекты </w:t>
             </w:r>
+            <w:proofErr w:type="spellStart"/>
             <w:r>
               <w:rPr>
                 <w:rFonts w:ascii="Calibri" w:eastAsia="Times New Roman" w:hAnsi="Calibri" w:cs="Calibri"/>
@@ -4015,6 +4311,7 @@
               </w:rPr>
               <w:t>FigureData</w:t>
             </w:r>
+            <w:proofErr w:type="spellEnd"/>
             <w:r>
               <w:rPr>
                 <w:rFonts w:ascii="Calibri" w:eastAsia="Times New Roman" w:hAnsi="Calibri" w:cs="Calibri"/>
@@ -4210,6 +4507,7 @@
               <w:ind w:firstLine="0"/>
               <w:jc w:val="center"/>
             </w:pPr>
+            <w:proofErr w:type="spellStart"/>
             <w:r>
               <w:rPr>
                 <w:rFonts w:ascii="Calibri" w:hAnsi="Calibri" w:cs="Calibri"/>
@@ -4219,6 +4517,7 @@
               </w:rPr>
               <w:t>VolumeFiguresForm</w:t>
             </w:r>
+            <w:proofErr w:type="spellEnd"/>
           </w:p>
         </w:tc>
         <w:tc>
@@ -4240,7 +4539,27 @@
                 <w:sz w:val="22"/>
                 <w:szCs w:val="22"/>
               </w:rPr>
-              <w:t>Класс Program является точкой входа в приложение и запускает главную форму VolumeFiguresForm.</w:t>
+              <w:t xml:space="preserve">Класс Program является точкой входа в приложение и запускает главную форму </w:t>
+            </w:r>
+            <w:proofErr w:type="spellStart"/>
+            <w:r>
+              <w:rPr>
+                <w:rFonts w:ascii="Calibri" w:hAnsi="Calibri" w:cs="Calibri"/>
+                <w:color w:val="000000"/>
+                <w:sz w:val="22"/>
+                <w:szCs w:val="22"/>
+              </w:rPr>
+              <w:t>VolumeFiguresForm</w:t>
+            </w:r>
+            <w:proofErr w:type="spellEnd"/>
+            <w:r>
+              <w:rPr>
+                <w:rFonts w:ascii="Calibri" w:hAnsi="Calibri" w:cs="Calibri"/>
+                <w:color w:val="000000"/>
+                <w:sz w:val="22"/>
+                <w:szCs w:val="22"/>
+              </w:rPr>
+              <w:t>.</w:t>
             </w:r>
           </w:p>
         </w:tc>
@@ -4259,6 +4578,7 @@
               <w:ind w:firstLine="0"/>
               <w:jc w:val="center"/>
             </w:pPr>
+            <w:proofErr w:type="spellStart"/>
             <w:r>
               <w:rPr>
                 <w:rFonts w:ascii="Calibri" w:hAnsi="Calibri" w:cs="Calibri"/>
@@ -4268,6 +4588,7 @@
               </w:rPr>
               <w:t>VolumeFiguresForm</w:t>
             </w:r>
+            <w:proofErr w:type="spellEnd"/>
           </w:p>
         </w:tc>
         <w:tc>
@@ -4283,6 +4604,7 @@
               <w:ind w:firstLine="0"/>
               <w:jc w:val="center"/>
             </w:pPr>
+            <w:proofErr w:type="spellStart"/>
             <w:r>
               <w:rPr>
                 <w:rFonts w:ascii="Calibri" w:hAnsi="Calibri" w:cs="Calibri"/>
@@ -4292,6 +4614,7 @@
               </w:rPr>
               <w:t>AddFigureForm</w:t>
             </w:r>
+            <w:proofErr w:type="spellEnd"/>
           </w:p>
         </w:tc>
         <w:tc>
@@ -4332,6 +4655,7 @@
                 <w:szCs w:val="22"/>
               </w:rPr>
             </w:pPr>
+            <w:proofErr w:type="spellStart"/>
             <w:r>
               <w:rPr>
                 <w:rFonts w:ascii="Calibri" w:hAnsi="Calibri" w:cs="Calibri"/>
@@ -4341,6 +4665,7 @@
               </w:rPr>
               <w:t>VolumeFiguresForm</w:t>
             </w:r>
+            <w:proofErr w:type="spellEnd"/>
           </w:p>
         </w:tc>
         <w:tc>
@@ -4359,6 +4684,7 @@
                 <w:szCs w:val="22"/>
               </w:rPr>
             </w:pPr>
+            <w:proofErr w:type="spellStart"/>
             <w:r>
               <w:rPr>
                 <w:rFonts w:ascii="Calibri" w:hAnsi="Calibri" w:cs="Calibri"/>
@@ -4368,6 +4694,7 @@
               </w:rPr>
               <w:t>FindFigureForm</w:t>
             </w:r>
+            <w:proofErr w:type="spellEnd"/>
           </w:p>
         </w:tc>
         <w:tc>
@@ -4424,6 +4751,7 @@
                 <w14:ligatures w14:val="none"/>
               </w:rPr>
             </w:pPr>
+            <w:proofErr w:type="spellStart"/>
             <w:r>
               <w:rPr>
                 <w:rFonts w:ascii="Calibri" w:hAnsi="Calibri" w:cs="Calibri"/>
@@ -4433,6 +4761,7 @@
               </w:rPr>
               <w:t>VolumeFiguresForm</w:t>
             </w:r>
+            <w:proofErr w:type="spellEnd"/>
           </w:p>
         </w:tc>
         <w:tc>
@@ -4458,6 +4787,7 @@
                 <w14:ligatures w14:val="none"/>
               </w:rPr>
             </w:pPr>
+            <w:proofErr w:type="spellStart"/>
             <w:r>
               <w:rPr>
                 <w:rFonts w:ascii="Calibri" w:hAnsi="Calibri" w:cs="Calibri"/>
@@ -4467,6 +4797,7 @@
               </w:rPr>
               <w:t>FigureStorage</w:t>
             </w:r>
+            <w:proofErr w:type="spellEnd"/>
           </w:p>
         </w:tc>
         <w:tc>
@@ -4498,7 +4829,27 @@
                 <w:sz w:val="22"/>
                 <w:szCs w:val="22"/>
               </w:rPr>
-              <w:t>Главная форма использует класс FigureStorage для сохранения и загрузки списка фигур из файла.</w:t>
+              <w:t xml:space="preserve">Главная форма использует класс </w:t>
+            </w:r>
+            <w:proofErr w:type="spellStart"/>
+            <w:r>
+              <w:rPr>
+                <w:rFonts w:ascii="Calibri" w:hAnsi="Calibri" w:cs="Calibri"/>
+                <w:color w:val="000000"/>
+                <w:sz w:val="22"/>
+                <w:szCs w:val="22"/>
+              </w:rPr>
+              <w:t>FigureStorage</w:t>
+            </w:r>
+            <w:proofErr w:type="spellEnd"/>
+            <w:r>
+              <w:rPr>
+                <w:rFonts w:ascii="Calibri" w:hAnsi="Calibri" w:cs="Calibri"/>
+                <w:color w:val="000000"/>
+                <w:sz w:val="22"/>
+                <w:szCs w:val="22"/>
+              </w:rPr>
+              <w:t xml:space="preserve"> для сохранения и загрузки списка фигур из файла.</w:t>
             </w:r>
           </w:p>
         </w:tc>
@@ -4529,6 +4880,7 @@
                 <w14:ligatures w14:val="none"/>
               </w:rPr>
             </w:pPr>
+            <w:proofErr w:type="spellStart"/>
             <w:r>
               <w:rPr>
                 <w:rFonts w:ascii="Calibri" w:hAnsi="Calibri" w:cs="Calibri"/>
@@ -4538,6 +4890,7 @@
               </w:rPr>
               <w:t>VolumeFiguresForm</w:t>
             </w:r>
+            <w:proofErr w:type="spellEnd"/>
           </w:p>
         </w:tc>
         <w:tc>
@@ -4562,6 +4915,7 @@
                 <w14:ligatures w14:val="none"/>
               </w:rPr>
             </w:pPr>
+            <w:proofErr w:type="spellStart"/>
             <w:r>
               <w:rPr>
                 <w:rFonts w:ascii="Calibri" w:hAnsi="Calibri" w:cs="Calibri"/>
@@ -4571,6 +4925,7 @@
               </w:rPr>
               <w:t>FormatPrecision</w:t>
             </w:r>
+            <w:proofErr w:type="spellEnd"/>
           </w:p>
         </w:tc>
         <w:tc>
@@ -4631,6 +4986,7 @@
                 <w14:ligatures w14:val="none"/>
               </w:rPr>
             </w:pPr>
+            <w:proofErr w:type="spellStart"/>
             <w:r>
               <w:rPr>
                 <w:rFonts w:ascii="Calibri" w:hAnsi="Calibri" w:cs="Calibri"/>
@@ -4640,6 +4996,7 @@
               </w:rPr>
               <w:t>AddFigureForm</w:t>
             </w:r>
+            <w:proofErr w:type="spellEnd"/>
           </w:p>
         </w:tc>
         <w:tc>
@@ -4663,6 +5020,7 @@
                 <w14:ligatures w14:val="none"/>
               </w:rPr>
             </w:pPr>
+            <w:proofErr w:type="spellStart"/>
             <w:r>
               <w:rPr>
                 <w:rFonts w:ascii="Calibri" w:hAnsi="Calibri" w:cs="Calibri"/>
@@ -4672,6 +5030,7 @@
               </w:rPr>
               <w:t>Sphere</w:t>
             </w:r>
+            <w:proofErr w:type="spellEnd"/>
           </w:p>
         </w:tc>
         <w:tc>
@@ -4702,7 +5061,27 @@
                 <w:sz w:val="22"/>
                 <w:szCs w:val="22"/>
               </w:rPr>
-              <w:t>Форма добавления создаёт объект класса Sphere при выборе соответствующего типа фигуры.</w:t>
+              <w:t xml:space="preserve">Форма добавления создаёт объект класса </w:t>
+            </w:r>
+            <w:proofErr w:type="spellStart"/>
+            <w:r>
+              <w:rPr>
+                <w:rFonts w:ascii="Calibri" w:hAnsi="Calibri" w:cs="Calibri"/>
+                <w:color w:val="000000"/>
+                <w:sz w:val="22"/>
+                <w:szCs w:val="22"/>
+              </w:rPr>
+              <w:t>Sphere</w:t>
+            </w:r>
+            <w:proofErr w:type="spellEnd"/>
+            <w:r>
+              <w:rPr>
+                <w:rFonts w:ascii="Calibri" w:hAnsi="Calibri" w:cs="Calibri"/>
+                <w:color w:val="000000"/>
+                <w:sz w:val="22"/>
+                <w:szCs w:val="22"/>
+              </w:rPr>
+              <w:t xml:space="preserve"> при выборе соответствующего типа фигуры.</w:t>
             </w:r>
           </w:p>
         </w:tc>
@@ -4732,6 +5111,7 @@
                 <w14:ligatures w14:val="none"/>
               </w:rPr>
             </w:pPr>
+            <w:proofErr w:type="spellStart"/>
             <w:r>
               <w:rPr>
                 <w:rFonts w:ascii="Calibri" w:hAnsi="Calibri" w:cs="Calibri"/>
@@ -4741,6 +5121,7 @@
               </w:rPr>
               <w:t>AddFigureForm</w:t>
             </w:r>
+            <w:proofErr w:type="spellEnd"/>
           </w:p>
         </w:tc>
         <w:tc>
@@ -4764,6 +5145,7 @@
                 <w14:ligatures w14:val="none"/>
               </w:rPr>
             </w:pPr>
+            <w:proofErr w:type="spellStart"/>
             <w:r>
               <w:rPr>
                 <w:rFonts w:ascii="Calibri" w:hAnsi="Calibri" w:cs="Calibri"/>
@@ -4773,6 +5155,7 @@
               </w:rPr>
               <w:t>Pyramid</w:t>
             </w:r>
+            <w:proofErr w:type="spellEnd"/>
           </w:p>
         </w:tc>
         <w:tc>
@@ -4803,7 +5186,27 @@
                 <w:sz w:val="22"/>
                 <w:szCs w:val="22"/>
               </w:rPr>
-              <w:t>Форма добавления создаёт объект класса Pyramid при выборе соответствующего типа фигуры.</w:t>
+              <w:t xml:space="preserve">Форма добавления создаёт объект класса </w:t>
+            </w:r>
+            <w:proofErr w:type="spellStart"/>
+            <w:r>
+              <w:rPr>
+                <w:rFonts w:ascii="Calibri" w:hAnsi="Calibri" w:cs="Calibri"/>
+                <w:color w:val="000000"/>
+                <w:sz w:val="22"/>
+                <w:szCs w:val="22"/>
+              </w:rPr>
+              <w:t>Pyramid</w:t>
+            </w:r>
+            <w:proofErr w:type="spellEnd"/>
+            <w:r>
+              <w:rPr>
+                <w:rFonts w:ascii="Calibri" w:hAnsi="Calibri" w:cs="Calibri"/>
+                <w:color w:val="000000"/>
+                <w:sz w:val="22"/>
+                <w:szCs w:val="22"/>
+              </w:rPr>
+              <w:t xml:space="preserve"> при выборе соответствующего типа фигуры.</w:t>
             </w:r>
           </w:p>
         </w:tc>
@@ -4833,6 +5236,7 @@
                 <w14:ligatures w14:val="none"/>
               </w:rPr>
             </w:pPr>
+            <w:proofErr w:type="spellStart"/>
             <w:r>
               <w:rPr>
                 <w:rFonts w:ascii="Calibri" w:hAnsi="Calibri" w:cs="Calibri"/>
@@ -4842,6 +5246,7 @@
               </w:rPr>
               <w:t>AddFigureForm</w:t>
             </w:r>
+            <w:proofErr w:type="spellEnd"/>
           </w:p>
         </w:tc>
         <w:tc>
@@ -4865,6 +5270,7 @@
                 <w14:ligatures w14:val="none"/>
               </w:rPr>
             </w:pPr>
+            <w:proofErr w:type="spellStart"/>
             <w:r>
               <w:rPr>
                 <w:rFonts w:ascii="Calibri" w:hAnsi="Calibri" w:cs="Calibri"/>
@@ -4874,6 +5280,7 @@
               </w:rPr>
               <w:t>Parallelepiped</w:t>
             </w:r>
+            <w:proofErr w:type="spellEnd"/>
           </w:p>
         </w:tc>
         <w:tc>
@@ -4904,7 +5311,27 @@
                 <w:sz w:val="22"/>
                 <w:szCs w:val="22"/>
               </w:rPr>
-              <w:t>Форма добавления создаёт объект класса Parallelepiped при выборе соответствующего типа фигуры.</w:t>
+              <w:t xml:space="preserve">Форма добавления создаёт объект класса </w:t>
+            </w:r>
+            <w:proofErr w:type="spellStart"/>
+            <w:r>
+              <w:rPr>
+                <w:rFonts w:ascii="Calibri" w:hAnsi="Calibri" w:cs="Calibri"/>
+                <w:color w:val="000000"/>
+                <w:sz w:val="22"/>
+                <w:szCs w:val="22"/>
+              </w:rPr>
+              <w:t>Parallelepiped</w:t>
+            </w:r>
+            <w:proofErr w:type="spellEnd"/>
+            <w:r>
+              <w:rPr>
+                <w:rFonts w:ascii="Calibri" w:hAnsi="Calibri" w:cs="Calibri"/>
+                <w:color w:val="000000"/>
+                <w:sz w:val="22"/>
+                <w:szCs w:val="22"/>
+              </w:rPr>
+              <w:t xml:space="preserve"> при выборе соответствующего типа фигуры.</w:t>
             </w:r>
           </w:p>
         </w:tc>
@@ -4934,6 +5361,7 @@
                 <w14:ligatures w14:val="none"/>
               </w:rPr>
             </w:pPr>
+            <w:proofErr w:type="spellStart"/>
             <w:r>
               <w:rPr>
                 <w:rFonts w:ascii="Calibri" w:hAnsi="Calibri" w:cs="Calibri"/>
@@ -4943,6 +5371,7 @@
               </w:rPr>
               <w:t>AddFigureForm</w:t>
             </w:r>
+            <w:proofErr w:type="spellEnd"/>
           </w:p>
         </w:tc>
         <w:tc>
@@ -4966,6 +5395,7 @@
                 <w14:ligatures w14:val="none"/>
               </w:rPr>
             </w:pPr>
+            <w:proofErr w:type="spellStart"/>
             <w:r>
               <w:rPr>
                 <w:rFonts w:ascii="Calibri" w:hAnsi="Calibri" w:cs="Calibri"/>
@@ -4975,6 +5405,7 @@
               </w:rPr>
               <w:t>Validator</w:t>
             </w:r>
+            <w:proofErr w:type="spellEnd"/>
           </w:p>
         </w:tc>
         <w:tc>
@@ -5005,7 +5436,27 @@
                 <w:sz w:val="22"/>
                 <w:szCs w:val="22"/>
               </w:rPr>
-              <w:t>Форма добавления использует класс Validator для проверки корректности введённых пользователем числовых параметров.</w:t>
+              <w:t xml:space="preserve">Форма добавления использует класс </w:t>
+            </w:r>
+            <w:proofErr w:type="spellStart"/>
+            <w:r>
+              <w:rPr>
+                <w:rFonts w:ascii="Calibri" w:hAnsi="Calibri" w:cs="Calibri"/>
+                <w:color w:val="000000"/>
+                <w:sz w:val="22"/>
+                <w:szCs w:val="22"/>
+              </w:rPr>
+              <w:t>Validator</w:t>
+            </w:r>
+            <w:proofErr w:type="spellEnd"/>
+            <w:r>
+              <w:rPr>
+                <w:rFonts w:ascii="Calibri" w:hAnsi="Calibri" w:cs="Calibri"/>
+                <w:color w:val="000000"/>
+                <w:sz w:val="22"/>
+                <w:szCs w:val="22"/>
+              </w:rPr>
+              <w:t xml:space="preserve"> для проверки корректности введённых пользователем числовых параметров.</w:t>
             </w:r>
           </w:p>
         </w:tc>
@@ -5035,6 +5486,7 @@
                 <w14:ligatures w14:val="none"/>
               </w:rPr>
             </w:pPr>
+            <w:proofErr w:type="spellStart"/>
             <w:r>
               <w:rPr>
                 <w:rFonts w:ascii="Calibri" w:hAnsi="Calibri" w:cs="Calibri"/>
@@ -5045,6 +5497,7 @@
               <w:lastRenderedPageBreak/>
               <w:t>AddFigureForm</w:t>
             </w:r>
+            <w:proofErr w:type="spellEnd"/>
           </w:p>
         </w:tc>
         <w:tc>
@@ -5068,6 +5521,7 @@
                 <w14:ligatures w14:val="none"/>
               </w:rPr>
             </w:pPr>
+            <w:proofErr w:type="spellStart"/>
             <w:r>
               <w:rPr>
                 <w:rFonts w:ascii="Calibri" w:hAnsi="Calibri" w:cs="Calibri"/>
@@ -5077,6 +5531,7 @@
               </w:rPr>
               <w:t>FigureType</w:t>
             </w:r>
+            <w:proofErr w:type="spellEnd"/>
           </w:p>
         </w:tc>
         <w:tc>
@@ -5107,7 +5562,27 @@
                 <w:sz w:val="22"/>
                 <w:szCs w:val="22"/>
               </w:rPr>
-              <w:t>Форма добавления использует перечисление FigureType для выбора типа создаваемой фигуры.</w:t>
+              <w:t xml:space="preserve">Форма добавления использует перечисление </w:t>
+            </w:r>
+            <w:proofErr w:type="spellStart"/>
+            <w:r>
+              <w:rPr>
+                <w:rFonts w:ascii="Calibri" w:hAnsi="Calibri" w:cs="Calibri"/>
+                <w:color w:val="000000"/>
+                <w:sz w:val="22"/>
+                <w:szCs w:val="22"/>
+              </w:rPr>
+              <w:t>FigureType</w:t>
+            </w:r>
+            <w:proofErr w:type="spellEnd"/>
+            <w:r>
+              <w:rPr>
+                <w:rFonts w:ascii="Calibri" w:hAnsi="Calibri" w:cs="Calibri"/>
+                <w:color w:val="000000"/>
+                <w:sz w:val="22"/>
+                <w:szCs w:val="22"/>
+              </w:rPr>
+              <w:t xml:space="preserve"> для выбора типа создаваемой фигуры.</w:t>
             </w:r>
           </w:p>
         </w:tc>
@@ -5137,6 +5612,7 @@
                 <w14:ligatures w14:val="none"/>
               </w:rPr>
             </w:pPr>
+            <w:proofErr w:type="spellStart"/>
             <w:r>
               <w:rPr>
                 <w:rFonts w:ascii="Calibri" w:hAnsi="Calibri" w:cs="Calibri"/>
@@ -5146,6 +5622,7 @@
               </w:rPr>
               <w:t>AddFigureForm</w:t>
             </w:r>
+            <w:proofErr w:type="spellEnd"/>
           </w:p>
         </w:tc>
         <w:tc>
@@ -5169,6 +5646,7 @@
                 <w14:ligatures w14:val="none"/>
               </w:rPr>
             </w:pPr>
+            <w:proofErr w:type="spellStart"/>
             <w:r>
               <w:rPr>
                 <w:rFonts w:ascii="Calibri" w:hAnsi="Calibri" w:cs="Calibri"/>
@@ -5178,6 +5656,7 @@
               </w:rPr>
               <w:t>FigureTypeExtensions</w:t>
             </w:r>
+            <w:proofErr w:type="spellEnd"/>
           </w:p>
         </w:tc>
         <w:tc>
@@ -5208,7 +5687,38 @@
                 <w:sz w:val="22"/>
                 <w:szCs w:val="22"/>
               </w:rPr>
-              <w:t>Форма добавления использует метод расширения ToDisplay() для отображения названия типа фигуры пользователю.</w:t>
+              <w:t xml:space="preserve">Форма добавления использует метод расширения </w:t>
+            </w:r>
+            <w:proofErr w:type="spellStart"/>
+            <w:proofErr w:type="gramStart"/>
+            <w:r>
+              <w:rPr>
+                <w:rFonts w:ascii="Calibri" w:hAnsi="Calibri" w:cs="Calibri"/>
+                <w:color w:val="000000"/>
+                <w:sz w:val="22"/>
+                <w:szCs w:val="22"/>
+              </w:rPr>
+              <w:t>ToDisplay</w:t>
+            </w:r>
+            <w:proofErr w:type="spellEnd"/>
+            <w:r>
+              <w:rPr>
+                <w:rFonts w:ascii="Calibri" w:hAnsi="Calibri" w:cs="Calibri"/>
+                <w:color w:val="000000"/>
+                <w:sz w:val="22"/>
+                <w:szCs w:val="22"/>
+              </w:rPr>
+              <w:t>(</w:t>
+            </w:r>
+            <w:proofErr w:type="gramEnd"/>
+            <w:r>
+              <w:rPr>
+                <w:rFonts w:ascii="Calibri" w:hAnsi="Calibri" w:cs="Calibri"/>
+                <w:color w:val="000000"/>
+                <w:sz w:val="22"/>
+                <w:szCs w:val="22"/>
+              </w:rPr>
+              <w:t>) для отображения названия типа фигуры пользователю.</w:t>
             </w:r>
           </w:p>
         </w:tc>
@@ -5238,6 +5748,7 @@
                 <w14:ligatures w14:val="none"/>
               </w:rPr>
             </w:pPr>
+            <w:proofErr w:type="spellStart"/>
             <w:r>
               <w:rPr>
                 <w:rFonts w:ascii="Calibri" w:hAnsi="Calibri" w:cs="Calibri"/>
@@ -5247,6 +5758,7 @@
               </w:rPr>
               <w:t>AddFigureForm</w:t>
             </w:r>
+            <w:proofErr w:type="spellEnd"/>
           </w:p>
         </w:tc>
         <w:tc>
@@ -5270,6 +5782,7 @@
                 <w14:ligatures w14:val="none"/>
               </w:rPr>
             </w:pPr>
+            <w:proofErr w:type="spellStart"/>
             <w:r>
               <w:rPr>
                 <w:rFonts w:ascii="Calibri" w:hAnsi="Calibri" w:cs="Calibri"/>
@@ -5279,6 +5792,7 @@
               </w:rPr>
               <w:t>FormatPrecision</w:t>
             </w:r>
+            <w:proofErr w:type="spellEnd"/>
           </w:p>
         </w:tc>
         <w:tc>
@@ -5337,6 +5851,7 @@
                 <w:szCs w:val="22"/>
               </w:rPr>
             </w:pPr>
+            <w:proofErr w:type="spellStart"/>
             <w:r>
               <w:rPr>
                 <w:rFonts w:ascii="Calibri" w:hAnsi="Calibri" w:cs="Calibri"/>
@@ -5346,6 +5861,7 @@
               </w:rPr>
               <w:t>FindFigureForm</w:t>
             </w:r>
+            <w:proofErr w:type="spellEnd"/>
           </w:p>
         </w:tc>
         <w:tc>
@@ -5367,6 +5883,7 @@
                 <w:szCs w:val="22"/>
               </w:rPr>
             </w:pPr>
+            <w:proofErr w:type="spellStart"/>
             <w:r>
               <w:rPr>
                 <w:rFonts w:ascii="Calibri" w:hAnsi="Calibri" w:cs="Calibri"/>
@@ -5376,6 +5893,7 @@
               </w:rPr>
               <w:t>Validator</w:t>
             </w:r>
+            <w:proofErr w:type="spellEnd"/>
           </w:p>
         </w:tc>
         <w:tc>
@@ -5404,7 +5922,27 @@
                 <w:sz w:val="22"/>
                 <w:szCs w:val="22"/>
               </w:rPr>
-              <w:t>Форма поиска использует класс Validator для проверки минимального и максимального объёма.</w:t>
+              <w:t xml:space="preserve">Форма поиска использует класс </w:t>
+            </w:r>
+            <w:proofErr w:type="spellStart"/>
+            <w:r>
+              <w:rPr>
+                <w:rFonts w:ascii="Calibri" w:hAnsi="Calibri" w:cs="Calibri"/>
+                <w:color w:val="000000"/>
+                <w:sz w:val="22"/>
+                <w:szCs w:val="22"/>
+              </w:rPr>
+              <w:t>Validator</w:t>
+            </w:r>
+            <w:proofErr w:type="spellEnd"/>
+            <w:r>
+              <w:rPr>
+                <w:rFonts w:ascii="Calibri" w:hAnsi="Calibri" w:cs="Calibri"/>
+                <w:color w:val="000000"/>
+                <w:sz w:val="22"/>
+                <w:szCs w:val="22"/>
+              </w:rPr>
+              <w:t xml:space="preserve"> для проверки минимального и максимального объёма.</w:t>
             </w:r>
           </w:p>
         </w:tc>
@@ -5432,6 +5970,7 @@
                 <w:szCs w:val="22"/>
               </w:rPr>
             </w:pPr>
+            <w:proofErr w:type="spellStart"/>
             <w:r>
               <w:rPr>
                 <w:rFonts w:ascii="Calibri" w:hAnsi="Calibri" w:cs="Calibri"/>
@@ -5441,6 +5980,7 @@
               </w:rPr>
               <w:t>FindFigureForm</w:t>
             </w:r>
+            <w:proofErr w:type="spellEnd"/>
           </w:p>
         </w:tc>
         <w:tc>
@@ -5462,6 +6002,7 @@
                 <w:szCs w:val="22"/>
               </w:rPr>
             </w:pPr>
+            <w:proofErr w:type="spellStart"/>
             <w:r>
               <w:rPr>
                 <w:rFonts w:ascii="Calibri" w:hAnsi="Calibri" w:cs="Calibri"/>
@@ -5471,6 +6012,7 @@
               </w:rPr>
               <w:t>FigureType</w:t>
             </w:r>
+            <w:proofErr w:type="spellEnd"/>
           </w:p>
         </w:tc>
         <w:tc>
@@ -5499,7 +6041,27 @@
                 <w:sz w:val="22"/>
                 <w:szCs w:val="22"/>
               </w:rPr>
-              <w:t>Форма поиска использует перечисление FigureType для фильтрации фигур по выбранному типу.</w:t>
+              <w:t xml:space="preserve">Форма поиска использует перечисление </w:t>
+            </w:r>
+            <w:proofErr w:type="spellStart"/>
+            <w:r>
+              <w:rPr>
+                <w:rFonts w:ascii="Calibri" w:hAnsi="Calibri" w:cs="Calibri"/>
+                <w:color w:val="000000"/>
+                <w:sz w:val="22"/>
+                <w:szCs w:val="22"/>
+              </w:rPr>
+              <w:t>FigureType</w:t>
+            </w:r>
+            <w:proofErr w:type="spellEnd"/>
+            <w:r>
+              <w:rPr>
+                <w:rFonts w:ascii="Calibri" w:hAnsi="Calibri" w:cs="Calibri"/>
+                <w:color w:val="000000"/>
+                <w:sz w:val="22"/>
+                <w:szCs w:val="22"/>
+              </w:rPr>
+              <w:t xml:space="preserve"> для фильтрации фигур по выбранному типу.</w:t>
             </w:r>
           </w:p>
         </w:tc>
@@ -5527,6 +6089,7 @@
                 <w:szCs w:val="22"/>
               </w:rPr>
             </w:pPr>
+            <w:proofErr w:type="spellStart"/>
             <w:r>
               <w:rPr>
                 <w:rFonts w:ascii="Calibri" w:hAnsi="Calibri" w:cs="Calibri"/>
@@ -5536,6 +6099,7 @@
               </w:rPr>
               <w:t>FindFigureForm</w:t>
             </w:r>
+            <w:proofErr w:type="spellEnd"/>
           </w:p>
         </w:tc>
         <w:tc>
@@ -5557,6 +6121,7 @@
                 <w:szCs w:val="22"/>
               </w:rPr>
             </w:pPr>
+            <w:proofErr w:type="spellStart"/>
             <w:r>
               <w:rPr>
                 <w:rFonts w:ascii="Calibri" w:hAnsi="Calibri" w:cs="Calibri"/>
@@ -5566,6 +6131,7 @@
               </w:rPr>
               <w:t>FigureTypeExtensions</w:t>
             </w:r>
+            <w:proofErr w:type="spellEnd"/>
           </w:p>
         </w:tc>
         <w:tc>
@@ -5594,7 +6160,38 @@
                 <w:sz w:val="22"/>
                 <w:szCs w:val="22"/>
               </w:rPr>
-              <w:t>Форма поиска использует метод ToDisplay() для отображения названий типов фигур в выпадающем списке.</w:t>
+              <w:t xml:space="preserve">Форма поиска использует метод </w:t>
+            </w:r>
+            <w:proofErr w:type="spellStart"/>
+            <w:proofErr w:type="gramStart"/>
+            <w:r>
+              <w:rPr>
+                <w:rFonts w:ascii="Calibri" w:hAnsi="Calibri" w:cs="Calibri"/>
+                <w:color w:val="000000"/>
+                <w:sz w:val="22"/>
+                <w:szCs w:val="22"/>
+              </w:rPr>
+              <w:t>ToDisplay</w:t>
+            </w:r>
+            <w:proofErr w:type="spellEnd"/>
+            <w:r>
+              <w:rPr>
+                <w:rFonts w:ascii="Calibri" w:hAnsi="Calibri" w:cs="Calibri"/>
+                <w:color w:val="000000"/>
+                <w:sz w:val="22"/>
+                <w:szCs w:val="22"/>
+              </w:rPr>
+              <w:t>(</w:t>
+            </w:r>
+            <w:proofErr w:type="gramEnd"/>
+            <w:r>
+              <w:rPr>
+                <w:rFonts w:ascii="Calibri" w:hAnsi="Calibri" w:cs="Calibri"/>
+                <w:color w:val="000000"/>
+                <w:sz w:val="22"/>
+                <w:szCs w:val="22"/>
+              </w:rPr>
+              <w:t>) для отображения названий типов фигур в выпадающем списке.</w:t>
             </w:r>
           </w:p>
         </w:tc>
@@ -5622,6 +6219,7 @@
                 <w:szCs w:val="22"/>
               </w:rPr>
             </w:pPr>
+            <w:proofErr w:type="spellStart"/>
             <w:r>
               <w:rPr>
                 <w:rFonts w:ascii="Calibri" w:hAnsi="Calibri" w:cs="Calibri"/>
@@ -5631,6 +6229,7 @@
               </w:rPr>
               <w:t>FindFigureForm</w:t>
             </w:r>
+            <w:proofErr w:type="spellEnd"/>
           </w:p>
         </w:tc>
         <w:tc>
@@ -5652,14 +6251,25 @@
                 <w:szCs w:val="22"/>
               </w:rPr>
             </w:pPr>
-            <w:r>
-              <w:rPr>
-                <w:rFonts w:ascii="Calibri" w:hAnsi="Calibri" w:cs="Calibri"/>
-                <w:color w:val="000000"/>
-                <w:sz w:val="22"/>
-                <w:szCs w:val="22"/>
-              </w:rPr>
-              <w:t>ComboItem&lt;T&gt;</w:t>
+            <w:proofErr w:type="spellStart"/>
+            <w:r>
+              <w:rPr>
+                <w:rFonts w:ascii="Calibri" w:hAnsi="Calibri" w:cs="Calibri"/>
+                <w:color w:val="000000"/>
+                <w:sz w:val="22"/>
+                <w:szCs w:val="22"/>
+              </w:rPr>
+              <w:t>ComboItem</w:t>
+            </w:r>
+            <w:proofErr w:type="spellEnd"/>
+            <w:r>
+              <w:rPr>
+                <w:rFonts w:ascii="Calibri" w:hAnsi="Calibri" w:cs="Calibri"/>
+                <w:color w:val="000000"/>
+                <w:sz w:val="22"/>
+                <w:szCs w:val="22"/>
+              </w:rPr>
+              <w:t>&lt;T&gt;</w:t>
             </w:r>
           </w:p>
         </w:tc>
@@ -5689,7 +6299,27 @@
                 <w:sz w:val="22"/>
                 <w:szCs w:val="22"/>
               </w:rPr>
-              <w:t>Форма поиска использует обобщённый класс ComboItem&lt;T&gt; для хранения значения и отображаемого имени элемента выпадающего списка.</w:t>
+              <w:t xml:space="preserve">Форма поиска использует обобщённый класс </w:t>
+            </w:r>
+            <w:proofErr w:type="spellStart"/>
+            <w:r>
+              <w:rPr>
+                <w:rFonts w:ascii="Calibri" w:hAnsi="Calibri" w:cs="Calibri"/>
+                <w:color w:val="000000"/>
+                <w:sz w:val="22"/>
+                <w:szCs w:val="22"/>
+              </w:rPr>
+              <w:t>ComboItem</w:t>
+            </w:r>
+            <w:proofErr w:type="spellEnd"/>
+            <w:r>
+              <w:rPr>
+                <w:rFonts w:ascii="Calibri" w:hAnsi="Calibri" w:cs="Calibri"/>
+                <w:color w:val="000000"/>
+                <w:sz w:val="22"/>
+                <w:szCs w:val="22"/>
+              </w:rPr>
+              <w:t>&lt;T&gt; для хранения значения и отображаемого имени элемента выпадающего списка.</w:t>
             </w:r>
           </w:p>
         </w:tc>
@@ -5717,6 +6347,7 @@
                 <w:szCs w:val="22"/>
               </w:rPr>
             </w:pPr>
+            <w:proofErr w:type="spellStart"/>
             <w:r>
               <w:rPr>
                 <w:rFonts w:ascii="Calibri" w:hAnsi="Calibri" w:cs="Calibri"/>
@@ -5726,6 +6357,7 @@
               </w:rPr>
               <w:t>FindFigureForm</w:t>
             </w:r>
+            <w:proofErr w:type="spellEnd"/>
           </w:p>
         </w:tc>
         <w:tc>
@@ -5747,6 +6379,7 @@
                 <w:szCs w:val="22"/>
               </w:rPr>
             </w:pPr>
+            <w:proofErr w:type="spellStart"/>
             <w:r>
               <w:rPr>
                 <w:rFonts w:ascii="Calibri" w:hAnsi="Calibri" w:cs="Calibri"/>
@@ -5756,6 +6389,7 @@
               </w:rPr>
               <w:t>FormatPrecision</w:t>
             </w:r>
+            <w:proofErr w:type="spellEnd"/>
           </w:p>
         </w:tc>
         <w:tc>
@@ -5812,6 +6446,7 @@
                 <w:szCs w:val="22"/>
               </w:rPr>
             </w:pPr>
+            <w:proofErr w:type="spellStart"/>
             <w:r>
               <w:rPr>
                 <w:rFonts w:ascii="Calibri" w:hAnsi="Calibri" w:cs="Calibri"/>
@@ -5821,6 +6456,7 @@
               </w:rPr>
               <w:t>FigureStorage</w:t>
             </w:r>
+            <w:proofErr w:type="spellEnd"/>
           </w:p>
         </w:tc>
         <w:tc>
@@ -5842,6 +6478,7 @@
                 <w:szCs w:val="22"/>
               </w:rPr>
             </w:pPr>
+            <w:proofErr w:type="spellStart"/>
             <w:r>
               <w:rPr>
                 <w:rFonts w:ascii="Calibri" w:hAnsi="Calibri" w:cs="Calibri"/>
@@ -5851,6 +6488,7 @@
               </w:rPr>
               <w:t>VolumeFigureBase</w:t>
             </w:r>
+            <w:proofErr w:type="spellEnd"/>
           </w:p>
         </w:tc>
         <w:tc>
@@ -5879,7 +6517,67 @@
                 <w:sz w:val="22"/>
                 <w:szCs w:val="22"/>
               </w:rPr>
-              <w:t>Класс FigureStorage принимает коллекцию объектов VolumeFigureBase при сохранении и возвращает список объектов VolumeFigureBase при загрузке.</w:t>
+              <w:t xml:space="preserve">Класс </w:t>
+            </w:r>
+            <w:proofErr w:type="spellStart"/>
+            <w:r>
+              <w:rPr>
+                <w:rFonts w:ascii="Calibri" w:hAnsi="Calibri" w:cs="Calibri"/>
+                <w:color w:val="000000"/>
+                <w:sz w:val="22"/>
+                <w:szCs w:val="22"/>
+              </w:rPr>
+              <w:t>FigureStorage</w:t>
+            </w:r>
+            <w:proofErr w:type="spellEnd"/>
+            <w:r>
+              <w:rPr>
+                <w:rFonts w:ascii="Calibri" w:hAnsi="Calibri" w:cs="Calibri"/>
+                <w:color w:val="000000"/>
+                <w:sz w:val="22"/>
+                <w:szCs w:val="22"/>
+              </w:rPr>
+              <w:t xml:space="preserve"> принимает коллекцию объектов </w:t>
+            </w:r>
+            <w:proofErr w:type="spellStart"/>
+            <w:r>
+              <w:rPr>
+                <w:rFonts w:ascii="Calibri" w:hAnsi="Calibri" w:cs="Calibri"/>
+                <w:color w:val="000000"/>
+                <w:sz w:val="22"/>
+                <w:szCs w:val="22"/>
+              </w:rPr>
+              <w:t>VolumeFigureBase</w:t>
+            </w:r>
+            <w:proofErr w:type="spellEnd"/>
+            <w:r>
+              <w:rPr>
+                <w:rFonts w:ascii="Calibri" w:hAnsi="Calibri" w:cs="Calibri"/>
+                <w:color w:val="000000"/>
+                <w:sz w:val="22"/>
+                <w:szCs w:val="22"/>
+              </w:rPr>
+              <w:t xml:space="preserve"> при сохранении и возвращает список объектов </w:t>
+            </w:r>
+            <w:proofErr w:type="spellStart"/>
+            <w:r>
+              <w:rPr>
+                <w:rFonts w:ascii="Calibri" w:hAnsi="Calibri" w:cs="Calibri"/>
+                <w:color w:val="000000"/>
+                <w:sz w:val="22"/>
+                <w:szCs w:val="22"/>
+              </w:rPr>
+              <w:t>VolumeFigureBase</w:t>
+            </w:r>
+            <w:proofErr w:type="spellEnd"/>
+            <w:r>
+              <w:rPr>
+                <w:rFonts w:ascii="Calibri" w:hAnsi="Calibri" w:cs="Calibri"/>
+                <w:color w:val="000000"/>
+                <w:sz w:val="22"/>
+                <w:szCs w:val="22"/>
+              </w:rPr>
+              <w:t xml:space="preserve"> при загрузке.</w:t>
             </w:r>
           </w:p>
         </w:tc>
@@ -5907,6 +6605,7 @@
                 <w:szCs w:val="22"/>
               </w:rPr>
             </w:pPr>
+            <w:proofErr w:type="spellStart"/>
             <w:r>
               <w:rPr>
                 <w:rFonts w:ascii="Calibri" w:hAnsi="Calibri" w:cs="Calibri"/>
@@ -5916,6 +6615,7 @@
               </w:rPr>
               <w:t>FigureStorage</w:t>
             </w:r>
+            <w:proofErr w:type="spellEnd"/>
           </w:p>
         </w:tc>
         <w:tc>
@@ -5937,15 +6637,57 @@
                 <w:szCs w:val="22"/>
               </w:rPr>
             </w:pPr>
-            <w:r>
-              <w:rPr>
-                <w:rFonts w:ascii="Calibri" w:hAnsi="Calibri" w:cs="Calibri"/>
-                <w:color w:val="000000"/>
-                <w:sz w:val="22"/>
-                <w:szCs w:val="22"/>
-              </w:rPr>
-              <w:t>Sphere, Pyramid, Parallelepiped</w:t>
-            </w:r>
+            <w:proofErr w:type="spellStart"/>
+            <w:r>
+              <w:rPr>
+                <w:rFonts w:ascii="Calibri" w:hAnsi="Calibri" w:cs="Calibri"/>
+                <w:color w:val="000000"/>
+                <w:sz w:val="22"/>
+                <w:szCs w:val="22"/>
+              </w:rPr>
+              <w:t>Sphere</w:t>
+            </w:r>
+            <w:proofErr w:type="spellEnd"/>
+            <w:r>
+              <w:rPr>
+                <w:rFonts w:ascii="Calibri" w:hAnsi="Calibri" w:cs="Calibri"/>
+                <w:color w:val="000000"/>
+                <w:sz w:val="22"/>
+                <w:szCs w:val="22"/>
+              </w:rPr>
+              <w:t xml:space="preserve">, </w:t>
+            </w:r>
+            <w:proofErr w:type="spellStart"/>
+            <w:r>
+              <w:rPr>
+                <w:rFonts w:ascii="Calibri" w:hAnsi="Calibri" w:cs="Calibri"/>
+                <w:color w:val="000000"/>
+                <w:sz w:val="22"/>
+                <w:szCs w:val="22"/>
+              </w:rPr>
+              <w:t>Pyramid</w:t>
+            </w:r>
+            <w:proofErr w:type="spellEnd"/>
+            <w:r>
+              <w:rPr>
+                <w:rFonts w:ascii="Calibri" w:hAnsi="Calibri" w:cs="Calibri"/>
+                <w:color w:val="000000"/>
+                <w:sz w:val="22"/>
+                <w:szCs w:val="22"/>
+              </w:rPr>
+              <w:t xml:space="preserve">, </w:t>
+            </w:r>
+            <w:proofErr w:type="spellStart"/>
+            <w:r>
+              <w:rPr>
+                <w:rFonts w:ascii="Calibri" w:hAnsi="Calibri" w:cs="Calibri"/>
+                <w:color w:val="000000"/>
+                <w:sz w:val="22"/>
+                <w:szCs w:val="22"/>
+              </w:rPr>
+              <w:t>Parallelepiped</w:t>
+            </w:r>
+            <w:proofErr w:type="spellEnd"/>
           </w:p>
         </w:tc>
         <w:tc>
@@ -5974,7 +6716,47 @@
                 <w:sz w:val="22"/>
                 <w:szCs w:val="22"/>
               </w:rPr>
-              <w:t>Класс FigureStorage преобразует конкретные объекты фигур в сериализуемые данные и восстанавливает их обратно при загрузке из файла.</w:t>
+              <w:t xml:space="preserve">Класс </w:t>
+            </w:r>
+            <w:proofErr w:type="spellStart"/>
+            <w:r>
+              <w:rPr>
+                <w:rFonts w:ascii="Calibri" w:hAnsi="Calibri" w:cs="Calibri"/>
+                <w:color w:val="000000"/>
+                <w:sz w:val="22"/>
+                <w:szCs w:val="22"/>
+              </w:rPr>
+              <w:t>FigureStorage</w:t>
+            </w:r>
+            <w:proofErr w:type="spellEnd"/>
+            <w:r>
+              <w:rPr>
+                <w:rFonts w:ascii="Calibri" w:hAnsi="Calibri" w:cs="Calibri"/>
+                <w:color w:val="000000"/>
+                <w:sz w:val="22"/>
+                <w:szCs w:val="22"/>
+              </w:rPr>
+              <w:t xml:space="preserve"> преобразует конкретные объекты фигур в </w:t>
+            </w:r>
+            <w:proofErr w:type="spellStart"/>
+            <w:r>
+              <w:rPr>
+                <w:rFonts w:ascii="Calibri" w:hAnsi="Calibri" w:cs="Calibri"/>
+                <w:color w:val="000000"/>
+                <w:sz w:val="22"/>
+                <w:szCs w:val="22"/>
+              </w:rPr>
+              <w:t>сериализуемые</w:t>
+            </w:r>
+            <w:proofErr w:type="spellEnd"/>
+            <w:r>
+              <w:rPr>
+                <w:rFonts w:ascii="Calibri" w:hAnsi="Calibri" w:cs="Calibri"/>
+                <w:color w:val="000000"/>
+                <w:sz w:val="22"/>
+                <w:szCs w:val="22"/>
+              </w:rPr>
+              <w:t xml:space="preserve"> данные и восстанавливает их обратно при загрузке из файла.</w:t>
             </w:r>
           </w:p>
         </w:tc>
@@ -6002,6 +6784,7 @@
                 <w:szCs w:val="22"/>
               </w:rPr>
             </w:pPr>
+            <w:proofErr w:type="spellStart"/>
             <w:r>
               <w:rPr>
                 <w:rFonts w:ascii="Calibri" w:hAnsi="Calibri" w:cs="Calibri"/>
@@ -6011,6 +6794,7 @@
               </w:rPr>
               <w:t>FigureStorage</w:t>
             </w:r>
+            <w:proofErr w:type="spellEnd"/>
           </w:p>
         </w:tc>
         <w:tc>
@@ -6032,6 +6816,7 @@
                 <w:szCs w:val="22"/>
               </w:rPr>
             </w:pPr>
+            <w:proofErr w:type="spellStart"/>
             <w:r>
               <w:rPr>
                 <w:rFonts w:ascii="Calibri" w:hAnsi="Calibri" w:cs="Calibri"/>
@@ -6041,6 +6826,7 @@
               </w:rPr>
               <w:t>FigureData</w:t>
             </w:r>
+            <w:proofErr w:type="spellEnd"/>
           </w:p>
         </w:tc>
         <w:tc>
@@ -6069,7 +6855,47 @@
                 <w:sz w:val="22"/>
                 <w:szCs w:val="22"/>
               </w:rPr>
-              <w:t>Класс FigureStorage использует FigureData как промежуточную структуру для хранения параметров одной фигуры.</w:t>
+              <w:t xml:space="preserve">Класс </w:t>
+            </w:r>
+            <w:proofErr w:type="spellStart"/>
+            <w:r>
+              <w:rPr>
+                <w:rFonts w:ascii="Calibri" w:hAnsi="Calibri" w:cs="Calibri"/>
+                <w:color w:val="000000"/>
+                <w:sz w:val="22"/>
+                <w:szCs w:val="22"/>
+              </w:rPr>
+              <w:t>FigureStorage</w:t>
+            </w:r>
+            <w:proofErr w:type="spellEnd"/>
+            <w:r>
+              <w:rPr>
+                <w:rFonts w:ascii="Calibri" w:hAnsi="Calibri" w:cs="Calibri"/>
+                <w:color w:val="000000"/>
+                <w:sz w:val="22"/>
+                <w:szCs w:val="22"/>
+              </w:rPr>
+              <w:t xml:space="preserve"> использует </w:t>
+            </w:r>
+            <w:proofErr w:type="spellStart"/>
+            <w:r>
+              <w:rPr>
+                <w:rFonts w:ascii="Calibri" w:hAnsi="Calibri" w:cs="Calibri"/>
+                <w:color w:val="000000"/>
+                <w:sz w:val="22"/>
+                <w:szCs w:val="22"/>
+              </w:rPr>
+              <w:t>FigureData</w:t>
+            </w:r>
+            <w:proofErr w:type="spellEnd"/>
+            <w:r>
+              <w:rPr>
+                <w:rFonts w:ascii="Calibri" w:hAnsi="Calibri" w:cs="Calibri"/>
+                <w:color w:val="000000"/>
+                <w:sz w:val="22"/>
+                <w:szCs w:val="22"/>
+              </w:rPr>
+              <w:t xml:space="preserve"> как промежуточную структуру для хранения параметров одной фигуры.</w:t>
             </w:r>
           </w:p>
         </w:tc>
@@ -6097,6 +6923,7 @@
                 <w:szCs w:val="22"/>
               </w:rPr>
             </w:pPr>
+            <w:proofErr w:type="spellStart"/>
             <w:r>
               <w:rPr>
                 <w:rFonts w:ascii="Calibri" w:hAnsi="Calibri" w:cs="Calibri"/>
@@ -6106,6 +6933,7 @@
               </w:rPr>
               <w:t>FigureStorage</w:t>
             </w:r>
+            <w:proofErr w:type="spellEnd"/>
           </w:p>
         </w:tc>
         <w:tc>
@@ -6127,6 +6955,7 @@
                 <w:szCs w:val="22"/>
               </w:rPr>
             </w:pPr>
+            <w:proofErr w:type="spellStart"/>
             <w:r>
               <w:rPr>
                 <w:rFonts w:ascii="Calibri" w:hAnsi="Calibri" w:cs="Calibri"/>
@@ -6136,6 +6965,7 @@
               </w:rPr>
               <w:t>FiguresFileData</w:t>
             </w:r>
+            <w:proofErr w:type="spellEnd"/>
           </w:p>
         </w:tc>
         <w:tc>
@@ -6164,7 +6994,67 @@
                 <w:sz w:val="22"/>
                 <w:szCs w:val="22"/>
               </w:rPr>
-              <w:t>Класс FigureStorage использует FiguresFileData как корневой объект файла, содержащий список сериализуемых фигур.</w:t>
+              <w:t xml:space="preserve">Класс </w:t>
+            </w:r>
+            <w:proofErr w:type="spellStart"/>
+            <w:r>
+              <w:rPr>
+                <w:rFonts w:ascii="Calibri" w:hAnsi="Calibri" w:cs="Calibri"/>
+                <w:color w:val="000000"/>
+                <w:sz w:val="22"/>
+                <w:szCs w:val="22"/>
+              </w:rPr>
+              <w:t>FigureStorage</w:t>
+            </w:r>
+            <w:proofErr w:type="spellEnd"/>
+            <w:r>
+              <w:rPr>
+                <w:rFonts w:ascii="Calibri" w:hAnsi="Calibri" w:cs="Calibri"/>
+                <w:color w:val="000000"/>
+                <w:sz w:val="22"/>
+                <w:szCs w:val="22"/>
+              </w:rPr>
+              <w:t xml:space="preserve"> использует </w:t>
+            </w:r>
+            <w:proofErr w:type="spellStart"/>
+            <w:r>
+              <w:rPr>
+                <w:rFonts w:ascii="Calibri" w:hAnsi="Calibri" w:cs="Calibri"/>
+                <w:color w:val="000000"/>
+                <w:sz w:val="22"/>
+                <w:szCs w:val="22"/>
+              </w:rPr>
+              <w:t>FiguresFileData</w:t>
+            </w:r>
+            <w:proofErr w:type="spellEnd"/>
+            <w:r>
+              <w:rPr>
+                <w:rFonts w:ascii="Calibri" w:hAnsi="Calibri" w:cs="Calibri"/>
+                <w:color w:val="000000"/>
+                <w:sz w:val="22"/>
+                <w:szCs w:val="22"/>
+              </w:rPr>
+              <w:t xml:space="preserve"> как корневой объект файла, содержащий список </w:t>
+            </w:r>
+            <w:proofErr w:type="spellStart"/>
+            <w:r>
+              <w:rPr>
+                <w:rFonts w:ascii="Calibri" w:hAnsi="Calibri" w:cs="Calibri"/>
+                <w:color w:val="000000"/>
+                <w:sz w:val="22"/>
+                <w:szCs w:val="22"/>
+              </w:rPr>
+              <w:t>сериализуемых</w:t>
+            </w:r>
+            <w:proofErr w:type="spellEnd"/>
+            <w:r>
+              <w:rPr>
+                <w:rFonts w:ascii="Calibri" w:hAnsi="Calibri" w:cs="Calibri"/>
+                <w:color w:val="000000"/>
+                <w:sz w:val="22"/>
+                <w:szCs w:val="22"/>
+              </w:rPr>
+              <w:t xml:space="preserve"> фигур.</w:t>
             </w:r>
           </w:p>
         </w:tc>
@@ -6192,6 +7082,7 @@
                 <w:szCs w:val="22"/>
               </w:rPr>
             </w:pPr>
+            <w:proofErr w:type="spellStart"/>
             <w:r>
               <w:rPr>
                 <w:rFonts w:ascii="Calibri" w:hAnsi="Calibri" w:cs="Calibri"/>
@@ -6201,6 +7092,7 @@
               </w:rPr>
               <w:t>FigureData</w:t>
             </w:r>
+            <w:proofErr w:type="spellEnd"/>
           </w:p>
         </w:tc>
         <w:tc>
@@ -6222,6 +7114,7 @@
                 <w:szCs w:val="22"/>
               </w:rPr>
             </w:pPr>
+            <w:proofErr w:type="spellStart"/>
             <w:r>
               <w:rPr>
                 <w:rFonts w:ascii="Calibri" w:hAnsi="Calibri" w:cs="Calibri"/>
@@ -6231,6 +7124,7 @@
               </w:rPr>
               <w:t>FigureType</w:t>
             </w:r>
+            <w:proofErr w:type="spellEnd"/>
           </w:p>
         </w:tc>
         <w:tc>
@@ -6252,6 +7146,7 @@
                 <w:szCs w:val="22"/>
               </w:rPr>
             </w:pPr>
+            <w:proofErr w:type="spellStart"/>
             <w:r>
               <w:rPr>
                 <w:rFonts w:ascii="Calibri" w:hAnsi="Calibri" w:cs="Calibri"/>
@@ -6261,6 +7156,7 @@
               </w:rPr>
               <w:t>FigureData</w:t>
             </w:r>
+            <w:proofErr w:type="spellEnd"/>
           </w:p>
         </w:tc>
       </w:tr>
@@ -6287,6 +7183,7 @@
                 <w:szCs w:val="22"/>
               </w:rPr>
             </w:pPr>
+            <w:proofErr w:type="spellStart"/>
             <w:r>
               <w:rPr>
                 <w:rFonts w:ascii="Calibri" w:hAnsi="Calibri" w:cs="Calibri"/>
@@ -6296,6 +7193,7 @@
               </w:rPr>
               <w:t>FigureTypeExtensions</w:t>
             </w:r>
+            <w:proofErr w:type="spellEnd"/>
           </w:p>
         </w:tc>
         <w:tc>
@@ -6317,6 +7215,7 @@
                 <w:szCs w:val="22"/>
               </w:rPr>
             </w:pPr>
+            <w:proofErr w:type="spellStart"/>
             <w:r>
               <w:rPr>
                 <w:rFonts w:ascii="Calibri" w:hAnsi="Calibri" w:cs="Calibri"/>
@@ -6326,6 +7225,7 @@
               </w:rPr>
               <w:t>FigureType</w:t>
             </w:r>
+            <w:proofErr w:type="spellEnd"/>
           </w:p>
         </w:tc>
         <w:tc>
@@ -6347,6 +7247,7 @@
                 <w:szCs w:val="22"/>
               </w:rPr>
             </w:pPr>
+            <w:proofErr w:type="spellStart"/>
             <w:r>
               <w:rPr>
                 <w:rFonts w:ascii="Calibri" w:hAnsi="Calibri" w:cs="Calibri"/>
@@ -6356,6 +7257,7 @@
               </w:rPr>
               <w:t>FigureTypeExtensions</w:t>
             </w:r>
+            <w:proofErr w:type="spellEnd"/>
           </w:p>
         </w:tc>
       </w:tr>
@@ -6390,12 +7292,34 @@
         </w:rPr>
       </w:pPr>
       <w:bookmarkStart w:id="8" w:name="_Toc232152819"/>
+      <w:proofErr w:type="spellStart"/>
       <w:r>
         <w:rPr>
           <w:lang w:val="en-US"/>
         </w:rPr>
         <w:lastRenderedPageBreak/>
-        <w:t xml:space="preserve">Дерево ветвлений </w:t>
+        <w:t>Дерево</w:t>
+      </w:r>
+      <w:proofErr w:type="spellEnd"/>
+      <w:r>
+        <w:rPr>
+          <w:lang w:val="en-US"/>
+        </w:rPr>
+        <w:t xml:space="preserve"> </w:t>
+      </w:r>
+      <w:proofErr w:type="spellStart"/>
+      <w:r>
+        <w:rPr>
+          <w:lang w:val="en-US"/>
+        </w:rPr>
+        <w:t>ветвлений</w:t>
+      </w:r>
+      <w:proofErr w:type="spellEnd"/>
+      <w:r>
+        <w:rPr>
+          <w:lang w:val="en-US"/>
+        </w:rPr>
+        <w:t xml:space="preserve"> </w:t>
       </w:r>
       <w:r>
         <w:rPr>
@@ -6454,9 +7378,6 @@
     <w:p>
       <w:pPr>
         <w:pStyle w:val="aff"/>
-        <w:rPr>
-          <w:lang w:val="en-US"/>
-        </w:rPr>
       </w:pPr>
       <w:r>
         <w:t xml:space="preserve">Рисунок </w:t>
@@ -6508,27 +7429,9 @@
         <w:t>»</w:t>
       </w:r>
     </w:p>
-    <w:p>
-      <w:pPr>
-        <w:rPr>
-          <w:lang w:val="en-US"/>
-        </w:rPr>
-      </w:pPr>
-    </w:p>
-    <w:p>
-      <w:pPr>
-        <w:rPr>
-          <w:lang w:val="en-US"/>
-        </w:rPr>
-      </w:pPr>
-    </w:p>
-    <w:p>
-      <w:pPr>
-        <w:rPr>
-          <w:lang w:val="en-US"/>
-        </w:rPr>
-      </w:pPr>
-    </w:p>
+    <w:p/>
+    <w:p/>
+    <w:p/>
     <w:p>
       <w:pPr>
         <w:pStyle w:val="1"/>
@@ -6540,14 +7443,58 @@
         <w:jc w:val="center"/>
       </w:pPr>
       <w:bookmarkStart w:id="9" w:name="_Toc232152820"/>
+      <w:proofErr w:type="spellStart"/>
       <w:r>
         <w:rPr>
           <w:lang w:val="en-US"/>
         </w:rPr>
         <w:lastRenderedPageBreak/>
-        <w:t>Функциональное тестирование разработанной программы</w:t>
+        <w:t>Функциональное</w:t>
+      </w:r>
+      <w:proofErr w:type="spellEnd"/>
+      <w:r>
+        <w:rPr>
+          <w:lang w:val="en-US"/>
+        </w:rPr>
+        <w:t xml:space="preserve"> </w:t>
+      </w:r>
+      <w:proofErr w:type="spellStart"/>
+      <w:r>
+        <w:rPr>
+          <w:lang w:val="en-US"/>
+        </w:rPr>
+        <w:t>тестирование</w:t>
+      </w:r>
+      <w:proofErr w:type="spellEnd"/>
+      <w:r>
+        <w:rPr>
+          <w:lang w:val="en-US"/>
+        </w:rPr>
+        <w:t xml:space="preserve"> </w:t>
+      </w:r>
+      <w:proofErr w:type="spellStart"/>
+      <w:r>
+        <w:rPr>
+          <w:lang w:val="en-US"/>
+        </w:rPr>
+        <w:t>разработанной</w:t>
+      </w:r>
+      <w:proofErr w:type="spellEnd"/>
+      <w:r>
+        <w:rPr>
+          <w:lang w:val="en-US"/>
+        </w:rPr>
+        <w:t xml:space="preserve"> </w:t>
+      </w:r>
+      <w:proofErr w:type="spellStart"/>
+      <w:r>
+        <w:rPr>
+          <w:lang w:val="en-US"/>
+        </w:rPr>
+        <w:t>программы</w:t>
       </w:r>
       <w:bookmarkEnd w:id="9"/>
+      <w:proofErr w:type="spellEnd"/>
     </w:p>
     <w:p>
       <w:pPr>

</xml_diff>

<commit_message>
Edit report about programms, added names for pictures and fixed reference in UML diagramms
</commit_message>
<xml_diff>
--- a/ЛР 5. Рустамов ООП.docx
+++ b/ЛР 5. Рустамов ООП.docx
@@ -1178,10 +1178,21 @@
                 <w:lang w:eastAsia="ru-RU"/>
                 <w14:ligatures w14:val="none"/>
               </w:rPr>
-              <w:t xml:space="preserve">доцент </w:t>
-            </w:r>
-            <w:proofErr w:type="spellStart"/>
-            <w:r>
+              <w:t>доцент к.т.н</w:t>
+            </w:r>
+          </w:p>
+        </w:tc>
+        <w:tc>
+          <w:tcPr>
+            <w:tcW w:w="240" w:type="dxa"/>
+            <w:vAlign w:val="center"/>
+          </w:tcPr>
+          <w:p>
+            <w:pPr>
+              <w:spacing w:line="240" w:lineRule="auto"/>
+              <w:ind w:firstLine="0"/>
+              <w:contextualSpacing w:val="0"/>
+              <w:jc w:val="center"/>
               <w:rPr>
                 <w:rFonts w:ascii="Times New Roman" w:eastAsia="Times New Roman" w:hAnsi="Times New Roman" w:cs="Times New Roman"/>
                 <w:color w:val="000000"/>
@@ -1190,10 +1201,20 @@
                 <w:lang w:eastAsia="ru-RU"/>
                 <w14:ligatures w14:val="none"/>
               </w:rPr>
-              <w:t>к.</w:t>
-            </w:r>
-            <w:proofErr w:type="gramStart"/>
-            <w:r>
+            </w:pPr>
+          </w:p>
+        </w:tc>
+        <w:tc>
+          <w:tcPr>
+            <w:tcW w:w="282" w:type="dxa"/>
+            <w:vAlign w:val="center"/>
+          </w:tcPr>
+          <w:p>
+            <w:pPr>
+              <w:spacing w:line="240" w:lineRule="auto"/>
+              <w:ind w:firstLine="0"/>
+              <w:contextualSpacing w:val="0"/>
+              <w:jc w:val="center"/>
               <w:rPr>
                 <w:rFonts w:ascii="Times New Roman" w:eastAsia="Times New Roman" w:hAnsi="Times New Roman" w:cs="Times New Roman"/>
                 <w:color w:val="000000"/>
@@ -1202,16 +1223,14 @@
                 <w:lang w:eastAsia="ru-RU"/>
                 <w14:ligatures w14:val="none"/>
               </w:rPr>
-              <w:t>т.н</w:t>
-            </w:r>
-            <w:proofErr w:type="spellEnd"/>
-            <w:proofErr w:type="gramEnd"/>
-          </w:p>
-        </w:tc>
-        <w:tc>
-          <w:tcPr>
-            <w:tcW w:w="240" w:type="dxa"/>
+            </w:pPr>
+          </w:p>
+        </w:tc>
+        <w:tc>
+          <w:tcPr>
+            <w:tcW w:w="4153" w:type="dxa"/>
             <w:vAlign w:val="center"/>
+            <w:hideMark/>
           </w:tcPr>
           <w:p>
             <w:pPr>
@@ -1228,19 +1247,7 @@
                 <w14:ligatures w14:val="none"/>
               </w:rPr>
             </w:pPr>
-          </w:p>
-        </w:tc>
-        <w:tc>
-          <w:tcPr>
-            <w:tcW w:w="282" w:type="dxa"/>
-            <w:vAlign w:val="center"/>
-          </w:tcPr>
-          <w:p>
-            <w:pPr>
-              <w:spacing w:line="240" w:lineRule="auto"/>
-              <w:ind w:firstLine="0"/>
-              <w:contextualSpacing w:val="0"/>
-              <w:jc w:val="center"/>
+            <w:r>
               <w:rPr>
                 <w:rFonts w:ascii="Times New Roman" w:eastAsia="Times New Roman" w:hAnsi="Times New Roman" w:cs="Times New Roman"/>
                 <w:color w:val="000000"/>
@@ -1249,53 +1256,7 @@
                 <w:lang w:eastAsia="ru-RU"/>
                 <w14:ligatures w14:val="none"/>
               </w:rPr>
-            </w:pPr>
-          </w:p>
-        </w:tc>
-        <w:tc>
-          <w:tcPr>
-            <w:tcW w:w="4153" w:type="dxa"/>
-            <w:vAlign w:val="center"/>
-            <w:hideMark/>
-          </w:tcPr>
-          <w:p>
-            <w:pPr>
-              <w:spacing w:line="240" w:lineRule="auto"/>
-              <w:ind w:firstLine="0"/>
-              <w:contextualSpacing w:val="0"/>
-              <w:jc w:val="center"/>
-              <w:rPr>
-                <w:rFonts w:ascii="Times New Roman" w:eastAsia="Times New Roman" w:hAnsi="Times New Roman" w:cs="Times New Roman"/>
-                <w:color w:val="000000"/>
-                <w:kern w:val="0"/>
-                <w:szCs w:val="28"/>
-                <w:lang w:eastAsia="ru-RU"/>
-                <w14:ligatures w14:val="none"/>
-              </w:rPr>
-            </w:pPr>
-            <w:proofErr w:type="spellStart"/>
-            <w:r>
-              <w:rPr>
-                <w:rFonts w:ascii="Times New Roman" w:eastAsia="Times New Roman" w:hAnsi="Times New Roman" w:cs="Times New Roman"/>
-                <w:color w:val="000000"/>
-                <w:kern w:val="0"/>
-                <w:szCs w:val="28"/>
-                <w:lang w:eastAsia="ru-RU"/>
-                <w14:ligatures w14:val="none"/>
-              </w:rPr>
-              <w:t>Калентьев</w:t>
-            </w:r>
-            <w:proofErr w:type="spellEnd"/>
-            <w:r>
-              <w:rPr>
-                <w:rFonts w:ascii="Times New Roman" w:eastAsia="Times New Roman" w:hAnsi="Times New Roman" w:cs="Times New Roman"/>
-                <w:color w:val="000000"/>
-                <w:kern w:val="0"/>
-                <w:szCs w:val="28"/>
-                <w:lang w:eastAsia="ru-RU"/>
-                <w14:ligatures w14:val="none"/>
-              </w:rPr>
-              <w:t xml:space="preserve"> А.А.</w:t>
+              <w:t>Калентьев А.А.</w:t>
             </w:r>
           </w:p>
         </w:tc>
@@ -1596,7 +1557,7 @@
           <w:r>
             <w:fldChar w:fldCharType="separate"/>
           </w:r>
-          <w:hyperlink w:anchor="_Toc232152813" w:history="1">
+          <w:hyperlink w:anchor="_Toc232158911" w:history="1">
             <w:r>
               <w:rPr>
                 <w:rStyle w:val="af7"/>
@@ -1662,7 +1623,7 @@
                 <w:noProof/>
                 <w:webHidden/>
               </w:rPr>
-              <w:instrText xml:space="preserve"> PAGEREF _Toc232152813 \h </w:instrText>
+              <w:instrText xml:space="preserve"> PAGEREF _Toc232158911 \h </w:instrText>
             </w:r>
             <w:r>
               <w:rPr>
@@ -1707,7 +1668,7 @@
               <w:lang w:eastAsia="ru-RU"/>
             </w:rPr>
           </w:pPr>
-          <w:hyperlink w:anchor="_Toc232152814" w:history="1">
+          <w:hyperlink w:anchor="_Toc232158912" w:history="1">
             <w:r>
               <w:rPr>
                 <w:rStyle w:val="af7"/>
@@ -1752,7 +1713,7 @@
                 <w:noProof/>
                 <w:webHidden/>
               </w:rPr>
-              <w:instrText xml:space="preserve"> PAGEREF _Toc232152814 \h </w:instrText>
+              <w:instrText xml:space="preserve"> PAGEREF _Toc232158912 \h </w:instrText>
             </w:r>
             <w:r>
               <w:rPr>
@@ -1797,7 +1758,7 @@
               <w:lang w:eastAsia="ru-RU"/>
             </w:rPr>
           </w:pPr>
-          <w:hyperlink w:anchor="_Toc232152815" w:history="1">
+          <w:hyperlink w:anchor="_Toc232158913" w:history="1">
             <w:r>
               <w:rPr>
                 <w:rStyle w:val="af7"/>
@@ -1848,7 +1809,7 @@
                 <w:noProof/>
                 <w:webHidden/>
               </w:rPr>
-              <w:instrText xml:space="preserve"> PAGEREF _Toc232152815 \h </w:instrText>
+              <w:instrText xml:space="preserve"> PAGEREF _Toc232158913 \h </w:instrText>
             </w:r>
             <w:r>
               <w:rPr>
@@ -1881,9 +1842,9 @@
         </w:p>
         <w:p>
           <w:pPr>
-            <w:pStyle w:val="11"/>
+            <w:pStyle w:val="23"/>
             <w:tabs>
-              <w:tab w:val="left" w:pos="1440"/>
+              <w:tab w:val="left" w:pos="1680"/>
               <w:tab w:val="right" w:leader="dot" w:pos="9345"/>
             </w:tabs>
             <w:rPr>
@@ -1893,7 +1854,7 @@
               <w:lang w:eastAsia="ru-RU"/>
             </w:rPr>
           </w:pPr>
-          <w:hyperlink w:anchor="_Toc232152816" w:history="1">
+          <w:hyperlink w:anchor="_Toc232158914" w:history="1">
             <w:r>
               <w:rPr>
                 <w:rStyle w:val="af7"/>
@@ -1975,7 +1936,7 @@
                 <w:noProof/>
                 <w:webHidden/>
               </w:rPr>
-              <w:instrText xml:space="preserve"> PAGEREF _Toc232152816 \h </w:instrText>
+              <w:instrText xml:space="preserve"> PAGEREF _Toc232158914 \h </w:instrText>
             </w:r>
             <w:r>
               <w:rPr>
@@ -2008,9 +1969,9 @@
         </w:p>
         <w:p>
           <w:pPr>
-            <w:pStyle w:val="11"/>
+            <w:pStyle w:val="23"/>
             <w:tabs>
-              <w:tab w:val="left" w:pos="1440"/>
+              <w:tab w:val="left" w:pos="1680"/>
               <w:tab w:val="right" w:leader="dot" w:pos="9345"/>
             </w:tabs>
             <w:rPr>
@@ -2020,7 +1981,7 @@
               <w:lang w:eastAsia="ru-RU"/>
             </w:rPr>
           </w:pPr>
-          <w:hyperlink w:anchor="_Toc232152817" w:history="1">
+          <w:hyperlink w:anchor="_Toc232158915" w:history="1">
             <w:r>
               <w:rPr>
                 <w:rStyle w:val="af7"/>
@@ -2063,7 +2024,7 @@
                 <w:noProof/>
                 <w:webHidden/>
               </w:rPr>
-              <w:instrText xml:space="preserve"> PAGEREF _Toc232152817 \h </w:instrText>
+              <w:instrText xml:space="preserve"> PAGEREF _Toc232158915 \h </w:instrText>
             </w:r>
             <w:r>
               <w:rPr>
@@ -2096,9 +2057,9 @@
         </w:p>
         <w:p>
           <w:pPr>
-            <w:pStyle w:val="11"/>
+            <w:pStyle w:val="23"/>
             <w:tabs>
-              <w:tab w:val="left" w:pos="1440"/>
+              <w:tab w:val="left" w:pos="1680"/>
               <w:tab w:val="right" w:leader="dot" w:pos="9345"/>
             </w:tabs>
             <w:rPr>
@@ -2108,7 +2069,7 @@
               <w:lang w:eastAsia="ru-RU"/>
             </w:rPr>
           </w:pPr>
-          <w:hyperlink w:anchor="_Toc232152818" w:history="1">
+          <w:hyperlink w:anchor="_Toc232158916" w:history="1">
             <w:r>
               <w:rPr>
                 <w:rStyle w:val="af7"/>
@@ -2151,7 +2112,7 @@
                 <w:noProof/>
                 <w:webHidden/>
               </w:rPr>
-              <w:instrText xml:space="preserve"> PAGEREF _Toc232152818 \h </w:instrText>
+              <w:instrText xml:space="preserve"> PAGEREF _Toc232158916 \h </w:instrText>
             </w:r>
             <w:r>
               <w:rPr>
@@ -2196,7 +2157,7 @@
               <w:lang w:eastAsia="ru-RU"/>
             </w:rPr>
           </w:pPr>
-          <w:hyperlink w:anchor="_Toc232152819" w:history="1">
+          <w:hyperlink w:anchor="_Toc232158917" w:history="1">
             <w:r>
               <w:rPr>
                 <w:rStyle w:val="af7"/>
@@ -2241,7 +2202,7 @@
                 <w:noProof/>
                 <w:webHidden/>
               </w:rPr>
-              <w:instrText xml:space="preserve"> PAGEREF _Toc232152819 \h </w:instrText>
+              <w:instrText xml:space="preserve"> PAGEREF _Toc232158917 \h </w:instrText>
             </w:r>
             <w:r>
               <w:rPr>
@@ -2286,11 +2247,12 @@
               <w:lang w:eastAsia="ru-RU"/>
             </w:rPr>
           </w:pPr>
-          <w:hyperlink w:anchor="_Toc232152820" w:history="1">
+          <w:hyperlink w:anchor="_Toc232158918" w:history="1">
             <w:r>
               <w:rPr>
                 <w:rStyle w:val="af7"/>
                 <w:noProof/>
+                <w:lang w:val="en-US"/>
               </w:rPr>
               <w:t>5.</w:t>
             </w:r>
@@ -2330,7 +2292,7 @@
                 <w:noProof/>
                 <w:webHidden/>
               </w:rPr>
-              <w:instrText xml:space="preserve"> PAGEREF _Toc232152820 \h </w:instrText>
+              <w:instrText xml:space="preserve"> PAGEREF _Toc232158918 \h </w:instrText>
             </w:r>
             <w:r>
               <w:rPr>
@@ -2351,6 +2313,358 @@
                 <w:webHidden/>
               </w:rPr>
               <w:t>8</w:t>
+            </w:r>
+            <w:r>
+              <w:rPr>
+                <w:noProof/>
+                <w:webHidden/>
+              </w:rPr>
+              <w:fldChar w:fldCharType="end"/>
+            </w:r>
+          </w:hyperlink>
+        </w:p>
+        <w:p>
+          <w:pPr>
+            <w:pStyle w:val="23"/>
+            <w:tabs>
+              <w:tab w:val="left" w:pos="1680"/>
+              <w:tab w:val="right" w:leader="dot" w:pos="9345"/>
+            </w:tabs>
+            <w:rPr>
+              <w:rFonts w:eastAsiaTheme="minorEastAsia"/>
+              <w:noProof/>
+              <w:sz w:val="24"/>
+              <w:lang w:eastAsia="ru-RU"/>
+            </w:rPr>
+          </w:pPr>
+          <w:hyperlink w:anchor="_Toc232158919" w:history="1">
+            <w:r>
+              <w:rPr>
+                <w:rStyle w:val="af7"/>
+                <w:noProof/>
+              </w:rPr>
+              <w:t>5.1.</w:t>
+            </w:r>
+            <w:r>
+              <w:rPr>
+                <w:rFonts w:eastAsiaTheme="minorEastAsia"/>
+                <w:noProof/>
+                <w:sz w:val="24"/>
+                <w:lang w:eastAsia="ru-RU"/>
+              </w:rPr>
+              <w:tab/>
+            </w:r>
+            <w:r>
+              <w:rPr>
+                <w:rStyle w:val="af7"/>
+                <w:noProof/>
+              </w:rPr>
+              <w:t>Тестовые случаи добавления новых фигур</w:t>
+            </w:r>
+            <w:r>
+              <w:rPr>
+                <w:noProof/>
+                <w:webHidden/>
+              </w:rPr>
+              <w:tab/>
+            </w:r>
+            <w:r>
+              <w:rPr>
+                <w:noProof/>
+                <w:webHidden/>
+              </w:rPr>
+              <w:fldChar w:fldCharType="begin"/>
+            </w:r>
+            <w:r>
+              <w:rPr>
+                <w:noProof/>
+                <w:webHidden/>
+              </w:rPr>
+              <w:instrText xml:space="preserve"> PAGEREF _Toc232158919 \h </w:instrText>
+            </w:r>
+            <w:r>
+              <w:rPr>
+                <w:noProof/>
+                <w:webHidden/>
+              </w:rPr>
+            </w:r>
+            <w:r>
+              <w:rPr>
+                <w:noProof/>
+                <w:webHidden/>
+              </w:rPr>
+              <w:fldChar w:fldCharType="separate"/>
+            </w:r>
+            <w:r>
+              <w:rPr>
+                <w:noProof/>
+                <w:webHidden/>
+              </w:rPr>
+              <w:t>9</w:t>
+            </w:r>
+            <w:r>
+              <w:rPr>
+                <w:noProof/>
+                <w:webHidden/>
+              </w:rPr>
+              <w:fldChar w:fldCharType="end"/>
+            </w:r>
+          </w:hyperlink>
+        </w:p>
+        <w:p>
+          <w:pPr>
+            <w:pStyle w:val="23"/>
+            <w:tabs>
+              <w:tab w:val="left" w:pos="1680"/>
+              <w:tab w:val="right" w:leader="dot" w:pos="9345"/>
+            </w:tabs>
+            <w:rPr>
+              <w:rFonts w:eastAsiaTheme="minorEastAsia"/>
+              <w:noProof/>
+              <w:sz w:val="24"/>
+              <w:lang w:eastAsia="ru-RU"/>
+            </w:rPr>
+          </w:pPr>
+          <w:hyperlink w:anchor="_Toc232158920" w:history="1">
+            <w:r>
+              <w:rPr>
+                <w:rStyle w:val="af7"/>
+                <w:noProof/>
+              </w:rPr>
+              <w:t>5.2.</w:t>
+            </w:r>
+            <w:r>
+              <w:rPr>
+                <w:rFonts w:eastAsiaTheme="minorEastAsia"/>
+                <w:noProof/>
+                <w:sz w:val="24"/>
+                <w:lang w:eastAsia="ru-RU"/>
+              </w:rPr>
+              <w:tab/>
+            </w:r>
+            <w:r>
+              <w:rPr>
+                <w:rStyle w:val="af7"/>
+                <w:noProof/>
+              </w:rPr>
+              <w:t>Тестовый случай сохранения фигур</w:t>
+            </w:r>
+            <w:r>
+              <w:rPr>
+                <w:noProof/>
+                <w:webHidden/>
+              </w:rPr>
+              <w:tab/>
+            </w:r>
+            <w:r>
+              <w:rPr>
+                <w:noProof/>
+                <w:webHidden/>
+              </w:rPr>
+              <w:fldChar w:fldCharType="begin"/>
+            </w:r>
+            <w:r>
+              <w:rPr>
+                <w:noProof/>
+                <w:webHidden/>
+              </w:rPr>
+              <w:instrText xml:space="preserve"> PAGEREF _Toc232158920 \h </w:instrText>
+            </w:r>
+            <w:r>
+              <w:rPr>
+                <w:noProof/>
+                <w:webHidden/>
+              </w:rPr>
+            </w:r>
+            <w:r>
+              <w:rPr>
+                <w:noProof/>
+                <w:webHidden/>
+              </w:rPr>
+              <w:fldChar w:fldCharType="separate"/>
+            </w:r>
+            <w:r>
+              <w:rPr>
+                <w:noProof/>
+                <w:webHidden/>
+              </w:rPr>
+              <w:t>11</w:t>
+            </w:r>
+            <w:r>
+              <w:rPr>
+                <w:noProof/>
+                <w:webHidden/>
+              </w:rPr>
+              <w:fldChar w:fldCharType="end"/>
+            </w:r>
+          </w:hyperlink>
+        </w:p>
+        <w:p>
+          <w:pPr>
+            <w:pStyle w:val="23"/>
+            <w:tabs>
+              <w:tab w:val="left" w:pos="1680"/>
+              <w:tab w:val="right" w:leader="dot" w:pos="9345"/>
+            </w:tabs>
+            <w:rPr>
+              <w:rFonts w:eastAsiaTheme="minorEastAsia"/>
+              <w:noProof/>
+              <w:sz w:val="24"/>
+              <w:lang w:eastAsia="ru-RU"/>
+            </w:rPr>
+          </w:pPr>
+          <w:hyperlink w:anchor="_Toc232158921" w:history="1">
+            <w:r>
+              <w:rPr>
+                <w:rStyle w:val="af7"/>
+                <w:noProof/>
+              </w:rPr>
+              <w:t>5.3.</w:t>
+            </w:r>
+            <w:r>
+              <w:rPr>
+                <w:rFonts w:eastAsiaTheme="minorEastAsia"/>
+                <w:noProof/>
+                <w:sz w:val="24"/>
+                <w:lang w:eastAsia="ru-RU"/>
+              </w:rPr>
+              <w:tab/>
+            </w:r>
+            <w:r>
+              <w:rPr>
+                <w:rStyle w:val="af7"/>
+                <w:noProof/>
+              </w:rPr>
+              <w:t>Тестовый случай загрузки фигур</w:t>
+            </w:r>
+            <w:r>
+              <w:rPr>
+                <w:noProof/>
+                <w:webHidden/>
+              </w:rPr>
+              <w:tab/>
+            </w:r>
+            <w:r>
+              <w:rPr>
+                <w:noProof/>
+                <w:webHidden/>
+              </w:rPr>
+              <w:fldChar w:fldCharType="begin"/>
+            </w:r>
+            <w:r>
+              <w:rPr>
+                <w:noProof/>
+                <w:webHidden/>
+              </w:rPr>
+              <w:instrText xml:space="preserve"> PAGEREF _Toc232158921 \h </w:instrText>
+            </w:r>
+            <w:r>
+              <w:rPr>
+                <w:noProof/>
+                <w:webHidden/>
+              </w:rPr>
+            </w:r>
+            <w:r>
+              <w:rPr>
+                <w:noProof/>
+                <w:webHidden/>
+              </w:rPr>
+              <w:fldChar w:fldCharType="separate"/>
+            </w:r>
+            <w:r>
+              <w:rPr>
+                <w:noProof/>
+                <w:webHidden/>
+              </w:rPr>
+              <w:t>13</w:t>
+            </w:r>
+            <w:r>
+              <w:rPr>
+                <w:noProof/>
+                <w:webHidden/>
+              </w:rPr>
+              <w:fldChar w:fldCharType="end"/>
+            </w:r>
+          </w:hyperlink>
+        </w:p>
+        <w:p>
+          <w:pPr>
+            <w:pStyle w:val="23"/>
+            <w:tabs>
+              <w:tab w:val="left" w:pos="1680"/>
+              <w:tab w:val="right" w:leader="dot" w:pos="9345"/>
+            </w:tabs>
+            <w:rPr>
+              <w:rFonts w:eastAsiaTheme="minorEastAsia"/>
+              <w:noProof/>
+              <w:sz w:val="24"/>
+              <w:lang w:eastAsia="ru-RU"/>
+            </w:rPr>
+          </w:pPr>
+          <w:hyperlink w:anchor="_Toc232158922" w:history="1">
+            <w:r>
+              <w:rPr>
+                <w:rStyle w:val="af7"/>
+                <w:noProof/>
+              </w:rPr>
+              <w:t>5.4.</w:t>
+            </w:r>
+            <w:r>
+              <w:rPr>
+                <w:rFonts w:eastAsiaTheme="minorEastAsia"/>
+                <w:noProof/>
+                <w:sz w:val="24"/>
+                <w:lang w:eastAsia="ru-RU"/>
+              </w:rPr>
+              <w:tab/>
+            </w:r>
+            <w:r>
+              <w:rPr>
+                <w:rStyle w:val="af7"/>
+                <w:noProof/>
+              </w:rPr>
+              <w:t>Тестовый случай поиска фигур</w:t>
+            </w:r>
+            <w:r>
+              <w:rPr>
+                <w:noProof/>
+                <w:webHidden/>
+              </w:rPr>
+              <w:tab/>
+            </w:r>
+            <w:r>
+              <w:rPr>
+                <w:noProof/>
+                <w:webHidden/>
+              </w:rPr>
+              <w:fldChar w:fldCharType="begin"/>
+            </w:r>
+            <w:r>
+              <w:rPr>
+                <w:noProof/>
+                <w:webHidden/>
+              </w:rPr>
+              <w:instrText xml:space="preserve"> PAGEREF _Toc232158922 \h </w:instrText>
+            </w:r>
+            <w:r>
+              <w:rPr>
+                <w:noProof/>
+                <w:webHidden/>
+              </w:rPr>
+            </w:r>
+            <w:r>
+              <w:rPr>
+                <w:noProof/>
+                <w:webHidden/>
+              </w:rPr>
+              <w:fldChar w:fldCharType="separate"/>
+            </w:r>
+            <w:r>
+              <w:rPr>
+                <w:noProof/>
+                <w:webHidden/>
+              </w:rPr>
+              <w:t>14</w:t>
             </w:r>
             <w:r>
               <w:rPr>
@@ -2407,7 +2721,7 @@
         <w:spacing w:after="120"/>
         <w:jc w:val="center"/>
       </w:pPr>
-      <w:bookmarkStart w:id="0" w:name="_Toc232152813"/>
+      <w:bookmarkStart w:id="0" w:name="_Toc232158911"/>
       <w:r>
         <w:rPr>
           <w:lang w:val="en-US"/>
@@ -2491,7 +2805,7 @@
       </w:pPr>
       <w:r>
         <w:drawing>
-          <wp:inline distT="0" distB="0" distL="0" distR="0" wp14:anchorId="7AD332B9" wp14:editId="0699C61E">
+          <wp:inline distT="0" distB="0" distL="0" distR="0" wp14:anchorId="7AD332B9" wp14:editId="08E22917">
             <wp:extent cx="3543300" cy="5212248"/>
             <wp:effectExtent l="0" t="0" r="0" b="0"/>
             <wp:docPr id="1595171144" name="Рисунок 3"/>
@@ -2547,12 +2861,11 @@
       <w:r>
         <w:t xml:space="preserve">Рисунок </w:t>
       </w:r>
-      <w:bookmarkStart w:id="1" w:name="Рис_1_Диаграмма_вариантов_использования"/>
       <w:r>
         <w:fldChar w:fldCharType="begin"/>
       </w:r>
       <w:r>
-        <w:instrText xml:space="preserve"> STYLEREF 1 \s </w:instrText>
+        <w:instrText xml:space="preserve"> SEQ Рисунок \* ARABIC </w:instrText>
       </w:r>
       <w:r>
         <w:fldChar w:fldCharType="separate"/>
@@ -2567,18 +2880,9 @@
         <w:fldChar w:fldCharType="end"/>
       </w:r>
       <w:r>
-        <w:t>.</w:t>
-      </w:r>
-      <w:fldSimple w:instr=" SEQ Рисунок \* ARABIC \s 1 ">
-        <w:r>
-          <w:rPr>
-            <w:noProof/>
-          </w:rPr>
-          <w:t>1</w:t>
-        </w:r>
-      </w:fldSimple>
-      <w:bookmarkEnd w:id="1"/>
-      <w:r>
+        <w:rPr>
+          <w:lang w:val="en-US"/>
+        </w:rPr>
         <w:t xml:space="preserve"> – </w:t>
       </w:r>
       <w:r>
@@ -2598,8 +2902,8 @@
           <w:lang w:val="en-US"/>
         </w:rPr>
       </w:pPr>
-      <w:bookmarkStart w:id="2" w:name="_Toc227844699"/>
-      <w:bookmarkStart w:id="3" w:name="_Toc232152814"/>
+      <w:bookmarkStart w:id="1" w:name="_Toc227844699"/>
+      <w:bookmarkStart w:id="2" w:name="_Toc232158912"/>
       <w:r>
         <w:rPr>
           <w:lang w:val="en-US"/>
@@ -2611,32 +2915,10 @@
         <w:rPr>
           <w:lang w:val="en-US"/>
         </w:rPr>
-        <w:t xml:space="preserve"> </w:t>
-      </w:r>
-      <w:proofErr w:type="spellStart"/>
-      <w:r>
-        <w:rPr>
-          <w:lang w:val="en-US"/>
-        </w:rPr>
-        <w:t>диаграмма</w:t>
-      </w:r>
-      <w:proofErr w:type="spellEnd"/>
-      <w:r>
-        <w:rPr>
-          <w:lang w:val="en-US"/>
-        </w:rPr>
-        <w:t xml:space="preserve"> </w:t>
-      </w:r>
-      <w:proofErr w:type="spellStart"/>
-      <w:r>
-        <w:rPr>
-          <w:lang w:val="en-US"/>
-        </w:rPr>
-        <w:t>классов</w:t>
-      </w:r>
+        <w:t xml:space="preserve"> диаграмма классов</w:t>
+      </w:r>
+      <w:bookmarkEnd w:id="1"/>
       <w:bookmarkEnd w:id="2"/>
-      <w:bookmarkEnd w:id="3"/>
-      <w:proofErr w:type="spellEnd"/>
     </w:p>
     <w:p>
       <w:r>
@@ -2698,25 +2980,24 @@
       <w:r>
         <w:t xml:space="preserve">Рисунок </w:t>
       </w:r>
-      <w:fldSimple w:instr=" STYLEREF 1 \s ">
-        <w:r>
-          <w:rPr>
-            <w:noProof/>
-          </w:rPr>
-          <w:t>2</w:t>
-        </w:r>
-      </w:fldSimple>
-      <w:r>
-        <w:t>.</w:t>
-      </w:r>
-      <w:fldSimple w:instr=" SEQ Рисунок \* ARABIC \s 1 ">
-        <w:r>
-          <w:rPr>
-            <w:noProof/>
-          </w:rPr>
-          <w:t>1</w:t>
-        </w:r>
-      </w:fldSimple>
+      <w:r>
+        <w:fldChar w:fldCharType="begin"/>
+      </w:r>
+      <w:r>
+        <w:instrText xml:space="preserve"> SEQ Рисунок \* ARABIC </w:instrText>
+      </w:r>
+      <w:r>
+        <w:fldChar w:fldCharType="separate"/>
+      </w:r>
+      <w:r>
+        <w:rPr>
+          <w:noProof/>
+        </w:rPr>
+        <w:t>2</w:t>
+      </w:r>
+      <w:r>
+        <w:fldChar w:fldCharType="end"/>
+      </w:r>
       <w:r>
         <w:t xml:space="preserve"> –</w:t>
       </w:r>
@@ -2734,69 +3015,51 @@
         <w:spacing w:after="120"/>
         <w:jc w:val="center"/>
       </w:pPr>
-      <w:bookmarkStart w:id="4" w:name="_Toc232152815"/>
-      <w:proofErr w:type="spellStart"/>
+      <w:bookmarkStart w:id="3" w:name="_Toc232158913"/>
       <w:r>
         <w:rPr>
           <w:lang w:val="en-US"/>
         </w:rPr>
         <w:lastRenderedPageBreak/>
-        <w:t>Описание</w:t>
-      </w:r>
-      <w:proofErr w:type="spellEnd"/>
+        <w:t xml:space="preserve">Описание </w:t>
+      </w:r>
+      <w:r>
+        <w:t>связей</w:t>
+      </w:r>
+      <w:bookmarkEnd w:id="3"/>
       <w:r>
         <w:rPr>
           <w:lang w:val="en-US"/>
         </w:rPr>
         <w:t xml:space="preserve"> </w:t>
       </w:r>
-      <w:r>
-        <w:t>связей</w:t>
-      </w:r>
-      <w:bookmarkEnd w:id="4"/>
+    </w:p>
+    <w:p>
+      <w:pPr>
+        <w:pStyle w:val="2"/>
+        <w:numPr>
+          <w:ilvl w:val="1"/>
+          <w:numId w:val="27"/>
+        </w:numPr>
+        <w:rPr>
+          <w:lang w:val="en-US"/>
+        </w:rPr>
+      </w:pPr>
+      <w:bookmarkStart w:id="4" w:name="_Toc232158914"/>
+      <w:r>
+        <w:t>Связь</w:t>
+      </w:r>
       <w:r>
         <w:rPr>
           <w:lang w:val="en-US"/>
         </w:rPr>
         <w:t xml:space="preserve"> </w:t>
       </w:r>
-    </w:p>
-    <w:p>
-      <w:pPr>
-        <w:pStyle w:val="1"/>
-        <w:numPr>
-          <w:ilvl w:val="1"/>
-          <w:numId w:val="27"/>
-        </w:numPr>
-        <w:spacing w:after="120"/>
-        <w:jc w:val="center"/>
+      <w:r>
         <w:rPr>
           <w:lang w:val="en-US"/>
         </w:rPr>
-      </w:pPr>
-      <w:bookmarkStart w:id="5" w:name="_Toc232152816"/>
-      <w:r>
-        <w:t>Связь</w:t>
-      </w:r>
-      <w:r>
-        <w:rPr>
-          <w:lang w:val="en-US"/>
-        </w:rPr>
-        <w:t xml:space="preserve"> </w:t>
-      </w:r>
-      <w:proofErr w:type="spellStart"/>
-      <w:r>
-        <w:rPr>
-          <w:lang w:val="en-US"/>
-        </w:rPr>
-        <w:t>типа</w:t>
-      </w:r>
-      <w:proofErr w:type="spellEnd"/>
-      <w:r>
-        <w:rPr>
-          <w:lang w:val="en-US"/>
-        </w:rPr>
-        <w:t xml:space="preserve"> «</w:t>
+        <w:t>типа «</w:t>
       </w:r>
       <w:r>
         <w:t>тип</w:t>
@@ -2816,7 +3079,7 @@
         </w:rPr>
         <w:t>»</w:t>
       </w:r>
-      <w:bookmarkEnd w:id="5"/>
+      <w:bookmarkEnd w:id="4"/>
     </w:p>
     <w:p>
       <w:r>
@@ -2831,30 +3094,29 @@
       <w:r>
         <w:t xml:space="preserve">Таблица </w:t>
       </w:r>
-      <w:fldSimple w:instr=" STYLEREF 1 \s ">
-        <w:r>
-          <w:rPr>
-            <w:noProof/>
-          </w:rPr>
-          <w:t>3.1</w:t>
-        </w:r>
-      </w:fldSimple>
-      <w:r>
-        <w:t>.</w:t>
-      </w:r>
-      <w:fldSimple w:instr=" SEQ Таблица \* ARABIC \s 1 ">
-        <w:r>
-          <w:rPr>
-            <w:noProof/>
-          </w:rPr>
-          <w:t>1</w:t>
-        </w:r>
-      </w:fldSimple>
-      <w:r>
-        <w:t xml:space="preserve"> – Описание связей </w:t>
-      </w:r>
-      <w:r>
-        <w:t>между сущностями</w:t>
+      <w:r>
+        <w:fldChar w:fldCharType="begin"/>
+      </w:r>
+      <w:r>
+        <w:instrText xml:space="preserve"> SEQ Таблица \* ARABIC </w:instrText>
+      </w:r>
+      <w:r>
+        <w:fldChar w:fldCharType="separate"/>
+      </w:r>
+      <w:r>
+        <w:rPr>
+          <w:noProof/>
+        </w:rPr>
+        <w:t>1</w:t>
+      </w:r>
+      <w:r>
+        <w:fldChar w:fldCharType="end"/>
+      </w:r>
+      <w:r>
+        <w:t xml:space="preserve"> – </w:t>
+      </w:r>
+      <w:r>
+        <w:t>Описание связей между сущностями</w:t>
       </w:r>
     </w:p>
     <w:tbl>
@@ -3058,7 +3320,6 @@
               <w:ind w:firstLine="0"/>
               <w:jc w:val="center"/>
             </w:pPr>
-            <w:proofErr w:type="spellStart"/>
             <w:r>
               <w:rPr>
                 <w:rFonts w:ascii="Calibri" w:hAnsi="Calibri" w:cs="Calibri"/>
@@ -3068,7 +3329,6 @@
               </w:rPr>
               <w:t>VolumeFigureBase</w:t>
             </w:r>
-            <w:proofErr w:type="spellEnd"/>
           </w:p>
         </w:tc>
         <w:tc>
@@ -3084,7 +3344,6 @@
               <w:ind w:firstLine="0"/>
               <w:jc w:val="center"/>
             </w:pPr>
-            <w:proofErr w:type="spellStart"/>
             <w:r>
               <w:rPr>
                 <w:rFonts w:ascii="Calibri" w:hAnsi="Calibri" w:cs="Calibri"/>
@@ -3094,7 +3353,6 @@
               </w:rPr>
               <w:t>IVolumeFigure</w:t>
             </w:r>
-            <w:proofErr w:type="spellEnd"/>
           </w:p>
         </w:tc>
         <w:tc>
@@ -3140,47 +3398,7 @@
                 <w:sz w:val="22"/>
                 <w:szCs w:val="22"/>
               </w:rPr>
-              <w:t xml:space="preserve">Абстрактный класс </w:t>
-            </w:r>
-            <w:proofErr w:type="spellStart"/>
-            <w:r>
-              <w:rPr>
-                <w:rFonts w:ascii="Calibri" w:hAnsi="Calibri" w:cs="Calibri"/>
-                <w:color w:val="000000"/>
-                <w:sz w:val="22"/>
-                <w:szCs w:val="22"/>
-              </w:rPr>
-              <w:t>VolumeFigureBase</w:t>
-            </w:r>
-            <w:proofErr w:type="spellEnd"/>
-            <w:r>
-              <w:rPr>
-                <w:rFonts w:ascii="Calibri" w:hAnsi="Calibri" w:cs="Calibri"/>
-                <w:color w:val="000000"/>
-                <w:sz w:val="22"/>
-                <w:szCs w:val="22"/>
-              </w:rPr>
-              <w:t xml:space="preserve"> реализует интерфейс </w:t>
-            </w:r>
-            <w:proofErr w:type="spellStart"/>
-            <w:r>
-              <w:rPr>
-                <w:rFonts w:ascii="Calibri" w:hAnsi="Calibri" w:cs="Calibri"/>
-                <w:color w:val="000000"/>
-                <w:sz w:val="22"/>
-                <w:szCs w:val="22"/>
-              </w:rPr>
-              <w:t>IVolumeFigure</w:t>
-            </w:r>
-            <w:proofErr w:type="spellEnd"/>
-            <w:r>
-              <w:rPr>
-                <w:rFonts w:ascii="Calibri" w:hAnsi="Calibri" w:cs="Calibri"/>
-                <w:color w:val="000000"/>
-                <w:sz w:val="22"/>
-                <w:szCs w:val="22"/>
-              </w:rPr>
-              <w:t>. Интерфейс задаёт общий контракт для всех объёмных фигур: наличие типа фигуры, объёма и метода получения описания.</w:t>
+              <w:t>Абстрактный класс VolumeFigureBase реализует интерфейс IVolumeFigure. Интерфейс задаёт общий контракт для всех объёмных фигур: наличие типа фигуры, объёма и метода получения описания.</w:t>
             </w:r>
           </w:p>
         </w:tc>
@@ -3196,7 +3414,6 @@
               <w:ind w:firstLine="0"/>
               <w:jc w:val="center"/>
             </w:pPr>
-            <w:proofErr w:type="spellStart"/>
             <w:r>
               <w:rPr>
                 <w:rFonts w:ascii="Calibri" w:hAnsi="Calibri" w:cs="Calibri"/>
@@ -3206,7 +3423,6 @@
               </w:rPr>
               <w:t>Sphere</w:t>
             </w:r>
-            <w:proofErr w:type="spellEnd"/>
           </w:p>
         </w:tc>
         <w:tc>
@@ -3219,7 +3435,6 @@
               <w:ind w:firstLine="0"/>
               <w:jc w:val="center"/>
             </w:pPr>
-            <w:proofErr w:type="spellStart"/>
             <w:r>
               <w:rPr>
                 <w:rFonts w:ascii="Calibri" w:hAnsi="Calibri" w:cs="Calibri"/>
@@ -3229,7 +3444,6 @@
               </w:rPr>
               <w:t>VolumeFigureBase</w:t>
             </w:r>
-            <w:proofErr w:type="spellEnd"/>
           </w:p>
         </w:tc>
         <w:tc>
@@ -3272,47 +3486,7 @@
                 <w:sz w:val="22"/>
                 <w:szCs w:val="22"/>
               </w:rPr>
-              <w:t xml:space="preserve">Класс </w:t>
-            </w:r>
-            <w:proofErr w:type="spellStart"/>
-            <w:r>
-              <w:rPr>
-                <w:rFonts w:ascii="Calibri" w:hAnsi="Calibri" w:cs="Calibri"/>
-                <w:color w:val="000000"/>
-                <w:sz w:val="22"/>
-                <w:szCs w:val="22"/>
-              </w:rPr>
-              <w:t>Sphere</w:t>
-            </w:r>
-            <w:proofErr w:type="spellEnd"/>
-            <w:r>
-              <w:rPr>
-                <w:rFonts w:ascii="Calibri" w:hAnsi="Calibri" w:cs="Calibri"/>
-                <w:color w:val="000000"/>
-                <w:sz w:val="22"/>
-                <w:szCs w:val="22"/>
-              </w:rPr>
-              <w:t xml:space="preserve"> является частным случаем объёмной фигуры. Он наследует общие свойства и методы базового класса </w:t>
-            </w:r>
-            <w:proofErr w:type="spellStart"/>
-            <w:r>
-              <w:rPr>
-                <w:rFonts w:ascii="Calibri" w:hAnsi="Calibri" w:cs="Calibri"/>
-                <w:color w:val="000000"/>
-                <w:sz w:val="22"/>
-                <w:szCs w:val="22"/>
-              </w:rPr>
-              <w:t>VolumeFigureBase</w:t>
-            </w:r>
-            <w:proofErr w:type="spellEnd"/>
-            <w:r>
-              <w:rPr>
-                <w:rFonts w:ascii="Calibri" w:hAnsi="Calibri" w:cs="Calibri"/>
-                <w:color w:val="000000"/>
-                <w:sz w:val="22"/>
-                <w:szCs w:val="22"/>
-              </w:rPr>
-              <w:t xml:space="preserve"> и реализует собственную логику вычисления объёма сферы.</w:t>
+              <w:t>Класс Sphere является частным случаем объёмной фигуры. Он наследует общие свойства и методы базового класса VolumeFigureBase и реализует собственную логику вычисления объёма сферы.</w:t>
             </w:r>
           </w:p>
         </w:tc>
@@ -3328,7 +3502,6 @@
               <w:ind w:firstLine="0"/>
               <w:jc w:val="center"/>
             </w:pPr>
-            <w:proofErr w:type="spellStart"/>
             <w:r>
               <w:rPr>
                 <w:rFonts w:ascii="Calibri" w:hAnsi="Calibri" w:cs="Calibri"/>
@@ -3338,7 +3511,6 @@
               </w:rPr>
               <w:t>Pyramid</w:t>
             </w:r>
-            <w:proofErr w:type="spellEnd"/>
           </w:p>
         </w:tc>
         <w:tc>
@@ -3351,7 +3523,6 @@
               <w:ind w:firstLine="0"/>
               <w:jc w:val="center"/>
             </w:pPr>
-            <w:proofErr w:type="spellStart"/>
             <w:r>
               <w:rPr>
                 <w:rFonts w:ascii="Calibri" w:hAnsi="Calibri" w:cs="Calibri"/>
@@ -3361,7 +3532,6 @@
               </w:rPr>
               <w:t>VolumeFigureBase</w:t>
             </w:r>
-            <w:proofErr w:type="spellEnd"/>
           </w:p>
         </w:tc>
         <w:tc>
@@ -3404,27 +3574,7 @@
                 <w:sz w:val="22"/>
                 <w:szCs w:val="22"/>
               </w:rPr>
-              <w:t xml:space="preserve">Класс </w:t>
-            </w:r>
-            <w:proofErr w:type="spellStart"/>
-            <w:r>
-              <w:rPr>
-                <w:rFonts w:ascii="Calibri" w:hAnsi="Calibri" w:cs="Calibri"/>
-                <w:color w:val="000000"/>
-                <w:sz w:val="22"/>
-                <w:szCs w:val="22"/>
-              </w:rPr>
-              <w:t>Pyramid</w:t>
-            </w:r>
-            <w:proofErr w:type="spellEnd"/>
-            <w:r>
-              <w:rPr>
-                <w:rFonts w:ascii="Calibri" w:hAnsi="Calibri" w:cs="Calibri"/>
-                <w:color w:val="000000"/>
-                <w:sz w:val="22"/>
-                <w:szCs w:val="22"/>
-              </w:rPr>
-              <w:t xml:space="preserve"> является частным случаем объёмной фигуры. Он наследует общий интерфейс работы с фигурой и реализует вычисление объёма пирамиды на основе размеров основания и высоты.</w:t>
+              <w:t>Класс Pyramid является частным случаем объёмной фигуры. Он наследует общий интерфейс работы с фигурой и реализует вычисление объёма пирамиды на основе размеров основания и высоты.</w:t>
             </w:r>
           </w:p>
         </w:tc>
@@ -3440,7 +3590,6 @@
               <w:ind w:firstLine="0"/>
               <w:jc w:val="center"/>
             </w:pPr>
-            <w:proofErr w:type="spellStart"/>
             <w:r>
               <w:rPr>
                 <w:rFonts w:ascii="Calibri" w:hAnsi="Calibri" w:cs="Calibri"/>
@@ -3450,7 +3599,6 @@
               </w:rPr>
               <w:t>Parallelepiped</w:t>
             </w:r>
-            <w:proofErr w:type="spellEnd"/>
           </w:p>
         </w:tc>
         <w:tc>
@@ -3463,7 +3611,6 @@
               <w:ind w:firstLine="0"/>
               <w:jc w:val="center"/>
             </w:pPr>
-            <w:proofErr w:type="spellStart"/>
             <w:r>
               <w:rPr>
                 <w:rFonts w:ascii="Calibri" w:hAnsi="Calibri" w:cs="Calibri"/>
@@ -3473,7 +3620,6 @@
               </w:rPr>
               <w:t>VolumeFigureBase</w:t>
             </w:r>
-            <w:proofErr w:type="spellEnd"/>
           </w:p>
         </w:tc>
         <w:tc>
@@ -3516,27 +3662,7 @@
                 <w:sz w:val="22"/>
                 <w:szCs w:val="22"/>
               </w:rPr>
-              <w:t xml:space="preserve">Класс </w:t>
-            </w:r>
-            <w:proofErr w:type="spellStart"/>
-            <w:r>
-              <w:rPr>
-                <w:rFonts w:ascii="Calibri" w:hAnsi="Calibri" w:cs="Calibri"/>
-                <w:color w:val="000000"/>
-                <w:sz w:val="22"/>
-                <w:szCs w:val="22"/>
-              </w:rPr>
-              <w:t>Parallelepiped</w:t>
-            </w:r>
-            <w:proofErr w:type="spellEnd"/>
-            <w:r>
-              <w:rPr>
-                <w:rFonts w:ascii="Calibri" w:hAnsi="Calibri" w:cs="Calibri"/>
-                <w:color w:val="000000"/>
-                <w:sz w:val="22"/>
-                <w:szCs w:val="22"/>
-              </w:rPr>
-              <w:t xml:space="preserve"> является частным случаем объёмной фигуры. Он наследует базовую структуру объёмной фигуры и реализует вычисление объёма параллелепипеда по длине, ширине и высоте.</w:t>
+              <w:t>Класс Parallelepiped является частным случаем объёмной фигуры. Он наследует базовую структуру объёмной фигуры и реализует вычисление объёма параллелепипеда по длине, ширине и высоте.</w:t>
             </w:r>
           </w:p>
         </w:tc>
@@ -3549,15 +3675,13 @@
     </w:p>
     <w:p>
       <w:pPr>
-        <w:pStyle w:val="1"/>
+        <w:pStyle w:val="2"/>
         <w:numPr>
           <w:ilvl w:val="1"/>
           <w:numId w:val="27"/>
         </w:numPr>
-        <w:spacing w:after="120"/>
-        <w:jc w:val="center"/>
-      </w:pPr>
-      <w:bookmarkStart w:id="6" w:name="_Toc232152817"/>
+      </w:pPr>
+      <w:bookmarkStart w:id="5" w:name="_Toc232158915"/>
       <w:r>
         <w:lastRenderedPageBreak/>
         <w:t>Связь</w:t>
@@ -3577,7 +3701,40 @@
       <w:r>
         <w:t>елое»</w:t>
       </w:r>
-      <w:bookmarkEnd w:id="6"/>
+      <w:bookmarkEnd w:id="5"/>
+    </w:p>
+    <w:p>
+      <w:pPr>
+        <w:pStyle w:val="a3"/>
+        <w:keepNext/>
+      </w:pPr>
+      <w:r>
+        <w:t xml:space="preserve">Таблица </w:t>
+      </w:r>
+      <w:r>
+        <w:fldChar w:fldCharType="begin"/>
+      </w:r>
+      <w:r>
+        <w:instrText xml:space="preserve"> SEQ Таблица \* ARABIC </w:instrText>
+      </w:r>
+      <w:r>
+        <w:fldChar w:fldCharType="separate"/>
+      </w:r>
+      <w:r>
+        <w:rPr>
+          <w:noProof/>
+        </w:rPr>
+        <w:t>2</w:t>
+      </w:r>
+      <w:r>
+        <w:fldChar w:fldCharType="end"/>
+      </w:r>
+      <w:r>
+        <w:t xml:space="preserve"> – </w:t>
+      </w:r>
+      <w:r>
+        <w:t>Таблица связей типа "часть-целое"</w:t>
+      </w:r>
     </w:p>
     <w:tbl>
       <w:tblPr>
@@ -3746,7 +3903,6 @@
               <w:ind w:firstLine="0"/>
               <w:jc w:val="center"/>
             </w:pPr>
-            <w:proofErr w:type="spellStart"/>
             <w:r>
               <w:rPr>
                 <w:rFonts w:ascii="Calibri" w:hAnsi="Calibri" w:cs="Calibri"/>
@@ -3756,7 +3912,6 @@
               </w:rPr>
               <w:t>VolumeFiguresForm</w:t>
             </w:r>
-            <w:proofErr w:type="spellEnd"/>
           </w:p>
         </w:tc>
         <w:tc>
@@ -3772,7 +3927,6 @@
               <w:ind w:firstLine="0"/>
               <w:jc w:val="center"/>
             </w:pPr>
-            <w:proofErr w:type="spellStart"/>
             <w:r>
               <w:rPr>
                 <w:rFonts w:ascii="Calibri" w:hAnsi="Calibri" w:cs="Calibri"/>
@@ -3782,7 +3936,6 @@
               </w:rPr>
               <w:t>VolumeFigureBase</w:t>
             </w:r>
-            <w:proofErr w:type="spellEnd"/>
           </w:p>
         </w:tc>
         <w:tc>
@@ -3828,27 +3981,7 @@
                 <w:sz w:val="22"/>
                 <w:szCs w:val="22"/>
               </w:rPr>
-              <w:t>Главная форма содержит список объёмных фигур _</w:t>
-            </w:r>
-            <w:proofErr w:type="spellStart"/>
-            <w:r>
-              <w:rPr>
-                <w:rFonts w:ascii="Calibri" w:hAnsi="Calibri" w:cs="Calibri"/>
-                <w:color w:val="000000"/>
-                <w:sz w:val="22"/>
-                <w:szCs w:val="22"/>
-              </w:rPr>
-              <w:t>figures</w:t>
-            </w:r>
-            <w:proofErr w:type="spellEnd"/>
-            <w:r>
-              <w:rPr>
-                <w:rFonts w:ascii="Calibri" w:hAnsi="Calibri" w:cs="Calibri"/>
-                <w:color w:val="000000"/>
-                <w:sz w:val="22"/>
-                <w:szCs w:val="22"/>
-              </w:rPr>
-              <w:t>. Через этот список выполняется отображение, удаление, сохранение и загрузка фигур.</w:t>
+              <w:t>Главная форма содержит список объёмных фигур _figures. Через этот список выполняется отображение, удаление, сохранение и загрузка фигур.</w:t>
             </w:r>
           </w:p>
         </w:tc>
@@ -3864,7 +3997,6 @@
               <w:ind w:firstLine="0"/>
               <w:jc w:val="center"/>
             </w:pPr>
-            <w:proofErr w:type="spellStart"/>
             <w:r>
               <w:rPr>
                 <w:rFonts w:ascii="Calibri" w:hAnsi="Calibri" w:cs="Calibri"/>
@@ -3874,7 +4006,6 @@
               </w:rPr>
               <w:t>AddFigureForm</w:t>
             </w:r>
-            <w:proofErr w:type="spellEnd"/>
           </w:p>
         </w:tc>
         <w:tc>
@@ -3887,7 +4018,6 @@
               <w:ind w:firstLine="0"/>
               <w:jc w:val="center"/>
             </w:pPr>
-            <w:proofErr w:type="spellStart"/>
             <w:r>
               <w:rPr>
                 <w:rFonts w:ascii="Calibri" w:hAnsi="Calibri" w:cs="Calibri"/>
@@ -3897,7 +4027,6 @@
               </w:rPr>
               <w:t>VolumeFigureBase</w:t>
             </w:r>
-            <w:proofErr w:type="spellEnd"/>
           </w:p>
         </w:tc>
         <w:tc>
@@ -3937,47 +4066,7 @@
                 <w:sz w:val="22"/>
                 <w:szCs w:val="22"/>
               </w:rPr>
-              <w:t xml:space="preserve">Форма добавления хранит созданную фигуру в свойстве </w:t>
-            </w:r>
-            <w:proofErr w:type="spellStart"/>
-            <w:r>
-              <w:rPr>
-                <w:rFonts w:ascii="Calibri" w:hAnsi="Calibri" w:cs="Calibri"/>
-                <w:color w:val="000000"/>
-                <w:sz w:val="22"/>
-                <w:szCs w:val="22"/>
-              </w:rPr>
-              <w:t>CreatedFigure</w:t>
-            </w:r>
-            <w:proofErr w:type="spellEnd"/>
-            <w:r>
-              <w:rPr>
-                <w:rFonts w:ascii="Calibri" w:hAnsi="Calibri" w:cs="Calibri"/>
-                <w:color w:val="000000"/>
-                <w:sz w:val="22"/>
-                <w:szCs w:val="22"/>
-              </w:rPr>
-              <w:t xml:space="preserve">, имеющем тип </w:t>
-            </w:r>
-            <w:proofErr w:type="spellStart"/>
-            <w:r>
-              <w:rPr>
-                <w:rFonts w:ascii="Calibri" w:hAnsi="Calibri" w:cs="Calibri"/>
-                <w:color w:val="000000"/>
-                <w:sz w:val="22"/>
-                <w:szCs w:val="22"/>
-              </w:rPr>
-              <w:t>VolumeFigureBase</w:t>
-            </w:r>
-            <w:proofErr w:type="spellEnd"/>
-            <w:r>
-              <w:rPr>
-                <w:rFonts w:ascii="Calibri" w:hAnsi="Calibri" w:cs="Calibri"/>
-                <w:color w:val="000000"/>
-                <w:sz w:val="22"/>
-                <w:szCs w:val="22"/>
-              </w:rPr>
-              <w:t>.</w:t>
+              <w:t>Форма добавления хранит созданную фигуру в свойстве CreatedFigure, имеющем тип VolumeFigureBase.</w:t>
             </w:r>
           </w:p>
         </w:tc>
@@ -3999,7 +4088,6 @@
                 <w:szCs w:val="22"/>
               </w:rPr>
             </w:pPr>
-            <w:proofErr w:type="spellStart"/>
             <w:r>
               <w:rPr>
                 <w:rFonts w:ascii="Calibri" w:hAnsi="Calibri" w:cs="Calibri"/>
@@ -4009,7 +4097,6 @@
               </w:rPr>
               <w:t>FindFigureForm</w:t>
             </w:r>
-            <w:proofErr w:type="spellEnd"/>
           </w:p>
         </w:tc>
         <w:tc>
@@ -4028,7 +4115,6 @@
                 <w:szCs w:val="22"/>
               </w:rPr>
             </w:pPr>
-            <w:proofErr w:type="spellStart"/>
             <w:r>
               <w:rPr>
                 <w:rFonts w:ascii="Calibri" w:hAnsi="Calibri" w:cs="Calibri"/>
@@ -4038,7 +4124,6 @@
               </w:rPr>
               <w:t>VolumeFigureBase</w:t>
             </w:r>
-            <w:proofErr w:type="spellEnd"/>
           </w:p>
         </w:tc>
         <w:tc>
@@ -4122,7 +4207,6 @@
                 <w14:ligatures w14:val="none"/>
               </w:rPr>
             </w:pPr>
-            <w:proofErr w:type="spellStart"/>
             <w:r>
               <w:rPr>
                 <w:rFonts w:ascii="Calibri" w:eastAsia="Times New Roman" w:hAnsi="Calibri" w:cs="Calibri"/>
@@ -4135,7 +4219,6 @@
               </w:rPr>
               <w:t>FiguresFileData</w:t>
             </w:r>
-            <w:proofErr w:type="spellEnd"/>
           </w:p>
         </w:tc>
         <w:tc>
@@ -4161,7 +4244,6 @@
                 <w14:ligatures w14:val="none"/>
               </w:rPr>
             </w:pPr>
-            <w:proofErr w:type="spellStart"/>
             <w:r>
               <w:rPr>
                 <w:rFonts w:ascii="Calibri" w:eastAsia="Times New Roman" w:hAnsi="Calibri" w:cs="Calibri"/>
@@ -4174,7 +4256,6 @@
               </w:rPr>
               <w:t>FigureData</w:t>
             </w:r>
-            <w:proofErr w:type="spellEnd"/>
           </w:p>
         </w:tc>
         <w:tc>
@@ -4200,7 +4281,6 @@
                 <w14:ligatures w14:val="none"/>
               </w:rPr>
             </w:pPr>
-            <w:proofErr w:type="spellStart"/>
             <w:r>
               <w:rPr>
                 <w:rFonts w:ascii="Calibri" w:eastAsia="Times New Roman" w:hAnsi="Calibri" w:cs="Calibri"/>
@@ -4213,7 +4293,6 @@
               </w:rPr>
               <w:t>Композиция</w:t>
             </w:r>
-            <w:proofErr w:type="spellEnd"/>
           </w:p>
         </w:tc>
         <w:tc>
@@ -4248,7 +4327,6 @@
               </w:rPr>
               <w:t xml:space="preserve">Класс </w:t>
             </w:r>
-            <w:proofErr w:type="spellStart"/>
             <w:r>
               <w:rPr>
                 <w:rFonts w:ascii="Calibri" w:eastAsia="Times New Roman" w:hAnsi="Calibri" w:cs="Calibri"/>
@@ -4261,7 +4339,6 @@
               </w:rPr>
               <w:t>FiguresFileData</w:t>
             </w:r>
-            <w:proofErr w:type="spellEnd"/>
             <w:r>
               <w:rPr>
                 <w:rFonts w:ascii="Calibri" w:eastAsia="Times New Roman" w:hAnsi="Calibri" w:cs="Calibri"/>
@@ -4273,7 +4350,6 @@
               </w:rPr>
               <w:t xml:space="preserve"> содержит коллекцию объектов </w:t>
             </w:r>
-            <w:proofErr w:type="spellStart"/>
             <w:r>
               <w:rPr>
                 <w:rFonts w:ascii="Calibri" w:eastAsia="Times New Roman" w:hAnsi="Calibri" w:cs="Calibri"/>
@@ -4286,7 +4362,6 @@
               </w:rPr>
               <w:t>FigureData</w:t>
             </w:r>
-            <w:proofErr w:type="spellEnd"/>
             <w:r>
               <w:rPr>
                 <w:rFonts w:ascii="Calibri" w:eastAsia="Times New Roman" w:hAnsi="Calibri" w:cs="Calibri"/>
@@ -4298,7 +4373,6 @@
               </w:rPr>
               <w:t xml:space="preserve">. Объекты </w:t>
             </w:r>
-            <w:proofErr w:type="spellStart"/>
             <w:r>
               <w:rPr>
                 <w:rFonts w:ascii="Calibri" w:eastAsia="Times New Roman" w:hAnsi="Calibri" w:cs="Calibri"/>
@@ -4311,7 +4385,6 @@
               </w:rPr>
               <w:t>FigureData</w:t>
             </w:r>
-            <w:proofErr w:type="spellEnd"/>
             <w:r>
               <w:rPr>
                 <w:rFonts w:ascii="Calibri" w:eastAsia="Times New Roman" w:hAnsi="Calibri" w:cs="Calibri"/>
@@ -4334,22 +4407,50 @@
     </w:p>
     <w:p>
       <w:pPr>
-        <w:pStyle w:val="1"/>
+        <w:pStyle w:val="2"/>
         <w:numPr>
           <w:ilvl w:val="1"/>
           <w:numId w:val="27"/>
         </w:numPr>
-        <w:spacing w:after="120"/>
-        <w:jc w:val="center"/>
-      </w:pPr>
-      <w:bookmarkStart w:id="7" w:name="_Toc232152818"/>
+      </w:pPr>
+      <w:bookmarkStart w:id="6" w:name="_Toc232158916"/>
       <w:r>
         <w:t>Связь типа</w:t>
       </w:r>
       <w:r>
         <w:t xml:space="preserve"> «Использование»</w:t>
       </w:r>
-      <w:bookmarkEnd w:id="7"/>
+      <w:bookmarkEnd w:id="6"/>
+    </w:p>
+    <w:p>
+      <w:pPr>
+        <w:pStyle w:val="a3"/>
+        <w:keepNext/>
+      </w:pPr>
+      <w:r>
+        <w:t xml:space="preserve">Таблица </w:t>
+      </w:r>
+      <w:r>
+        <w:fldChar w:fldCharType="begin"/>
+      </w:r>
+      <w:r>
+        <w:instrText xml:space="preserve"> SEQ Таблица \* ARABIC </w:instrText>
+      </w:r>
+      <w:r>
+        <w:fldChar w:fldCharType="separate"/>
+      </w:r>
+      <w:r>
+        <w:rPr>
+          <w:noProof/>
+        </w:rPr>
+        <w:t>3</w:t>
+      </w:r>
+      <w:r>
+        <w:fldChar w:fldCharType="end"/>
+      </w:r>
+      <w:r>
+        <w:t xml:space="preserve"> – Связь использование</w:t>
+      </w:r>
     </w:p>
     <w:tbl>
       <w:tblPr>
@@ -4507,7 +4608,6 @@
               <w:ind w:firstLine="0"/>
               <w:jc w:val="center"/>
             </w:pPr>
-            <w:proofErr w:type="spellStart"/>
             <w:r>
               <w:rPr>
                 <w:rFonts w:ascii="Calibri" w:hAnsi="Calibri" w:cs="Calibri"/>
@@ -4517,7 +4617,6 @@
               </w:rPr>
               <w:t>VolumeFiguresForm</w:t>
             </w:r>
-            <w:proofErr w:type="spellEnd"/>
           </w:p>
         </w:tc>
         <w:tc>
@@ -4539,27 +4638,7 @@
                 <w:sz w:val="22"/>
                 <w:szCs w:val="22"/>
               </w:rPr>
-              <w:t xml:space="preserve">Класс Program является точкой входа в приложение и запускает главную форму </w:t>
-            </w:r>
-            <w:proofErr w:type="spellStart"/>
-            <w:r>
-              <w:rPr>
-                <w:rFonts w:ascii="Calibri" w:hAnsi="Calibri" w:cs="Calibri"/>
-                <w:color w:val="000000"/>
-                <w:sz w:val="22"/>
-                <w:szCs w:val="22"/>
-              </w:rPr>
-              <w:t>VolumeFiguresForm</w:t>
-            </w:r>
-            <w:proofErr w:type="spellEnd"/>
-            <w:r>
-              <w:rPr>
-                <w:rFonts w:ascii="Calibri" w:hAnsi="Calibri" w:cs="Calibri"/>
-                <w:color w:val="000000"/>
-                <w:sz w:val="22"/>
-                <w:szCs w:val="22"/>
-              </w:rPr>
-              <w:t>.</w:t>
+              <w:t>Класс Program является точкой входа в приложение и запускает главную форму VolumeFiguresForm.</w:t>
             </w:r>
           </w:p>
         </w:tc>
@@ -4578,7 +4657,6 @@
               <w:ind w:firstLine="0"/>
               <w:jc w:val="center"/>
             </w:pPr>
-            <w:proofErr w:type="spellStart"/>
             <w:r>
               <w:rPr>
                 <w:rFonts w:ascii="Calibri" w:hAnsi="Calibri" w:cs="Calibri"/>
@@ -4588,7 +4666,6 @@
               </w:rPr>
               <w:t>VolumeFiguresForm</w:t>
             </w:r>
-            <w:proofErr w:type="spellEnd"/>
           </w:p>
         </w:tc>
         <w:tc>
@@ -4604,7 +4681,6 @@
               <w:ind w:firstLine="0"/>
               <w:jc w:val="center"/>
             </w:pPr>
-            <w:proofErr w:type="spellStart"/>
             <w:r>
               <w:rPr>
                 <w:rFonts w:ascii="Calibri" w:hAnsi="Calibri" w:cs="Calibri"/>
@@ -4614,7 +4690,6 @@
               </w:rPr>
               <w:t>AddFigureForm</w:t>
             </w:r>
-            <w:proofErr w:type="spellEnd"/>
           </w:p>
         </w:tc>
         <w:tc>
@@ -4655,7 +4730,6 @@
                 <w:szCs w:val="22"/>
               </w:rPr>
             </w:pPr>
-            <w:proofErr w:type="spellStart"/>
             <w:r>
               <w:rPr>
                 <w:rFonts w:ascii="Calibri" w:hAnsi="Calibri" w:cs="Calibri"/>
@@ -4665,7 +4739,6 @@
               </w:rPr>
               <w:t>VolumeFiguresForm</w:t>
             </w:r>
-            <w:proofErr w:type="spellEnd"/>
           </w:p>
         </w:tc>
         <w:tc>
@@ -4684,7 +4757,6 @@
                 <w:szCs w:val="22"/>
               </w:rPr>
             </w:pPr>
-            <w:proofErr w:type="spellStart"/>
             <w:r>
               <w:rPr>
                 <w:rFonts w:ascii="Calibri" w:hAnsi="Calibri" w:cs="Calibri"/>
@@ -4694,7 +4766,6 @@
               </w:rPr>
               <w:t>FindFigureForm</w:t>
             </w:r>
-            <w:proofErr w:type="spellEnd"/>
           </w:p>
         </w:tc>
         <w:tc>
@@ -4751,7 +4822,6 @@
                 <w14:ligatures w14:val="none"/>
               </w:rPr>
             </w:pPr>
-            <w:proofErr w:type="spellStart"/>
             <w:r>
               <w:rPr>
                 <w:rFonts w:ascii="Calibri" w:hAnsi="Calibri" w:cs="Calibri"/>
@@ -4761,7 +4831,6 @@
               </w:rPr>
               <w:t>VolumeFiguresForm</w:t>
             </w:r>
-            <w:proofErr w:type="spellEnd"/>
           </w:p>
         </w:tc>
         <w:tc>
@@ -4787,7 +4856,6 @@
                 <w14:ligatures w14:val="none"/>
               </w:rPr>
             </w:pPr>
-            <w:proofErr w:type="spellStart"/>
             <w:r>
               <w:rPr>
                 <w:rFonts w:ascii="Calibri" w:hAnsi="Calibri" w:cs="Calibri"/>
@@ -4797,7 +4865,6 @@
               </w:rPr>
               <w:t>FigureStorage</w:t>
             </w:r>
-            <w:proofErr w:type="spellEnd"/>
           </w:p>
         </w:tc>
         <w:tc>
@@ -4829,27 +4896,7 @@
                 <w:sz w:val="22"/>
                 <w:szCs w:val="22"/>
               </w:rPr>
-              <w:t xml:space="preserve">Главная форма использует класс </w:t>
-            </w:r>
-            <w:proofErr w:type="spellStart"/>
-            <w:r>
-              <w:rPr>
-                <w:rFonts w:ascii="Calibri" w:hAnsi="Calibri" w:cs="Calibri"/>
-                <w:color w:val="000000"/>
-                <w:sz w:val="22"/>
-                <w:szCs w:val="22"/>
-              </w:rPr>
-              <w:t>FigureStorage</w:t>
-            </w:r>
-            <w:proofErr w:type="spellEnd"/>
-            <w:r>
-              <w:rPr>
-                <w:rFonts w:ascii="Calibri" w:hAnsi="Calibri" w:cs="Calibri"/>
-                <w:color w:val="000000"/>
-                <w:sz w:val="22"/>
-                <w:szCs w:val="22"/>
-              </w:rPr>
-              <w:t xml:space="preserve"> для сохранения и загрузки списка фигур из файла.</w:t>
+              <w:t>Главная форма использует класс FigureStorage для сохранения и загрузки списка фигур из файла.</w:t>
             </w:r>
           </w:p>
         </w:tc>
@@ -4880,7 +4927,6 @@
                 <w14:ligatures w14:val="none"/>
               </w:rPr>
             </w:pPr>
-            <w:proofErr w:type="spellStart"/>
             <w:r>
               <w:rPr>
                 <w:rFonts w:ascii="Calibri" w:hAnsi="Calibri" w:cs="Calibri"/>
@@ -4890,7 +4936,6 @@
               </w:rPr>
               <w:t>VolumeFiguresForm</w:t>
             </w:r>
-            <w:proofErr w:type="spellEnd"/>
           </w:p>
         </w:tc>
         <w:tc>
@@ -4915,7 +4960,6 @@
                 <w14:ligatures w14:val="none"/>
               </w:rPr>
             </w:pPr>
-            <w:proofErr w:type="spellStart"/>
             <w:r>
               <w:rPr>
                 <w:rFonts w:ascii="Calibri" w:hAnsi="Calibri" w:cs="Calibri"/>
@@ -4925,7 +4969,6 @@
               </w:rPr>
               <w:t>FormatPrecision</w:t>
             </w:r>
-            <w:proofErr w:type="spellEnd"/>
           </w:p>
         </w:tc>
         <w:tc>
@@ -4986,7 +5029,6 @@
                 <w14:ligatures w14:val="none"/>
               </w:rPr>
             </w:pPr>
-            <w:proofErr w:type="spellStart"/>
             <w:r>
               <w:rPr>
                 <w:rFonts w:ascii="Calibri" w:hAnsi="Calibri" w:cs="Calibri"/>
@@ -4996,7 +5038,6 @@
               </w:rPr>
               <w:t>AddFigureForm</w:t>
             </w:r>
-            <w:proofErr w:type="spellEnd"/>
           </w:p>
         </w:tc>
         <w:tc>
@@ -5020,7 +5061,6 @@
                 <w14:ligatures w14:val="none"/>
               </w:rPr>
             </w:pPr>
-            <w:proofErr w:type="spellStart"/>
             <w:r>
               <w:rPr>
                 <w:rFonts w:ascii="Calibri" w:hAnsi="Calibri" w:cs="Calibri"/>
@@ -5030,7 +5070,6 @@
               </w:rPr>
               <w:t>Sphere</w:t>
             </w:r>
-            <w:proofErr w:type="spellEnd"/>
           </w:p>
         </w:tc>
         <w:tc>
@@ -5061,27 +5100,7 @@
                 <w:sz w:val="22"/>
                 <w:szCs w:val="22"/>
               </w:rPr>
-              <w:t xml:space="preserve">Форма добавления создаёт объект класса </w:t>
-            </w:r>
-            <w:proofErr w:type="spellStart"/>
-            <w:r>
-              <w:rPr>
-                <w:rFonts w:ascii="Calibri" w:hAnsi="Calibri" w:cs="Calibri"/>
-                <w:color w:val="000000"/>
-                <w:sz w:val="22"/>
-                <w:szCs w:val="22"/>
-              </w:rPr>
-              <w:t>Sphere</w:t>
-            </w:r>
-            <w:proofErr w:type="spellEnd"/>
-            <w:r>
-              <w:rPr>
-                <w:rFonts w:ascii="Calibri" w:hAnsi="Calibri" w:cs="Calibri"/>
-                <w:color w:val="000000"/>
-                <w:sz w:val="22"/>
-                <w:szCs w:val="22"/>
-              </w:rPr>
-              <w:t xml:space="preserve"> при выборе соответствующего типа фигуры.</w:t>
+              <w:t>Форма добавления создаёт объект класса Sphere при выборе соответствующего типа фигуры.</w:t>
             </w:r>
           </w:p>
         </w:tc>
@@ -5111,7 +5130,6 @@
                 <w14:ligatures w14:val="none"/>
               </w:rPr>
             </w:pPr>
-            <w:proofErr w:type="spellStart"/>
             <w:r>
               <w:rPr>
                 <w:rFonts w:ascii="Calibri" w:hAnsi="Calibri" w:cs="Calibri"/>
@@ -5121,7 +5139,6 @@
               </w:rPr>
               <w:t>AddFigureForm</w:t>
             </w:r>
-            <w:proofErr w:type="spellEnd"/>
           </w:p>
         </w:tc>
         <w:tc>
@@ -5145,7 +5162,6 @@
                 <w14:ligatures w14:val="none"/>
               </w:rPr>
             </w:pPr>
-            <w:proofErr w:type="spellStart"/>
             <w:r>
               <w:rPr>
                 <w:rFonts w:ascii="Calibri" w:hAnsi="Calibri" w:cs="Calibri"/>
@@ -5155,7 +5171,6 @@
               </w:rPr>
               <w:t>Pyramid</w:t>
             </w:r>
-            <w:proofErr w:type="spellEnd"/>
           </w:p>
         </w:tc>
         <w:tc>
@@ -5186,27 +5201,7 @@
                 <w:sz w:val="22"/>
                 <w:szCs w:val="22"/>
               </w:rPr>
-              <w:t xml:space="preserve">Форма добавления создаёт объект класса </w:t>
-            </w:r>
-            <w:proofErr w:type="spellStart"/>
-            <w:r>
-              <w:rPr>
-                <w:rFonts w:ascii="Calibri" w:hAnsi="Calibri" w:cs="Calibri"/>
-                <w:color w:val="000000"/>
-                <w:sz w:val="22"/>
-                <w:szCs w:val="22"/>
-              </w:rPr>
-              <w:t>Pyramid</w:t>
-            </w:r>
-            <w:proofErr w:type="spellEnd"/>
-            <w:r>
-              <w:rPr>
-                <w:rFonts w:ascii="Calibri" w:hAnsi="Calibri" w:cs="Calibri"/>
-                <w:color w:val="000000"/>
-                <w:sz w:val="22"/>
-                <w:szCs w:val="22"/>
-              </w:rPr>
-              <w:t xml:space="preserve"> при выборе соответствующего типа фигуры.</w:t>
+              <w:t>Форма добавления создаёт объект класса Pyramid при выборе соответствующего типа фигуры.</w:t>
             </w:r>
           </w:p>
         </w:tc>
@@ -5236,7 +5231,6 @@
                 <w14:ligatures w14:val="none"/>
               </w:rPr>
             </w:pPr>
-            <w:proofErr w:type="spellStart"/>
             <w:r>
               <w:rPr>
                 <w:rFonts w:ascii="Calibri" w:hAnsi="Calibri" w:cs="Calibri"/>
@@ -5246,7 +5240,6 @@
               </w:rPr>
               <w:t>AddFigureForm</w:t>
             </w:r>
-            <w:proofErr w:type="spellEnd"/>
           </w:p>
         </w:tc>
         <w:tc>
@@ -5270,7 +5263,6 @@
                 <w14:ligatures w14:val="none"/>
               </w:rPr>
             </w:pPr>
-            <w:proofErr w:type="spellStart"/>
             <w:r>
               <w:rPr>
                 <w:rFonts w:ascii="Calibri" w:hAnsi="Calibri" w:cs="Calibri"/>
@@ -5280,7 +5272,6 @@
               </w:rPr>
               <w:t>Parallelepiped</w:t>
             </w:r>
-            <w:proofErr w:type="spellEnd"/>
           </w:p>
         </w:tc>
         <w:tc>
@@ -5311,27 +5302,7 @@
                 <w:sz w:val="22"/>
                 <w:szCs w:val="22"/>
               </w:rPr>
-              <w:t xml:space="preserve">Форма добавления создаёт объект класса </w:t>
-            </w:r>
-            <w:proofErr w:type="spellStart"/>
-            <w:r>
-              <w:rPr>
-                <w:rFonts w:ascii="Calibri" w:hAnsi="Calibri" w:cs="Calibri"/>
-                <w:color w:val="000000"/>
-                <w:sz w:val="22"/>
-                <w:szCs w:val="22"/>
-              </w:rPr>
-              <w:t>Parallelepiped</w:t>
-            </w:r>
-            <w:proofErr w:type="spellEnd"/>
-            <w:r>
-              <w:rPr>
-                <w:rFonts w:ascii="Calibri" w:hAnsi="Calibri" w:cs="Calibri"/>
-                <w:color w:val="000000"/>
-                <w:sz w:val="22"/>
-                <w:szCs w:val="22"/>
-              </w:rPr>
-              <w:t xml:space="preserve"> при выборе соответствующего типа фигуры.</w:t>
+              <w:t>Форма добавления создаёт объект класса Parallelepiped при выборе соответствующего типа фигуры.</w:t>
             </w:r>
           </w:p>
         </w:tc>
@@ -5361,17 +5332,16 @@
                 <w14:ligatures w14:val="none"/>
               </w:rPr>
             </w:pPr>
-            <w:proofErr w:type="spellStart"/>
-            <w:r>
-              <w:rPr>
-                <w:rFonts w:ascii="Calibri" w:hAnsi="Calibri" w:cs="Calibri"/>
-                <w:color w:val="000000"/>
-                <w:sz w:val="22"/>
-                <w:szCs w:val="22"/>
-              </w:rPr>
+            <w:r>
+              <w:rPr>
+                <w:rFonts w:ascii="Calibri" w:hAnsi="Calibri" w:cs="Calibri"/>
+                <w:color w:val="000000"/>
+                <w:sz w:val="22"/>
+                <w:szCs w:val="22"/>
+              </w:rPr>
+              <w:lastRenderedPageBreak/>
               <w:t>AddFigureForm</w:t>
             </w:r>
-            <w:proofErr w:type="spellEnd"/>
           </w:p>
         </w:tc>
         <w:tc>
@@ -5395,7 +5365,6 @@
                 <w14:ligatures w14:val="none"/>
               </w:rPr>
             </w:pPr>
-            <w:proofErr w:type="spellStart"/>
             <w:r>
               <w:rPr>
                 <w:rFonts w:ascii="Calibri" w:hAnsi="Calibri" w:cs="Calibri"/>
@@ -5405,7 +5374,6 @@
               </w:rPr>
               <w:t>Validator</w:t>
             </w:r>
-            <w:proofErr w:type="spellEnd"/>
           </w:p>
         </w:tc>
         <w:tc>
@@ -5436,27 +5404,7 @@
                 <w:sz w:val="22"/>
                 <w:szCs w:val="22"/>
               </w:rPr>
-              <w:t xml:space="preserve">Форма добавления использует класс </w:t>
-            </w:r>
-            <w:proofErr w:type="spellStart"/>
-            <w:r>
-              <w:rPr>
-                <w:rFonts w:ascii="Calibri" w:hAnsi="Calibri" w:cs="Calibri"/>
-                <w:color w:val="000000"/>
-                <w:sz w:val="22"/>
-                <w:szCs w:val="22"/>
-              </w:rPr>
-              <w:t>Validator</w:t>
-            </w:r>
-            <w:proofErr w:type="spellEnd"/>
-            <w:r>
-              <w:rPr>
-                <w:rFonts w:ascii="Calibri" w:hAnsi="Calibri" w:cs="Calibri"/>
-                <w:color w:val="000000"/>
-                <w:sz w:val="22"/>
-                <w:szCs w:val="22"/>
-              </w:rPr>
-              <w:t xml:space="preserve"> для проверки корректности введённых пользователем числовых параметров.</w:t>
+              <w:t>Форма добавления использует класс Validator для проверки корректности введённых пользователем числовых параметров.</w:t>
             </w:r>
           </w:p>
         </w:tc>
@@ -5486,18 +5434,15 @@
                 <w14:ligatures w14:val="none"/>
               </w:rPr>
             </w:pPr>
-            <w:proofErr w:type="spellStart"/>
-            <w:r>
-              <w:rPr>
-                <w:rFonts w:ascii="Calibri" w:hAnsi="Calibri" w:cs="Calibri"/>
-                <w:color w:val="000000"/>
-                <w:sz w:val="22"/>
-                <w:szCs w:val="22"/>
-              </w:rPr>
-              <w:lastRenderedPageBreak/>
+            <w:r>
+              <w:rPr>
+                <w:rFonts w:ascii="Calibri" w:hAnsi="Calibri" w:cs="Calibri"/>
+                <w:color w:val="000000"/>
+                <w:sz w:val="22"/>
+                <w:szCs w:val="22"/>
+              </w:rPr>
               <w:t>AddFigureForm</w:t>
             </w:r>
-            <w:proofErr w:type="spellEnd"/>
           </w:p>
         </w:tc>
         <w:tc>
@@ -5521,7 +5466,6 @@
                 <w14:ligatures w14:val="none"/>
               </w:rPr>
             </w:pPr>
-            <w:proofErr w:type="spellStart"/>
             <w:r>
               <w:rPr>
                 <w:rFonts w:ascii="Calibri" w:hAnsi="Calibri" w:cs="Calibri"/>
@@ -5531,7 +5475,6 @@
               </w:rPr>
               <w:t>FigureType</w:t>
             </w:r>
-            <w:proofErr w:type="spellEnd"/>
           </w:p>
         </w:tc>
         <w:tc>
@@ -5562,27 +5505,7 @@
                 <w:sz w:val="22"/>
                 <w:szCs w:val="22"/>
               </w:rPr>
-              <w:t xml:space="preserve">Форма добавления использует перечисление </w:t>
-            </w:r>
-            <w:proofErr w:type="spellStart"/>
-            <w:r>
-              <w:rPr>
-                <w:rFonts w:ascii="Calibri" w:hAnsi="Calibri" w:cs="Calibri"/>
-                <w:color w:val="000000"/>
-                <w:sz w:val="22"/>
-                <w:szCs w:val="22"/>
-              </w:rPr>
-              <w:t>FigureType</w:t>
-            </w:r>
-            <w:proofErr w:type="spellEnd"/>
-            <w:r>
-              <w:rPr>
-                <w:rFonts w:ascii="Calibri" w:hAnsi="Calibri" w:cs="Calibri"/>
-                <w:color w:val="000000"/>
-                <w:sz w:val="22"/>
-                <w:szCs w:val="22"/>
-              </w:rPr>
-              <w:t xml:space="preserve"> для выбора типа создаваемой фигуры.</w:t>
+              <w:t>Форма добавления использует перечисление FigureType для выбора типа создаваемой фигуры.</w:t>
             </w:r>
           </w:p>
         </w:tc>
@@ -5612,7 +5535,6 @@
                 <w14:ligatures w14:val="none"/>
               </w:rPr>
             </w:pPr>
-            <w:proofErr w:type="spellStart"/>
             <w:r>
               <w:rPr>
                 <w:rFonts w:ascii="Calibri" w:hAnsi="Calibri" w:cs="Calibri"/>
@@ -5622,7 +5544,6 @@
               </w:rPr>
               <w:t>AddFigureForm</w:t>
             </w:r>
-            <w:proofErr w:type="spellEnd"/>
           </w:p>
         </w:tc>
         <w:tc>
@@ -5646,7 +5567,6 @@
                 <w14:ligatures w14:val="none"/>
               </w:rPr>
             </w:pPr>
-            <w:proofErr w:type="spellStart"/>
             <w:r>
               <w:rPr>
                 <w:rFonts w:ascii="Calibri" w:hAnsi="Calibri" w:cs="Calibri"/>
@@ -5656,7 +5576,6 @@
               </w:rPr>
               <w:t>FigureTypeExtensions</w:t>
             </w:r>
-            <w:proofErr w:type="spellEnd"/>
           </w:p>
         </w:tc>
         <w:tc>
@@ -5687,38 +5606,7 @@
                 <w:sz w:val="22"/>
                 <w:szCs w:val="22"/>
               </w:rPr>
-              <w:t xml:space="preserve">Форма добавления использует метод расширения </w:t>
-            </w:r>
-            <w:proofErr w:type="spellStart"/>
-            <w:proofErr w:type="gramStart"/>
-            <w:r>
-              <w:rPr>
-                <w:rFonts w:ascii="Calibri" w:hAnsi="Calibri" w:cs="Calibri"/>
-                <w:color w:val="000000"/>
-                <w:sz w:val="22"/>
-                <w:szCs w:val="22"/>
-              </w:rPr>
-              <w:t>ToDisplay</w:t>
-            </w:r>
-            <w:proofErr w:type="spellEnd"/>
-            <w:r>
-              <w:rPr>
-                <w:rFonts w:ascii="Calibri" w:hAnsi="Calibri" w:cs="Calibri"/>
-                <w:color w:val="000000"/>
-                <w:sz w:val="22"/>
-                <w:szCs w:val="22"/>
-              </w:rPr>
-              <w:t>(</w:t>
-            </w:r>
-            <w:proofErr w:type="gramEnd"/>
-            <w:r>
-              <w:rPr>
-                <w:rFonts w:ascii="Calibri" w:hAnsi="Calibri" w:cs="Calibri"/>
-                <w:color w:val="000000"/>
-                <w:sz w:val="22"/>
-                <w:szCs w:val="22"/>
-              </w:rPr>
-              <w:t>) для отображения названия типа фигуры пользователю.</w:t>
+              <w:t>Форма добавления использует метод расширения ToDisplay() для отображения названия типа фигуры пользователю.</w:t>
             </w:r>
           </w:p>
         </w:tc>
@@ -5748,7 +5636,6 @@
                 <w14:ligatures w14:val="none"/>
               </w:rPr>
             </w:pPr>
-            <w:proofErr w:type="spellStart"/>
             <w:r>
               <w:rPr>
                 <w:rFonts w:ascii="Calibri" w:hAnsi="Calibri" w:cs="Calibri"/>
@@ -5758,7 +5645,6 @@
               </w:rPr>
               <w:t>AddFigureForm</w:t>
             </w:r>
-            <w:proofErr w:type="spellEnd"/>
           </w:p>
         </w:tc>
         <w:tc>
@@ -5782,7 +5668,6 @@
                 <w14:ligatures w14:val="none"/>
               </w:rPr>
             </w:pPr>
-            <w:proofErr w:type="spellStart"/>
             <w:r>
               <w:rPr>
                 <w:rFonts w:ascii="Calibri" w:hAnsi="Calibri" w:cs="Calibri"/>
@@ -5792,7 +5677,6 @@
               </w:rPr>
               <w:t>FormatPrecision</w:t>
             </w:r>
-            <w:proofErr w:type="spellEnd"/>
           </w:p>
         </w:tc>
         <w:tc>
@@ -5851,7 +5735,6 @@
                 <w:szCs w:val="22"/>
               </w:rPr>
             </w:pPr>
-            <w:proofErr w:type="spellStart"/>
             <w:r>
               <w:rPr>
                 <w:rFonts w:ascii="Calibri" w:hAnsi="Calibri" w:cs="Calibri"/>
@@ -5861,7 +5744,6 @@
               </w:rPr>
               <w:t>FindFigureForm</w:t>
             </w:r>
-            <w:proofErr w:type="spellEnd"/>
           </w:p>
         </w:tc>
         <w:tc>
@@ -5883,7 +5765,6 @@
                 <w:szCs w:val="22"/>
               </w:rPr>
             </w:pPr>
-            <w:proofErr w:type="spellStart"/>
             <w:r>
               <w:rPr>
                 <w:rFonts w:ascii="Calibri" w:hAnsi="Calibri" w:cs="Calibri"/>
@@ -5893,7 +5774,6 @@
               </w:rPr>
               <w:t>Validator</w:t>
             </w:r>
-            <w:proofErr w:type="spellEnd"/>
           </w:p>
         </w:tc>
         <w:tc>
@@ -5922,27 +5802,7 @@
                 <w:sz w:val="22"/>
                 <w:szCs w:val="22"/>
               </w:rPr>
-              <w:t xml:space="preserve">Форма поиска использует класс </w:t>
-            </w:r>
-            <w:proofErr w:type="spellStart"/>
-            <w:r>
-              <w:rPr>
-                <w:rFonts w:ascii="Calibri" w:hAnsi="Calibri" w:cs="Calibri"/>
-                <w:color w:val="000000"/>
-                <w:sz w:val="22"/>
-                <w:szCs w:val="22"/>
-              </w:rPr>
-              <w:t>Validator</w:t>
-            </w:r>
-            <w:proofErr w:type="spellEnd"/>
-            <w:r>
-              <w:rPr>
-                <w:rFonts w:ascii="Calibri" w:hAnsi="Calibri" w:cs="Calibri"/>
-                <w:color w:val="000000"/>
-                <w:sz w:val="22"/>
-                <w:szCs w:val="22"/>
-              </w:rPr>
-              <w:t xml:space="preserve"> для проверки минимального и максимального объёма.</w:t>
+              <w:t>Форма поиска использует класс Validator для проверки минимального и максимального объёма.</w:t>
             </w:r>
           </w:p>
         </w:tc>
@@ -5970,7 +5830,6 @@
                 <w:szCs w:val="22"/>
               </w:rPr>
             </w:pPr>
-            <w:proofErr w:type="spellStart"/>
             <w:r>
               <w:rPr>
                 <w:rFonts w:ascii="Calibri" w:hAnsi="Calibri" w:cs="Calibri"/>
@@ -5980,7 +5839,6 @@
               </w:rPr>
               <w:t>FindFigureForm</w:t>
             </w:r>
-            <w:proofErr w:type="spellEnd"/>
           </w:p>
         </w:tc>
         <w:tc>
@@ -6002,7 +5860,6 @@
                 <w:szCs w:val="22"/>
               </w:rPr>
             </w:pPr>
-            <w:proofErr w:type="spellStart"/>
             <w:r>
               <w:rPr>
                 <w:rFonts w:ascii="Calibri" w:hAnsi="Calibri" w:cs="Calibri"/>
@@ -6012,7 +5869,6 @@
               </w:rPr>
               <w:t>FigureType</w:t>
             </w:r>
-            <w:proofErr w:type="spellEnd"/>
           </w:p>
         </w:tc>
         <w:tc>
@@ -6041,27 +5897,7 @@
                 <w:sz w:val="22"/>
                 <w:szCs w:val="22"/>
               </w:rPr>
-              <w:t xml:space="preserve">Форма поиска использует перечисление </w:t>
-            </w:r>
-            <w:proofErr w:type="spellStart"/>
-            <w:r>
-              <w:rPr>
-                <w:rFonts w:ascii="Calibri" w:hAnsi="Calibri" w:cs="Calibri"/>
-                <w:color w:val="000000"/>
-                <w:sz w:val="22"/>
-                <w:szCs w:val="22"/>
-              </w:rPr>
-              <w:t>FigureType</w:t>
-            </w:r>
-            <w:proofErr w:type="spellEnd"/>
-            <w:r>
-              <w:rPr>
-                <w:rFonts w:ascii="Calibri" w:hAnsi="Calibri" w:cs="Calibri"/>
-                <w:color w:val="000000"/>
-                <w:sz w:val="22"/>
-                <w:szCs w:val="22"/>
-              </w:rPr>
-              <w:t xml:space="preserve"> для фильтрации фигур по выбранному типу.</w:t>
+              <w:t>Форма поиска использует перечисление FigureType для фильтрации фигур по выбранному типу.</w:t>
             </w:r>
           </w:p>
         </w:tc>
@@ -6089,7 +5925,6 @@
                 <w:szCs w:val="22"/>
               </w:rPr>
             </w:pPr>
-            <w:proofErr w:type="spellStart"/>
             <w:r>
               <w:rPr>
                 <w:rFonts w:ascii="Calibri" w:hAnsi="Calibri" w:cs="Calibri"/>
@@ -6099,7 +5934,6 @@
               </w:rPr>
               <w:t>FindFigureForm</w:t>
             </w:r>
-            <w:proofErr w:type="spellEnd"/>
           </w:p>
         </w:tc>
         <w:tc>
@@ -6121,7 +5955,6 @@
                 <w:szCs w:val="22"/>
               </w:rPr>
             </w:pPr>
-            <w:proofErr w:type="spellStart"/>
             <w:r>
               <w:rPr>
                 <w:rFonts w:ascii="Calibri" w:hAnsi="Calibri" w:cs="Calibri"/>
@@ -6131,7 +5964,6 @@
               </w:rPr>
               <w:t>FigureTypeExtensions</w:t>
             </w:r>
-            <w:proofErr w:type="spellEnd"/>
           </w:p>
         </w:tc>
         <w:tc>
@@ -6160,38 +5992,7 @@
                 <w:sz w:val="22"/>
                 <w:szCs w:val="22"/>
               </w:rPr>
-              <w:t xml:space="preserve">Форма поиска использует метод </w:t>
-            </w:r>
-            <w:proofErr w:type="spellStart"/>
-            <w:proofErr w:type="gramStart"/>
-            <w:r>
-              <w:rPr>
-                <w:rFonts w:ascii="Calibri" w:hAnsi="Calibri" w:cs="Calibri"/>
-                <w:color w:val="000000"/>
-                <w:sz w:val="22"/>
-                <w:szCs w:val="22"/>
-              </w:rPr>
-              <w:t>ToDisplay</w:t>
-            </w:r>
-            <w:proofErr w:type="spellEnd"/>
-            <w:r>
-              <w:rPr>
-                <w:rFonts w:ascii="Calibri" w:hAnsi="Calibri" w:cs="Calibri"/>
-                <w:color w:val="000000"/>
-                <w:sz w:val="22"/>
-                <w:szCs w:val="22"/>
-              </w:rPr>
-              <w:t>(</w:t>
-            </w:r>
-            <w:proofErr w:type="gramEnd"/>
-            <w:r>
-              <w:rPr>
-                <w:rFonts w:ascii="Calibri" w:hAnsi="Calibri" w:cs="Calibri"/>
-                <w:color w:val="000000"/>
-                <w:sz w:val="22"/>
-                <w:szCs w:val="22"/>
-              </w:rPr>
-              <w:t>) для отображения названий типов фигур в выпадающем списке.</w:t>
+              <w:t>Форма поиска использует метод ToDisplay() для отображения названий типов фигур в выпадающем списке.</w:t>
             </w:r>
           </w:p>
         </w:tc>
@@ -6219,7 +6020,6 @@
                 <w:szCs w:val="22"/>
               </w:rPr>
             </w:pPr>
-            <w:proofErr w:type="spellStart"/>
             <w:r>
               <w:rPr>
                 <w:rFonts w:ascii="Calibri" w:hAnsi="Calibri" w:cs="Calibri"/>
@@ -6229,7 +6029,6 @@
               </w:rPr>
               <w:t>FindFigureForm</w:t>
             </w:r>
-            <w:proofErr w:type="spellEnd"/>
           </w:p>
         </w:tc>
         <w:tc>
@@ -6251,25 +6050,14 @@
                 <w:szCs w:val="22"/>
               </w:rPr>
             </w:pPr>
-            <w:proofErr w:type="spellStart"/>
-            <w:r>
-              <w:rPr>
-                <w:rFonts w:ascii="Calibri" w:hAnsi="Calibri" w:cs="Calibri"/>
-                <w:color w:val="000000"/>
-                <w:sz w:val="22"/>
-                <w:szCs w:val="22"/>
-              </w:rPr>
-              <w:t>ComboItem</w:t>
-            </w:r>
-            <w:proofErr w:type="spellEnd"/>
-            <w:r>
-              <w:rPr>
-                <w:rFonts w:ascii="Calibri" w:hAnsi="Calibri" w:cs="Calibri"/>
-                <w:color w:val="000000"/>
-                <w:sz w:val="22"/>
-                <w:szCs w:val="22"/>
-              </w:rPr>
-              <w:t>&lt;T&gt;</w:t>
+            <w:r>
+              <w:rPr>
+                <w:rFonts w:ascii="Calibri" w:hAnsi="Calibri" w:cs="Calibri"/>
+                <w:color w:val="000000"/>
+                <w:sz w:val="22"/>
+                <w:szCs w:val="22"/>
+              </w:rPr>
+              <w:t>ComboItem&lt;T&gt;</w:t>
             </w:r>
           </w:p>
         </w:tc>
@@ -6299,27 +6087,7 @@
                 <w:sz w:val="22"/>
                 <w:szCs w:val="22"/>
               </w:rPr>
-              <w:t xml:space="preserve">Форма поиска использует обобщённый класс </w:t>
-            </w:r>
-            <w:proofErr w:type="spellStart"/>
-            <w:r>
-              <w:rPr>
-                <w:rFonts w:ascii="Calibri" w:hAnsi="Calibri" w:cs="Calibri"/>
-                <w:color w:val="000000"/>
-                <w:sz w:val="22"/>
-                <w:szCs w:val="22"/>
-              </w:rPr>
-              <w:t>ComboItem</w:t>
-            </w:r>
-            <w:proofErr w:type="spellEnd"/>
-            <w:r>
-              <w:rPr>
-                <w:rFonts w:ascii="Calibri" w:hAnsi="Calibri" w:cs="Calibri"/>
-                <w:color w:val="000000"/>
-                <w:sz w:val="22"/>
-                <w:szCs w:val="22"/>
-              </w:rPr>
-              <w:t>&lt;T&gt; для хранения значения и отображаемого имени элемента выпадающего списка.</w:t>
+              <w:t>Форма поиска использует обобщённый класс ComboItem&lt;T&gt; для хранения значения и отображаемого имени элемента выпадающего списка.</w:t>
             </w:r>
           </w:p>
         </w:tc>
@@ -6347,7 +6115,6 @@
                 <w:szCs w:val="22"/>
               </w:rPr>
             </w:pPr>
-            <w:proofErr w:type="spellStart"/>
             <w:r>
               <w:rPr>
                 <w:rFonts w:ascii="Calibri" w:hAnsi="Calibri" w:cs="Calibri"/>
@@ -6357,7 +6124,6 @@
               </w:rPr>
               <w:t>FindFigureForm</w:t>
             </w:r>
-            <w:proofErr w:type="spellEnd"/>
           </w:p>
         </w:tc>
         <w:tc>
@@ -6379,7 +6145,6 @@
                 <w:szCs w:val="22"/>
               </w:rPr>
             </w:pPr>
-            <w:proofErr w:type="spellStart"/>
             <w:r>
               <w:rPr>
                 <w:rFonts w:ascii="Calibri" w:hAnsi="Calibri" w:cs="Calibri"/>
@@ -6389,7 +6154,6 @@
               </w:rPr>
               <w:t>FormatPrecision</w:t>
             </w:r>
-            <w:proofErr w:type="spellEnd"/>
           </w:p>
         </w:tc>
         <w:tc>
@@ -6446,7 +6210,6 @@
                 <w:szCs w:val="22"/>
               </w:rPr>
             </w:pPr>
-            <w:proofErr w:type="spellStart"/>
             <w:r>
               <w:rPr>
                 <w:rFonts w:ascii="Calibri" w:hAnsi="Calibri" w:cs="Calibri"/>
@@ -6456,7 +6219,6 @@
               </w:rPr>
               <w:t>FigureStorage</w:t>
             </w:r>
-            <w:proofErr w:type="spellEnd"/>
           </w:p>
         </w:tc>
         <w:tc>
@@ -6478,7 +6240,6 @@
                 <w:szCs w:val="22"/>
               </w:rPr>
             </w:pPr>
-            <w:proofErr w:type="spellStart"/>
             <w:r>
               <w:rPr>
                 <w:rFonts w:ascii="Calibri" w:hAnsi="Calibri" w:cs="Calibri"/>
@@ -6488,7 +6249,6 @@
               </w:rPr>
               <w:t>VolumeFigureBase</w:t>
             </w:r>
-            <w:proofErr w:type="spellEnd"/>
           </w:p>
         </w:tc>
         <w:tc>
@@ -6517,67 +6277,7 @@
                 <w:sz w:val="22"/>
                 <w:szCs w:val="22"/>
               </w:rPr>
-              <w:t xml:space="preserve">Класс </w:t>
-            </w:r>
-            <w:proofErr w:type="spellStart"/>
-            <w:r>
-              <w:rPr>
-                <w:rFonts w:ascii="Calibri" w:hAnsi="Calibri" w:cs="Calibri"/>
-                <w:color w:val="000000"/>
-                <w:sz w:val="22"/>
-                <w:szCs w:val="22"/>
-              </w:rPr>
-              <w:t>FigureStorage</w:t>
-            </w:r>
-            <w:proofErr w:type="spellEnd"/>
-            <w:r>
-              <w:rPr>
-                <w:rFonts w:ascii="Calibri" w:hAnsi="Calibri" w:cs="Calibri"/>
-                <w:color w:val="000000"/>
-                <w:sz w:val="22"/>
-                <w:szCs w:val="22"/>
-              </w:rPr>
-              <w:t xml:space="preserve"> принимает коллекцию объектов </w:t>
-            </w:r>
-            <w:proofErr w:type="spellStart"/>
-            <w:r>
-              <w:rPr>
-                <w:rFonts w:ascii="Calibri" w:hAnsi="Calibri" w:cs="Calibri"/>
-                <w:color w:val="000000"/>
-                <w:sz w:val="22"/>
-                <w:szCs w:val="22"/>
-              </w:rPr>
-              <w:t>VolumeFigureBase</w:t>
-            </w:r>
-            <w:proofErr w:type="spellEnd"/>
-            <w:r>
-              <w:rPr>
-                <w:rFonts w:ascii="Calibri" w:hAnsi="Calibri" w:cs="Calibri"/>
-                <w:color w:val="000000"/>
-                <w:sz w:val="22"/>
-                <w:szCs w:val="22"/>
-              </w:rPr>
-              <w:t xml:space="preserve"> при сохранении и возвращает список объектов </w:t>
-            </w:r>
-            <w:proofErr w:type="spellStart"/>
-            <w:r>
-              <w:rPr>
-                <w:rFonts w:ascii="Calibri" w:hAnsi="Calibri" w:cs="Calibri"/>
-                <w:color w:val="000000"/>
-                <w:sz w:val="22"/>
-                <w:szCs w:val="22"/>
-              </w:rPr>
-              <w:t>VolumeFigureBase</w:t>
-            </w:r>
-            <w:proofErr w:type="spellEnd"/>
-            <w:r>
-              <w:rPr>
-                <w:rFonts w:ascii="Calibri" w:hAnsi="Calibri" w:cs="Calibri"/>
-                <w:color w:val="000000"/>
-                <w:sz w:val="22"/>
-                <w:szCs w:val="22"/>
-              </w:rPr>
-              <w:t xml:space="preserve"> при загрузке.</w:t>
+              <w:t>Класс FigureStorage принимает коллекцию объектов VolumeFigureBase при сохранении и возвращает список объектов VolumeFigureBase при загрузке.</w:t>
             </w:r>
           </w:p>
         </w:tc>
@@ -6605,7 +6305,6 @@
                 <w:szCs w:val="22"/>
               </w:rPr>
             </w:pPr>
-            <w:proofErr w:type="spellStart"/>
             <w:r>
               <w:rPr>
                 <w:rFonts w:ascii="Calibri" w:hAnsi="Calibri" w:cs="Calibri"/>
@@ -6615,7 +6314,6 @@
               </w:rPr>
               <w:t>FigureStorage</w:t>
             </w:r>
-            <w:proofErr w:type="spellEnd"/>
           </w:p>
         </w:tc>
         <w:tc>
@@ -6637,57 +6335,15 @@
                 <w:szCs w:val="22"/>
               </w:rPr>
             </w:pPr>
-            <w:proofErr w:type="spellStart"/>
-            <w:r>
-              <w:rPr>
-                <w:rFonts w:ascii="Calibri" w:hAnsi="Calibri" w:cs="Calibri"/>
-                <w:color w:val="000000"/>
-                <w:sz w:val="22"/>
-                <w:szCs w:val="22"/>
-              </w:rPr>
-              <w:t>Sphere</w:t>
-            </w:r>
-            <w:proofErr w:type="spellEnd"/>
-            <w:r>
-              <w:rPr>
-                <w:rFonts w:ascii="Calibri" w:hAnsi="Calibri" w:cs="Calibri"/>
-                <w:color w:val="000000"/>
-                <w:sz w:val="22"/>
-                <w:szCs w:val="22"/>
-              </w:rPr>
-              <w:t xml:space="preserve">, </w:t>
-            </w:r>
-            <w:proofErr w:type="spellStart"/>
-            <w:r>
-              <w:rPr>
-                <w:rFonts w:ascii="Calibri" w:hAnsi="Calibri" w:cs="Calibri"/>
-                <w:color w:val="000000"/>
-                <w:sz w:val="22"/>
-                <w:szCs w:val="22"/>
-              </w:rPr>
-              <w:t>Pyramid</w:t>
-            </w:r>
-            <w:proofErr w:type="spellEnd"/>
-            <w:r>
-              <w:rPr>
-                <w:rFonts w:ascii="Calibri" w:hAnsi="Calibri" w:cs="Calibri"/>
-                <w:color w:val="000000"/>
-                <w:sz w:val="22"/>
-                <w:szCs w:val="22"/>
-              </w:rPr>
-              <w:t xml:space="preserve">, </w:t>
-            </w:r>
-            <w:proofErr w:type="spellStart"/>
-            <w:r>
-              <w:rPr>
-                <w:rFonts w:ascii="Calibri" w:hAnsi="Calibri" w:cs="Calibri"/>
-                <w:color w:val="000000"/>
-                <w:sz w:val="22"/>
-                <w:szCs w:val="22"/>
-              </w:rPr>
-              <w:t>Parallelepiped</w:t>
-            </w:r>
-            <w:proofErr w:type="spellEnd"/>
+            <w:r>
+              <w:rPr>
+                <w:rFonts w:ascii="Calibri" w:hAnsi="Calibri" w:cs="Calibri"/>
+                <w:color w:val="000000"/>
+                <w:sz w:val="22"/>
+                <w:szCs w:val="22"/>
+              </w:rPr>
+              <w:t>Sphere, Pyramid, Parallelepiped</w:t>
+            </w:r>
           </w:p>
         </w:tc>
         <w:tc>
@@ -6716,47 +6372,7 @@
                 <w:sz w:val="22"/>
                 <w:szCs w:val="22"/>
               </w:rPr>
-              <w:t xml:space="preserve">Класс </w:t>
-            </w:r>
-            <w:proofErr w:type="spellStart"/>
-            <w:r>
-              <w:rPr>
-                <w:rFonts w:ascii="Calibri" w:hAnsi="Calibri" w:cs="Calibri"/>
-                <w:color w:val="000000"/>
-                <w:sz w:val="22"/>
-                <w:szCs w:val="22"/>
-              </w:rPr>
-              <w:t>FigureStorage</w:t>
-            </w:r>
-            <w:proofErr w:type="spellEnd"/>
-            <w:r>
-              <w:rPr>
-                <w:rFonts w:ascii="Calibri" w:hAnsi="Calibri" w:cs="Calibri"/>
-                <w:color w:val="000000"/>
-                <w:sz w:val="22"/>
-                <w:szCs w:val="22"/>
-              </w:rPr>
-              <w:t xml:space="preserve"> преобразует конкретные объекты фигур в </w:t>
-            </w:r>
-            <w:proofErr w:type="spellStart"/>
-            <w:r>
-              <w:rPr>
-                <w:rFonts w:ascii="Calibri" w:hAnsi="Calibri" w:cs="Calibri"/>
-                <w:color w:val="000000"/>
-                <w:sz w:val="22"/>
-                <w:szCs w:val="22"/>
-              </w:rPr>
-              <w:t>сериализуемые</w:t>
-            </w:r>
-            <w:proofErr w:type="spellEnd"/>
-            <w:r>
-              <w:rPr>
-                <w:rFonts w:ascii="Calibri" w:hAnsi="Calibri" w:cs="Calibri"/>
-                <w:color w:val="000000"/>
-                <w:sz w:val="22"/>
-                <w:szCs w:val="22"/>
-              </w:rPr>
-              <w:t xml:space="preserve"> данные и восстанавливает их обратно при загрузке из файла.</w:t>
+              <w:t>Класс FigureStorage преобразует конкретные объекты фигур в сериализуемые данные и восстанавливает их обратно при загрузке из файла.</w:t>
             </w:r>
           </w:p>
         </w:tc>
@@ -6784,7 +6400,6 @@
                 <w:szCs w:val="22"/>
               </w:rPr>
             </w:pPr>
-            <w:proofErr w:type="spellStart"/>
             <w:r>
               <w:rPr>
                 <w:rFonts w:ascii="Calibri" w:hAnsi="Calibri" w:cs="Calibri"/>
@@ -6794,7 +6409,6 @@
               </w:rPr>
               <w:t>FigureStorage</w:t>
             </w:r>
-            <w:proofErr w:type="spellEnd"/>
           </w:p>
         </w:tc>
         <w:tc>
@@ -6816,7 +6430,6 @@
                 <w:szCs w:val="22"/>
               </w:rPr>
             </w:pPr>
-            <w:proofErr w:type="spellStart"/>
             <w:r>
               <w:rPr>
                 <w:rFonts w:ascii="Calibri" w:hAnsi="Calibri" w:cs="Calibri"/>
@@ -6826,7 +6439,6 @@
               </w:rPr>
               <w:t>FigureData</w:t>
             </w:r>
-            <w:proofErr w:type="spellEnd"/>
           </w:p>
         </w:tc>
         <w:tc>
@@ -6855,47 +6467,7 @@
                 <w:sz w:val="22"/>
                 <w:szCs w:val="22"/>
               </w:rPr>
-              <w:t xml:space="preserve">Класс </w:t>
-            </w:r>
-            <w:proofErr w:type="spellStart"/>
-            <w:r>
-              <w:rPr>
-                <w:rFonts w:ascii="Calibri" w:hAnsi="Calibri" w:cs="Calibri"/>
-                <w:color w:val="000000"/>
-                <w:sz w:val="22"/>
-                <w:szCs w:val="22"/>
-              </w:rPr>
-              <w:t>FigureStorage</w:t>
-            </w:r>
-            <w:proofErr w:type="spellEnd"/>
-            <w:r>
-              <w:rPr>
-                <w:rFonts w:ascii="Calibri" w:hAnsi="Calibri" w:cs="Calibri"/>
-                <w:color w:val="000000"/>
-                <w:sz w:val="22"/>
-                <w:szCs w:val="22"/>
-              </w:rPr>
-              <w:t xml:space="preserve"> использует </w:t>
-            </w:r>
-            <w:proofErr w:type="spellStart"/>
-            <w:r>
-              <w:rPr>
-                <w:rFonts w:ascii="Calibri" w:hAnsi="Calibri" w:cs="Calibri"/>
-                <w:color w:val="000000"/>
-                <w:sz w:val="22"/>
-                <w:szCs w:val="22"/>
-              </w:rPr>
-              <w:t>FigureData</w:t>
-            </w:r>
-            <w:proofErr w:type="spellEnd"/>
-            <w:r>
-              <w:rPr>
-                <w:rFonts w:ascii="Calibri" w:hAnsi="Calibri" w:cs="Calibri"/>
-                <w:color w:val="000000"/>
-                <w:sz w:val="22"/>
-                <w:szCs w:val="22"/>
-              </w:rPr>
-              <w:t xml:space="preserve"> как промежуточную структуру для хранения параметров одной фигуры.</w:t>
+              <w:t>Класс FigureStorage использует FigureData как промежуточную структуру для хранения параметров одной фигуры.</w:t>
             </w:r>
           </w:p>
         </w:tc>
@@ -6923,7 +6495,6 @@
                 <w:szCs w:val="22"/>
               </w:rPr>
             </w:pPr>
-            <w:proofErr w:type="spellStart"/>
             <w:r>
               <w:rPr>
                 <w:rFonts w:ascii="Calibri" w:hAnsi="Calibri" w:cs="Calibri"/>
@@ -6933,7 +6504,6 @@
               </w:rPr>
               <w:t>FigureStorage</w:t>
             </w:r>
-            <w:proofErr w:type="spellEnd"/>
           </w:p>
         </w:tc>
         <w:tc>
@@ -6955,7 +6525,6 @@
                 <w:szCs w:val="22"/>
               </w:rPr>
             </w:pPr>
-            <w:proofErr w:type="spellStart"/>
             <w:r>
               <w:rPr>
                 <w:rFonts w:ascii="Calibri" w:hAnsi="Calibri" w:cs="Calibri"/>
@@ -6965,7 +6534,6 @@
               </w:rPr>
               <w:t>FiguresFileData</w:t>
             </w:r>
-            <w:proofErr w:type="spellEnd"/>
           </w:p>
         </w:tc>
         <w:tc>
@@ -6994,67 +6562,7 @@
                 <w:sz w:val="22"/>
                 <w:szCs w:val="22"/>
               </w:rPr>
-              <w:t xml:space="preserve">Класс </w:t>
-            </w:r>
-            <w:proofErr w:type="spellStart"/>
-            <w:r>
-              <w:rPr>
-                <w:rFonts w:ascii="Calibri" w:hAnsi="Calibri" w:cs="Calibri"/>
-                <w:color w:val="000000"/>
-                <w:sz w:val="22"/>
-                <w:szCs w:val="22"/>
-              </w:rPr>
-              <w:t>FigureStorage</w:t>
-            </w:r>
-            <w:proofErr w:type="spellEnd"/>
-            <w:r>
-              <w:rPr>
-                <w:rFonts w:ascii="Calibri" w:hAnsi="Calibri" w:cs="Calibri"/>
-                <w:color w:val="000000"/>
-                <w:sz w:val="22"/>
-                <w:szCs w:val="22"/>
-              </w:rPr>
-              <w:t xml:space="preserve"> использует </w:t>
-            </w:r>
-            <w:proofErr w:type="spellStart"/>
-            <w:r>
-              <w:rPr>
-                <w:rFonts w:ascii="Calibri" w:hAnsi="Calibri" w:cs="Calibri"/>
-                <w:color w:val="000000"/>
-                <w:sz w:val="22"/>
-                <w:szCs w:val="22"/>
-              </w:rPr>
-              <w:t>FiguresFileData</w:t>
-            </w:r>
-            <w:proofErr w:type="spellEnd"/>
-            <w:r>
-              <w:rPr>
-                <w:rFonts w:ascii="Calibri" w:hAnsi="Calibri" w:cs="Calibri"/>
-                <w:color w:val="000000"/>
-                <w:sz w:val="22"/>
-                <w:szCs w:val="22"/>
-              </w:rPr>
-              <w:t xml:space="preserve"> как корневой объект файла, содержащий список </w:t>
-            </w:r>
-            <w:proofErr w:type="spellStart"/>
-            <w:r>
-              <w:rPr>
-                <w:rFonts w:ascii="Calibri" w:hAnsi="Calibri" w:cs="Calibri"/>
-                <w:color w:val="000000"/>
-                <w:sz w:val="22"/>
-                <w:szCs w:val="22"/>
-              </w:rPr>
-              <w:t>сериализуемых</w:t>
-            </w:r>
-            <w:proofErr w:type="spellEnd"/>
-            <w:r>
-              <w:rPr>
-                <w:rFonts w:ascii="Calibri" w:hAnsi="Calibri" w:cs="Calibri"/>
-                <w:color w:val="000000"/>
-                <w:sz w:val="22"/>
-                <w:szCs w:val="22"/>
-              </w:rPr>
-              <w:t xml:space="preserve"> фигур.</w:t>
+              <w:t>Класс FigureStorage использует FiguresFileData как корневой объект файла, содержащий список сериализуемых фигур.</w:t>
             </w:r>
           </w:p>
         </w:tc>
@@ -7082,7 +6590,6 @@
                 <w:szCs w:val="22"/>
               </w:rPr>
             </w:pPr>
-            <w:proofErr w:type="spellStart"/>
             <w:r>
               <w:rPr>
                 <w:rFonts w:ascii="Calibri" w:hAnsi="Calibri" w:cs="Calibri"/>
@@ -7092,7 +6599,6 @@
               </w:rPr>
               <w:t>FigureData</w:t>
             </w:r>
-            <w:proofErr w:type="spellEnd"/>
           </w:p>
         </w:tc>
         <w:tc>
@@ -7114,7 +6620,6 @@
                 <w:szCs w:val="22"/>
               </w:rPr>
             </w:pPr>
-            <w:proofErr w:type="spellStart"/>
             <w:r>
               <w:rPr>
                 <w:rFonts w:ascii="Calibri" w:hAnsi="Calibri" w:cs="Calibri"/>
@@ -7124,7 +6629,6 @@
               </w:rPr>
               <w:t>FigureType</w:t>
             </w:r>
-            <w:proofErr w:type="spellEnd"/>
           </w:p>
         </w:tc>
         <w:tc>
@@ -7146,7 +6650,6 @@
                 <w:szCs w:val="22"/>
               </w:rPr>
             </w:pPr>
-            <w:proofErr w:type="spellStart"/>
             <w:r>
               <w:rPr>
                 <w:rFonts w:ascii="Calibri" w:hAnsi="Calibri" w:cs="Calibri"/>
@@ -7156,7 +6659,6 @@
               </w:rPr>
               <w:t>FigureData</w:t>
             </w:r>
-            <w:proofErr w:type="spellEnd"/>
           </w:p>
         </w:tc>
       </w:tr>
@@ -7183,7 +6685,6 @@
                 <w:szCs w:val="22"/>
               </w:rPr>
             </w:pPr>
-            <w:proofErr w:type="spellStart"/>
             <w:r>
               <w:rPr>
                 <w:rFonts w:ascii="Calibri" w:hAnsi="Calibri" w:cs="Calibri"/>
@@ -7193,7 +6694,6 @@
               </w:rPr>
               <w:t>FigureTypeExtensions</w:t>
             </w:r>
-            <w:proofErr w:type="spellEnd"/>
           </w:p>
         </w:tc>
         <w:tc>
@@ -7215,7 +6715,6 @@
                 <w:szCs w:val="22"/>
               </w:rPr>
             </w:pPr>
-            <w:proofErr w:type="spellStart"/>
             <w:r>
               <w:rPr>
                 <w:rFonts w:ascii="Calibri" w:hAnsi="Calibri" w:cs="Calibri"/>
@@ -7225,7 +6724,6 @@
               </w:rPr>
               <w:t>FigureType</w:t>
             </w:r>
-            <w:proofErr w:type="spellEnd"/>
           </w:p>
         </w:tc>
         <w:tc>
@@ -7247,7 +6745,6 @@
                 <w:szCs w:val="22"/>
               </w:rPr>
             </w:pPr>
-            <w:proofErr w:type="spellStart"/>
             <w:r>
               <w:rPr>
                 <w:rFonts w:ascii="Calibri" w:hAnsi="Calibri" w:cs="Calibri"/>
@@ -7257,7 +6754,6 @@
               </w:rPr>
               <w:t>FigureTypeExtensions</w:t>
             </w:r>
-            <w:proofErr w:type="spellEnd"/>
           </w:p>
         </w:tc>
       </w:tr>
@@ -7291,35 +6787,13 @@
           <w:lang w:val="en-US"/>
         </w:rPr>
       </w:pPr>
-      <w:bookmarkStart w:id="8" w:name="_Toc232152819"/>
-      <w:proofErr w:type="spellStart"/>
+      <w:bookmarkStart w:id="7" w:name="_Toc232158917"/>
       <w:r>
         <w:rPr>
           <w:lang w:val="en-US"/>
         </w:rPr>
         <w:lastRenderedPageBreak/>
-        <w:t>Дерево</w:t>
-      </w:r>
-      <w:proofErr w:type="spellEnd"/>
-      <w:r>
-        <w:rPr>
-          <w:lang w:val="en-US"/>
-        </w:rPr>
-        <w:t xml:space="preserve"> </w:t>
-      </w:r>
-      <w:proofErr w:type="spellStart"/>
-      <w:r>
-        <w:rPr>
-          <w:lang w:val="en-US"/>
-        </w:rPr>
-        <w:t>ветвлений</w:t>
-      </w:r>
-      <w:proofErr w:type="spellEnd"/>
-      <w:r>
-        <w:rPr>
-          <w:lang w:val="en-US"/>
-        </w:rPr>
-        <w:t xml:space="preserve"> </w:t>
+        <w:t xml:space="preserve">Дерево ветвлений </w:t>
       </w:r>
       <w:r>
         <w:rPr>
@@ -7327,7 +6801,7 @@
         </w:rPr>
         <w:t>Git</w:t>
       </w:r>
-      <w:bookmarkEnd w:id="8"/>
+      <w:bookmarkEnd w:id="7"/>
     </w:p>
     <w:p>
       <w:pPr>
@@ -7382,25 +6856,24 @@
       <w:r>
         <w:t xml:space="preserve">Рисунок </w:t>
       </w:r>
-      <w:fldSimple w:instr=" STYLEREF 1 \s ">
-        <w:r>
-          <w:rPr>
-            <w:noProof/>
-          </w:rPr>
-          <w:t>4</w:t>
-        </w:r>
-      </w:fldSimple>
-      <w:r>
-        <w:t>.</w:t>
-      </w:r>
-      <w:fldSimple w:instr=" SEQ Рисунок \* ARABIC \s 1 ">
-        <w:r>
-          <w:rPr>
-            <w:noProof/>
-          </w:rPr>
-          <w:t>1</w:t>
-        </w:r>
-      </w:fldSimple>
+      <w:r>
+        <w:fldChar w:fldCharType="begin"/>
+      </w:r>
+      <w:r>
+        <w:instrText xml:space="preserve"> SEQ Рисунок \* ARABIC </w:instrText>
+      </w:r>
+      <w:r>
+        <w:fldChar w:fldCharType="separate"/>
+      </w:r>
+      <w:r>
+        <w:rPr>
+          <w:noProof/>
+        </w:rPr>
+        <w:t>3</w:t>
+      </w:r>
+      <w:r>
+        <w:fldChar w:fldCharType="end"/>
+      </w:r>
       <w:r>
         <w:t xml:space="preserve"> – </w:t>
       </w:r>
@@ -7429,9 +6902,16 @@
         <w:t>»</w:t>
       </w:r>
     </w:p>
-    <w:p/>
-    <w:p/>
-    <w:p/>
+    <w:p>
+      <w:pPr>
+        <w:pStyle w:val="aff"/>
+      </w:pPr>
+    </w:p>
+    <w:p>
+      <w:pPr>
+        <w:pStyle w:val="aff"/>
+      </w:pPr>
+    </w:p>
     <w:p>
       <w:pPr>
         <w:pStyle w:val="1"/>
@@ -7441,60 +6921,23 @@
         </w:numPr>
         <w:spacing w:after="120"/>
         <w:jc w:val="center"/>
-      </w:pPr>
-      <w:bookmarkStart w:id="9" w:name="_Toc232152820"/>
-      <w:proofErr w:type="spellStart"/>
-      <w:r>
         <w:rPr>
           <w:lang w:val="en-US"/>
         </w:rPr>
-        <w:lastRenderedPageBreak/>
-        <w:t>Функциональное</w:t>
-      </w:r>
-      <w:proofErr w:type="spellEnd"/>
+      </w:pPr>
+      <w:bookmarkStart w:id="8" w:name="_Toc232158918"/>
       <w:r>
         <w:rPr>
           <w:lang w:val="en-US"/>
         </w:rPr>
-        <w:t xml:space="preserve"> </w:t>
-      </w:r>
-      <w:proofErr w:type="spellStart"/>
-      <w:r>
-        <w:rPr>
-          <w:lang w:val="en-US"/>
-        </w:rPr>
-        <w:t>тестирование</w:t>
-      </w:r>
-      <w:proofErr w:type="spellEnd"/>
-      <w:r>
-        <w:rPr>
-          <w:lang w:val="en-US"/>
-        </w:rPr>
-        <w:t xml:space="preserve"> </w:t>
-      </w:r>
-      <w:proofErr w:type="spellStart"/>
-      <w:r>
-        <w:rPr>
-          <w:lang w:val="en-US"/>
-        </w:rPr>
-        <w:t>разработанной</w:t>
-      </w:r>
-      <w:proofErr w:type="spellEnd"/>
-      <w:r>
-        <w:rPr>
-          <w:lang w:val="en-US"/>
-        </w:rPr>
-        <w:t xml:space="preserve"> </w:t>
-      </w:r>
-      <w:proofErr w:type="spellStart"/>
-      <w:r>
-        <w:rPr>
-          <w:lang w:val="en-US"/>
-        </w:rPr>
-        <w:t>программы</w:t>
-      </w:r>
-      <w:bookmarkEnd w:id="9"/>
-      <w:proofErr w:type="spellEnd"/>
+        <w:t>Функциональное тестирование разработанной программы</w:t>
+      </w:r>
+      <w:bookmarkEnd w:id="8"/>
+    </w:p>
+    <w:p>
+      <w:r>
+        <w:t>В данном разделе будет проведено функциональное тестирование разработанной программы.</w:t>
+      </w:r>
     </w:p>
     <w:p>
       <w:pPr>
@@ -7540,13 +6983,78 @@
     </w:p>
     <w:p>
       <w:pPr>
-        <w:pStyle w:val="af9"/>
-      </w:pPr>
+        <w:pStyle w:val="aff"/>
+      </w:pPr>
+      <w:r>
+        <w:t xml:space="preserve">Рисунок </w:t>
+      </w:r>
+      <w:r>
+        <w:fldChar w:fldCharType="begin"/>
+      </w:r>
+      <w:r>
+        <w:instrText xml:space="preserve"> SEQ Рисунок \* ARABIC </w:instrText>
+      </w:r>
+      <w:r>
+        <w:fldChar w:fldCharType="separate"/>
+      </w:r>
+      <w:r>
+        <w:rPr>
+          <w:noProof/>
+        </w:rPr>
+        <w:t>4</w:t>
+      </w:r>
+      <w:r>
+        <w:fldChar w:fldCharType="end"/>
+      </w:r>
+      <w:r>
+        <w:t xml:space="preserve"> – </w:t>
+      </w:r>
+      <w:r>
+        <w:t>Главное окно программы "</w:t>
+      </w:r>
+      <w:r>
+        <w:rPr>
+          <w:lang w:val="en-US"/>
+        </w:rPr>
+        <w:t>RusWin</w:t>
+      </w:r>
+      <w:r>
+        <w:t xml:space="preserve">3 </w:t>
+      </w:r>
+      <w:r>
+        <w:rPr>
+          <w:lang w:val="en-US"/>
+        </w:rPr>
+        <w:t>Volume</w:t>
+      </w:r>
+      <w:r>
+        <w:t xml:space="preserve"> </w:t>
+      </w:r>
+      <w:r>
+        <w:rPr>
+          <w:lang w:val="en-US"/>
+        </w:rPr>
+        <w:t>edition</w:t>
+      </w:r>
+      <w:r>
+        <w:t>"</w:t>
+      </w:r>
     </w:p>
+    <w:p/>
     <w:p>
       <w:pPr>
-        <w:pStyle w:val="af9"/>
-      </w:pPr>
+        <w:pStyle w:val="2"/>
+        <w:numPr>
+          <w:ilvl w:val="1"/>
+          <w:numId w:val="27"/>
+        </w:numPr>
+      </w:pPr>
+      <w:bookmarkStart w:id="9" w:name="_Toc232158919"/>
+      <w:r>
+        <w:lastRenderedPageBreak/>
+        <w:t>Тестовые случаи добавления новых фигур</w:t>
+      </w:r>
+      <w:bookmarkEnd w:id="9"/>
     </w:p>
     <w:p>
       <w:pPr>
@@ -7597,14 +7105,53 @@
     </w:p>
     <w:p>
       <w:pPr>
+        <w:pStyle w:val="aff"/>
+      </w:pPr>
+      <w:r>
+        <w:t>1 – Выбор типа фигуры; 2 – поле ввода исходных данных для выбранной фигуры</w:t>
+      </w:r>
+    </w:p>
+    <w:p>
+      <w:pPr>
+        <w:pStyle w:val="aff"/>
+      </w:pPr>
+      <w:r>
+        <w:t xml:space="preserve">Рисунок </w:t>
+      </w:r>
+      <w:r>
+        <w:fldChar w:fldCharType="begin"/>
+      </w:r>
+      <w:r>
+        <w:instrText xml:space="preserve"> SEQ Рисунок \* ARABIC </w:instrText>
+      </w:r>
+      <w:r>
+        <w:fldChar w:fldCharType="separate"/>
+      </w:r>
+      <w:r>
+        <w:rPr>
+          <w:noProof/>
+        </w:rPr>
+        <w:t>5</w:t>
+      </w:r>
+      <w:r>
+        <w:fldChar w:fldCharType="end"/>
+      </w:r>
+      <w:r>
+        <w:t xml:space="preserve"> – Добавление фигуры</w:t>
+      </w:r>
+      <w:r>
+        <w:t xml:space="preserve"> «Сфера»</w:t>
+      </w:r>
+    </w:p>
+    <w:p>
+      <w:pPr>
         <w:pStyle w:val="af9"/>
       </w:pPr>
       <w:r>
-        <w:lastRenderedPageBreak/>
         <w:drawing>
-          <wp:inline distT="0" distB="0" distL="0" distR="0" wp14:anchorId="290915A9" wp14:editId="5C90CB89">
-            <wp:extent cx="3581400" cy="2409825"/>
-            <wp:effectExtent l="0" t="0" r="0" b="9525"/>
+          <wp:inline distT="0" distB="0" distL="0" distR="0" wp14:anchorId="290915A9" wp14:editId="766F2896">
+            <wp:extent cx="3205072" cy="2156604"/>
+            <wp:effectExtent l="0" t="0" r="0" b="0"/>
             <wp:docPr id="264841745" name="Рисунок 1"/>
             <wp:cNvGraphicFramePr>
               <a:graphicFrameLocks xmlns:a="http://schemas.openxmlformats.org/drawingml/2006/main" noChangeAspect="1"/>
@@ -7625,7 +7172,7 @@
                   <pic:spPr>
                     <a:xfrm>
                       <a:off x="0" y="0"/>
-                      <a:ext cx="3581400" cy="2409825"/>
+                      <a:ext cx="3209631" cy="2159672"/>
                     </a:xfrm>
                     <a:prstGeom prst="rect">
                       <a:avLst/>
@@ -7640,13 +7187,45 @@
     </w:p>
     <w:p>
       <w:pPr>
+        <w:pStyle w:val="aff"/>
+      </w:pPr>
+      <w:r>
+        <w:t xml:space="preserve">Рисунок </w:t>
+      </w:r>
+      <w:r>
+        <w:fldChar w:fldCharType="begin"/>
+      </w:r>
+      <w:r>
+        <w:instrText xml:space="preserve"> SEQ Рисунок \* ARABIC </w:instrText>
+      </w:r>
+      <w:r>
+        <w:fldChar w:fldCharType="separate"/>
+      </w:r>
+      <w:r>
+        <w:rPr>
+          <w:noProof/>
+        </w:rPr>
+        <w:t>6</w:t>
+      </w:r>
+      <w:r>
+        <w:fldChar w:fldCharType="end"/>
+      </w:r>
+      <w:r>
+        <w:t xml:space="preserve"> – Добавление фигуры</w:t>
+      </w:r>
+      <w:r>
+        <w:t xml:space="preserve"> «Пирамида»</w:t>
+      </w:r>
+    </w:p>
+    <w:p>
+      <w:pPr>
         <w:pStyle w:val="af9"/>
       </w:pPr>
       <w:r>
         <w:drawing>
-          <wp:inline distT="0" distB="0" distL="0" distR="0" wp14:anchorId="1AEFB08F" wp14:editId="785522F4">
-            <wp:extent cx="3552825" cy="2390775"/>
-            <wp:effectExtent l="0" t="0" r="9525" b="9525"/>
+          <wp:inline distT="0" distB="0" distL="0" distR="0" wp14:anchorId="1AEFB08F" wp14:editId="46E121CB">
+            <wp:extent cx="3318115" cy="2232833"/>
+            <wp:effectExtent l="0" t="0" r="0" b="0"/>
             <wp:docPr id="803796433" name="Рисунок 1"/>
             <wp:cNvGraphicFramePr>
               <a:graphicFrameLocks xmlns:a="http://schemas.openxmlformats.org/drawingml/2006/main" noChangeAspect="1"/>
@@ -7667,7 +7246,7 @@
                   <pic:spPr>
                     <a:xfrm>
                       <a:off x="0" y="0"/>
-                      <a:ext cx="3552825" cy="2390775"/>
+                      <a:ext cx="3320427" cy="2234389"/>
                     </a:xfrm>
                     <a:prstGeom prst="rect">
                       <a:avLst/>
@@ -7678,6 +7257,253 @@
             </a:graphic>
           </wp:inline>
         </w:drawing>
+      </w:r>
+    </w:p>
+    <w:p>
+      <w:pPr>
+        <w:pStyle w:val="aff"/>
+      </w:pPr>
+      <w:r>
+        <w:t xml:space="preserve">Рисунок </w:t>
+      </w:r>
+      <w:r>
+        <w:fldChar w:fldCharType="begin"/>
+      </w:r>
+      <w:r>
+        <w:instrText xml:space="preserve"> SEQ Рисунок \* ARABIC </w:instrText>
+      </w:r>
+      <w:r>
+        <w:fldChar w:fldCharType="separate"/>
+      </w:r>
+      <w:r>
+        <w:rPr>
+          <w:noProof/>
+        </w:rPr>
+        <w:t>7</w:t>
+      </w:r>
+      <w:r>
+        <w:fldChar w:fldCharType="end"/>
+      </w:r>
+      <w:r>
+        <w:t xml:space="preserve"> – Добавление фигуры</w:t>
+      </w:r>
+      <w:r>
+        <w:t xml:space="preserve"> «Параллелепипед»</w:t>
+      </w:r>
+    </w:p>
+    <w:p>
+      <w:pPr>
+        <w:pStyle w:val="af9"/>
+      </w:pPr>
+      <w:r>
+        <w:lastRenderedPageBreak/>
+        <w:drawing>
+          <wp:inline distT="0" distB="0" distL="0" distR="0" wp14:anchorId="4E29749F" wp14:editId="09137AA7">
+            <wp:extent cx="3548768" cy="2527540"/>
+            <wp:effectExtent l="0" t="0" r="0" b="6350"/>
+            <wp:docPr id="872089082" name="Рисунок 1"/>
+            <wp:cNvGraphicFramePr>
+              <a:graphicFrameLocks xmlns:a="http://schemas.openxmlformats.org/drawingml/2006/main" noChangeAspect="1"/>
+            </wp:cNvGraphicFramePr>
+            <a:graphic xmlns:a="http://schemas.openxmlformats.org/drawingml/2006/main">
+              <a:graphicData uri="http://schemas.openxmlformats.org/drawingml/2006/picture">
+                <pic:pic xmlns:pic="http://schemas.openxmlformats.org/drawingml/2006/picture">
+                  <pic:nvPicPr>
+                    <pic:cNvPr id="872089082" name=""/>
+                    <pic:cNvPicPr/>
+                  </pic:nvPicPr>
+                  <pic:blipFill>
+                    <a:blip r:embed="rId16"/>
+                    <a:stretch>
+                      <a:fillRect/>
+                    </a:stretch>
+                  </pic:blipFill>
+                  <pic:spPr>
+                    <a:xfrm>
+                      <a:off x="0" y="0"/>
+                      <a:ext cx="3554626" cy="2531712"/>
+                    </a:xfrm>
+                    <a:prstGeom prst="rect">
+                      <a:avLst/>
+                    </a:prstGeom>
+                  </pic:spPr>
+                </pic:pic>
+              </a:graphicData>
+            </a:graphic>
+          </wp:inline>
+        </w:drawing>
+      </w:r>
+    </w:p>
+    <w:p>
+      <w:pPr>
+        <w:pStyle w:val="aff"/>
+      </w:pPr>
+      <w:r>
+        <w:t xml:space="preserve">Рисунок </w:t>
+      </w:r>
+      <w:r>
+        <w:fldChar w:fldCharType="begin"/>
+      </w:r>
+      <w:r>
+        <w:instrText xml:space="preserve"> SEQ Рисунок \* ARABIC </w:instrText>
+      </w:r>
+      <w:r>
+        <w:fldChar w:fldCharType="separate"/>
+      </w:r>
+      <w:r>
+        <w:rPr>
+          <w:noProof/>
+        </w:rPr>
+        <w:t>8</w:t>
+      </w:r>
+      <w:r>
+        <w:fldChar w:fldCharType="end"/>
+      </w:r>
+      <w:r>
+        <w:t xml:space="preserve"> – Ошибка при добавлении</w:t>
+      </w:r>
+    </w:p>
+    <w:p>
+      <w:pPr>
+        <w:pStyle w:val="af9"/>
+      </w:pPr>
+      <w:r>
+        <w:drawing>
+          <wp:inline distT="0" distB="0" distL="0" distR="0" wp14:anchorId="6C3E2AAB" wp14:editId="3DC2A096">
+            <wp:extent cx="3609756" cy="3053751"/>
+            <wp:effectExtent l="0" t="0" r="0" b="0"/>
+            <wp:docPr id="2109599408" name="Рисунок 1"/>
+            <wp:cNvGraphicFramePr>
+              <a:graphicFrameLocks xmlns:a="http://schemas.openxmlformats.org/drawingml/2006/main" noChangeAspect="1"/>
+            </wp:cNvGraphicFramePr>
+            <a:graphic xmlns:a="http://schemas.openxmlformats.org/drawingml/2006/main">
+              <a:graphicData uri="http://schemas.openxmlformats.org/drawingml/2006/picture">
+                <pic:pic xmlns:pic="http://schemas.openxmlformats.org/drawingml/2006/picture">
+                  <pic:nvPicPr>
+                    <pic:cNvPr id="2109599408" name=""/>
+                    <pic:cNvPicPr/>
+                  </pic:nvPicPr>
+                  <pic:blipFill>
+                    <a:blip r:embed="rId17"/>
+                    <a:stretch>
+                      <a:fillRect/>
+                    </a:stretch>
+                  </pic:blipFill>
+                  <pic:spPr>
+                    <a:xfrm>
+                      <a:off x="0" y="0"/>
+                      <a:ext cx="3614676" cy="3057913"/>
+                    </a:xfrm>
+                    <a:prstGeom prst="rect">
+                      <a:avLst/>
+                    </a:prstGeom>
+                  </pic:spPr>
+                </pic:pic>
+              </a:graphicData>
+            </a:graphic>
+          </wp:inline>
+        </w:drawing>
+      </w:r>
+    </w:p>
+    <w:p>
+      <w:pPr>
+        <w:pStyle w:val="aff"/>
+      </w:pPr>
+      <w:r>
+        <w:t xml:space="preserve">Рисунок </w:t>
+      </w:r>
+      <w:r>
+        <w:fldChar w:fldCharType="begin"/>
+      </w:r>
+      <w:r>
+        <w:instrText xml:space="preserve"> SEQ Рисунок \* ARABIC </w:instrText>
+      </w:r>
+      <w:r>
+        <w:fldChar w:fldCharType="separate"/>
+      </w:r>
+      <w:r>
+        <w:rPr>
+          <w:noProof/>
+        </w:rPr>
+        <w:t>9</w:t>
+      </w:r>
+      <w:r>
+        <w:fldChar w:fldCharType="end"/>
+      </w:r>
+      <w:r>
+        <w:t xml:space="preserve"> – Ошибка при добавлении</w:t>
+      </w:r>
+    </w:p>
+    <w:p>
+      <w:pPr>
+        <w:pStyle w:val="af9"/>
+      </w:pPr>
+      <w:r>
+        <w:lastRenderedPageBreak/>
+        <w:drawing>
+          <wp:inline distT="0" distB="0" distL="0" distR="0" wp14:anchorId="6B845DF7" wp14:editId="7116E25B">
+            <wp:extent cx="3493698" cy="2846410"/>
+            <wp:effectExtent l="0" t="0" r="0" b="0"/>
+            <wp:docPr id="201311686" name="Рисунок 1"/>
+            <wp:cNvGraphicFramePr>
+              <a:graphicFrameLocks xmlns:a="http://schemas.openxmlformats.org/drawingml/2006/main" noChangeAspect="1"/>
+            </wp:cNvGraphicFramePr>
+            <a:graphic xmlns:a="http://schemas.openxmlformats.org/drawingml/2006/main">
+              <a:graphicData uri="http://schemas.openxmlformats.org/drawingml/2006/picture">
+                <pic:pic xmlns:pic="http://schemas.openxmlformats.org/drawingml/2006/picture">
+                  <pic:nvPicPr>
+                    <pic:cNvPr id="201311686" name=""/>
+                    <pic:cNvPicPr/>
+                  </pic:nvPicPr>
+                  <pic:blipFill>
+                    <a:blip r:embed="rId18"/>
+                    <a:stretch>
+                      <a:fillRect/>
+                    </a:stretch>
+                  </pic:blipFill>
+                  <pic:spPr>
+                    <a:xfrm>
+                      <a:off x="0" y="0"/>
+                      <a:ext cx="3500680" cy="2852099"/>
+                    </a:xfrm>
+                    <a:prstGeom prst="rect">
+                      <a:avLst/>
+                    </a:prstGeom>
+                  </pic:spPr>
+                </pic:pic>
+              </a:graphicData>
+            </a:graphic>
+          </wp:inline>
+        </w:drawing>
+      </w:r>
+    </w:p>
+    <w:p>
+      <w:pPr>
+        <w:pStyle w:val="aff"/>
+      </w:pPr>
+      <w:r>
+        <w:t xml:space="preserve">Рисунок </w:t>
+      </w:r>
+      <w:r>
+        <w:fldChar w:fldCharType="begin"/>
+      </w:r>
+      <w:r>
+        <w:instrText xml:space="preserve"> SEQ Рисунок \* ARABIC </w:instrText>
+      </w:r>
+      <w:r>
+        <w:fldChar w:fldCharType="separate"/>
+      </w:r>
+      <w:r>
+        <w:rPr>
+          <w:noProof/>
+        </w:rPr>
+        <w:t>10</w:t>
+      </w:r>
+      <w:r>
+        <w:fldChar w:fldCharType="end"/>
+      </w:r>
+      <w:r>
+        <w:t xml:space="preserve"> – Ошибка при добавлении</w:t>
       </w:r>
     </w:p>
     <w:p>
@@ -7706,7 +7532,7 @@
                     <pic:cNvPicPr/>
                   </pic:nvPicPr>
                   <pic:blipFill>
-                    <a:blip r:embed="rId16"/>
+                    <a:blip r:embed="rId19"/>
                     <a:stretch>
                       <a:fillRect/>
                     </a:stretch>
@@ -7729,151 +7555,51 @@
     </w:p>
     <w:p>
       <w:pPr>
-        <w:pStyle w:val="af9"/>
-      </w:pPr>
+        <w:pStyle w:val="aff"/>
+      </w:pPr>
+      <w:r>
+        <w:t xml:space="preserve">Рисунок </w:t>
+      </w:r>
+      <w:r>
+        <w:fldChar w:fldCharType="begin"/>
+      </w:r>
+      <w:r>
+        <w:instrText xml:space="preserve"> SEQ Рисунок \* ARABIC </w:instrText>
+      </w:r>
+      <w:r>
+        <w:fldChar w:fldCharType="separate"/>
+      </w:r>
+      <w:r>
+        <w:rPr>
+          <w:noProof/>
+        </w:rPr>
+        <w:t>11</w:t>
+      </w:r>
+      <w:r>
+        <w:fldChar w:fldCharType="end"/>
+      </w:r>
+      <w:r>
+        <w:t xml:space="preserve"> – Результат добавления фигур</w:t>
+      </w:r>
     </w:p>
     <w:p>
       <w:pPr>
-        <w:pStyle w:val="af9"/>
+        <w:pStyle w:val="aff"/>
       </w:pPr>
     </w:p>
     <w:p>
       <w:pPr>
-        <w:pStyle w:val="af9"/>
-      </w:pPr>
-      <w:r>
-        <w:lastRenderedPageBreak/>
-        <w:drawing>
-          <wp:inline distT="0" distB="0" distL="0" distR="0" wp14:anchorId="732DCADD" wp14:editId="3ECC6B0F">
-            <wp:extent cx="3971925" cy="2828925"/>
-            <wp:effectExtent l="0" t="0" r="9525" b="9525"/>
-            <wp:docPr id="872089082" name="Рисунок 1"/>
-            <wp:cNvGraphicFramePr>
-              <a:graphicFrameLocks xmlns:a="http://schemas.openxmlformats.org/drawingml/2006/main" noChangeAspect="1"/>
-            </wp:cNvGraphicFramePr>
-            <a:graphic xmlns:a="http://schemas.openxmlformats.org/drawingml/2006/main">
-              <a:graphicData uri="http://schemas.openxmlformats.org/drawingml/2006/picture">
-                <pic:pic xmlns:pic="http://schemas.openxmlformats.org/drawingml/2006/picture">
-                  <pic:nvPicPr>
-                    <pic:cNvPr id="872089082" name=""/>
-                    <pic:cNvPicPr/>
-                  </pic:nvPicPr>
-                  <pic:blipFill>
-                    <a:blip r:embed="rId17"/>
-                    <a:stretch>
-                      <a:fillRect/>
-                    </a:stretch>
-                  </pic:blipFill>
-                  <pic:spPr>
-                    <a:xfrm>
-                      <a:off x="0" y="0"/>
-                      <a:ext cx="3971925" cy="2828925"/>
-                    </a:xfrm>
-                    <a:prstGeom prst="rect">
-                      <a:avLst/>
-                    </a:prstGeom>
-                  </pic:spPr>
-                </pic:pic>
-              </a:graphicData>
-            </a:graphic>
-          </wp:inline>
-        </w:drawing>
-      </w:r>
-    </w:p>
-    <w:p>
-      <w:pPr>
-        <w:pStyle w:val="af9"/>
-      </w:pPr>
-    </w:p>
-    <w:p>
-      <w:pPr>
-        <w:pStyle w:val="af9"/>
-      </w:pPr>
-      <w:r>
-        <w:drawing>
-          <wp:inline distT="0" distB="0" distL="0" distR="0" wp14:anchorId="2332DF10" wp14:editId="71A44040">
-            <wp:extent cx="4019550" cy="3400425"/>
-            <wp:effectExtent l="0" t="0" r="0" b="9525"/>
-            <wp:docPr id="2109599408" name="Рисунок 1"/>
-            <wp:cNvGraphicFramePr>
-              <a:graphicFrameLocks xmlns:a="http://schemas.openxmlformats.org/drawingml/2006/main" noChangeAspect="1"/>
-            </wp:cNvGraphicFramePr>
-            <a:graphic xmlns:a="http://schemas.openxmlformats.org/drawingml/2006/main">
-              <a:graphicData uri="http://schemas.openxmlformats.org/drawingml/2006/picture">
-                <pic:pic xmlns:pic="http://schemas.openxmlformats.org/drawingml/2006/picture">
-                  <pic:nvPicPr>
-                    <pic:cNvPr id="2109599408" name=""/>
-                    <pic:cNvPicPr/>
-                  </pic:nvPicPr>
-                  <pic:blipFill>
-                    <a:blip r:embed="rId18"/>
-                    <a:stretch>
-                      <a:fillRect/>
-                    </a:stretch>
-                  </pic:blipFill>
-                  <pic:spPr>
-                    <a:xfrm>
-                      <a:off x="0" y="0"/>
-                      <a:ext cx="4019550" cy="3400425"/>
-                    </a:xfrm>
-                    <a:prstGeom prst="rect">
-                      <a:avLst/>
-                    </a:prstGeom>
-                  </pic:spPr>
-                </pic:pic>
-              </a:graphicData>
-            </a:graphic>
-          </wp:inline>
-        </w:drawing>
-      </w:r>
-    </w:p>
-    <w:p>
-      <w:pPr>
-        <w:pStyle w:val="af9"/>
-      </w:pPr>
-    </w:p>
-    <w:p>
-      <w:pPr>
-        <w:pStyle w:val="af9"/>
-      </w:pPr>
-      <w:r>
-        <w:lastRenderedPageBreak/>
-        <w:drawing>
-          <wp:inline distT="0" distB="0" distL="0" distR="0" wp14:anchorId="22188C67" wp14:editId="22CF1932">
-            <wp:extent cx="4010025" cy="3267075"/>
-            <wp:effectExtent l="0" t="0" r="9525" b="9525"/>
-            <wp:docPr id="201311686" name="Рисунок 1"/>
-            <wp:cNvGraphicFramePr>
-              <a:graphicFrameLocks xmlns:a="http://schemas.openxmlformats.org/drawingml/2006/main" noChangeAspect="1"/>
-            </wp:cNvGraphicFramePr>
-            <a:graphic xmlns:a="http://schemas.openxmlformats.org/drawingml/2006/main">
-              <a:graphicData uri="http://schemas.openxmlformats.org/drawingml/2006/picture">
-                <pic:pic xmlns:pic="http://schemas.openxmlformats.org/drawingml/2006/picture">
-                  <pic:nvPicPr>
-                    <pic:cNvPr id="201311686" name=""/>
-                    <pic:cNvPicPr/>
-                  </pic:nvPicPr>
-                  <pic:blipFill>
-                    <a:blip r:embed="rId19"/>
-                    <a:stretch>
-                      <a:fillRect/>
-                    </a:stretch>
-                  </pic:blipFill>
-                  <pic:spPr>
-                    <a:xfrm>
-                      <a:off x="0" y="0"/>
-                      <a:ext cx="4010025" cy="3267075"/>
-                    </a:xfrm>
-                    <a:prstGeom prst="rect">
-                      <a:avLst/>
-                    </a:prstGeom>
-                  </pic:spPr>
-                </pic:pic>
-              </a:graphicData>
-            </a:graphic>
-          </wp:inline>
-        </w:drawing>
-      </w:r>
+        <w:pStyle w:val="2"/>
+        <w:numPr>
+          <w:ilvl w:val="1"/>
+          <w:numId w:val="27"/>
+        </w:numPr>
+      </w:pPr>
+      <w:bookmarkStart w:id="10" w:name="_Toc232158920"/>
+      <w:r>
+        <w:t>Тестовый случай сохранения фигур</w:t>
+      </w:r>
+      <w:bookmarkEnd w:id="10"/>
     </w:p>
     <w:p>
       <w:pPr>
@@ -7924,6 +7650,35 @@
     </w:p>
     <w:p>
       <w:pPr>
+        <w:pStyle w:val="aff"/>
+      </w:pPr>
+      <w:r>
+        <w:t xml:space="preserve">Рисунок </w:t>
+      </w:r>
+      <w:r>
+        <w:fldChar w:fldCharType="begin"/>
+      </w:r>
+      <w:r>
+        <w:instrText xml:space="preserve"> SEQ Рисунок \* ARABIC </w:instrText>
+      </w:r>
+      <w:r>
+        <w:fldChar w:fldCharType="separate"/>
+      </w:r>
+      <w:r>
+        <w:rPr>
+          <w:noProof/>
+        </w:rPr>
+        <w:t>12</w:t>
+      </w:r>
+      <w:r>
+        <w:fldChar w:fldCharType="end"/>
+      </w:r>
+      <w:r>
+        <w:t xml:space="preserve"> – Выпадающий список с выбором действия</w:t>
+      </w:r>
+    </w:p>
+    <w:p>
+      <w:pPr>
         <w:pStyle w:val="af9"/>
       </w:pPr>
     </w:p>
@@ -7971,15 +7726,43 @@
     </w:p>
     <w:p>
       <w:pPr>
-        <w:pStyle w:val="af9"/>
-      </w:pPr>
+        <w:pStyle w:val="aff"/>
+      </w:pPr>
+      <w:r>
+        <w:t xml:space="preserve">Рисунок </w:t>
+      </w:r>
+      <w:r>
+        <w:fldChar w:fldCharType="begin"/>
+      </w:r>
+      <w:r>
+        <w:instrText xml:space="preserve"> SEQ Рисунок \* ARABIC </w:instrText>
+      </w:r>
+      <w:r>
+        <w:fldChar w:fldCharType="separate"/>
+      </w:r>
+      <w:r>
+        <w:rPr>
+          <w:noProof/>
+        </w:rPr>
+        <w:t>13</w:t>
+      </w:r>
+      <w:r>
+        <w:fldChar w:fldCharType="end"/>
+      </w:r>
+      <w:r>
+        <w:t xml:space="preserve"> – Окно сохранения фигур</w:t>
+      </w:r>
     </w:p>
     <w:p>
       <w:pPr>
         <w:pStyle w:val="af9"/>
       </w:pPr>
-      <w:r>
-        <w:lastRenderedPageBreak/>
+    </w:p>
+    <w:p>
+      <w:pPr>
+        <w:pStyle w:val="af9"/>
+      </w:pPr>
+      <w:r>
         <w:drawing>
           <wp:inline distT="0" distB="0" distL="0" distR="0" wp14:anchorId="6FFE79EA" wp14:editId="1097FD5F">
             <wp:extent cx="2571750" cy="1600200"/>
@@ -8019,6 +7802,48 @@
     </w:p>
     <w:p>
       <w:pPr>
+        <w:pStyle w:val="aff"/>
+      </w:pPr>
+      <w:r>
+        <w:t xml:space="preserve">Рисунок </w:t>
+      </w:r>
+      <w:r>
+        <w:fldChar w:fldCharType="begin"/>
+      </w:r>
+      <w:r>
+        <w:instrText xml:space="preserve"> SEQ Рисунок \* ARABIC </w:instrText>
+      </w:r>
+      <w:r>
+        <w:fldChar w:fldCharType="separate"/>
+      </w:r>
+      <w:r>
+        <w:rPr>
+          <w:noProof/>
+        </w:rPr>
+        <w:t>14</w:t>
+      </w:r>
+      <w:r>
+        <w:fldChar w:fldCharType="end"/>
+      </w:r>
+      <w:r>
+        <w:t xml:space="preserve"> – Результат сохранения фигур</w:t>
+      </w:r>
+    </w:p>
+    <w:p>
+      <w:pPr>
+        <w:pStyle w:val="aff"/>
+      </w:pPr>
+    </w:p>
+    <w:p>
+      <w:pPr>
+        <w:pStyle w:val="aff"/>
+        <w:rPr>
+          <w:lang w:val="en-US"/>
+        </w:rPr>
+      </w:pPr>
+    </w:p>
+    <w:p>
+      <w:pPr>
         <w:pStyle w:val="af9"/>
       </w:pPr>
     </w:p>
@@ -8066,6 +7891,38 @@
     </w:p>
     <w:p>
       <w:pPr>
+        <w:pStyle w:val="aff"/>
+      </w:pPr>
+      <w:r>
+        <w:t xml:space="preserve">Рисунок </w:t>
+      </w:r>
+      <w:r>
+        <w:fldChar w:fldCharType="begin"/>
+      </w:r>
+      <w:r>
+        <w:instrText xml:space="preserve"> SEQ Рисунок \* ARABIC </w:instrText>
+      </w:r>
+      <w:r>
+        <w:fldChar w:fldCharType="separate"/>
+      </w:r>
+      <w:r>
+        <w:rPr>
+          <w:noProof/>
+        </w:rPr>
+        <w:t>15</w:t>
+      </w:r>
+      <w:r>
+        <w:fldChar w:fldCharType="end"/>
+      </w:r>
+      <w:r>
+        <w:t xml:space="preserve"> – </w:t>
+      </w:r>
+      <w:r>
+        <w:t>Выбор фигур для удаления</w:t>
+      </w:r>
+    </w:p>
+    <w:p>
+      <w:pPr>
         <w:pStyle w:val="af9"/>
       </w:pPr>
     </w:p>
@@ -8113,8 +7970,46 @@
     </w:p>
     <w:p>
       <w:pPr>
-        <w:pStyle w:val="af9"/>
-      </w:pPr>
+        <w:pStyle w:val="aff"/>
+      </w:pPr>
+      <w:r>
+        <w:t xml:space="preserve">Рисунок </w:t>
+      </w:r>
+      <w:r>
+        <w:fldChar w:fldCharType="begin"/>
+      </w:r>
+      <w:r>
+        <w:instrText xml:space="preserve"> SEQ Рисунок \* ARABIC </w:instrText>
+      </w:r>
+      <w:r>
+        <w:fldChar w:fldCharType="separate"/>
+      </w:r>
+      <w:r>
+        <w:rPr>
+          <w:noProof/>
+        </w:rPr>
+        <w:t>16</w:t>
+      </w:r>
+      <w:r>
+        <w:fldChar w:fldCharType="end"/>
+      </w:r>
+      <w:r>
+        <w:t xml:space="preserve"> – Результат удаления фигур</w:t>
+      </w:r>
+    </w:p>
+    <w:p>
+      <w:pPr>
+        <w:pStyle w:val="2"/>
+        <w:numPr>
+          <w:ilvl w:val="1"/>
+          <w:numId w:val="27"/>
+        </w:numPr>
+      </w:pPr>
+      <w:bookmarkStart w:id="11" w:name="_Toc232158921"/>
+      <w:r>
+        <w:t>Тестовый случай загрузки фигур</w:t>
+      </w:r>
+      <w:bookmarkEnd w:id="11"/>
     </w:p>
     <w:p>
       <w:pPr>
@@ -8160,15 +8055,54 @@
     </w:p>
     <w:p>
       <w:pPr>
-        <w:pStyle w:val="af9"/>
-      </w:pPr>
+        <w:pStyle w:val="a3"/>
+        <w:jc w:val="center"/>
+      </w:pPr>
+      <w:r>
+        <w:t xml:space="preserve">Рисунок </w:t>
+      </w:r>
+      <w:r>
+        <w:fldChar w:fldCharType="begin"/>
+      </w:r>
+      <w:r>
+        <w:instrText xml:space="preserve"> SEQ Рисунок \* ARABIC </w:instrText>
+      </w:r>
+      <w:r>
+        <w:fldChar w:fldCharType="separate"/>
+      </w:r>
+      <w:r>
+        <w:rPr>
+          <w:noProof/>
+        </w:rPr>
+        <w:t>17</w:t>
+      </w:r>
+      <w:r>
+        <w:fldChar w:fldCharType="end"/>
+      </w:r>
+      <w:r>
+        <w:t xml:space="preserve"> – Результат загрузки файлов</w:t>
+      </w:r>
     </w:p>
     <w:p>
       <w:pPr>
+        <w:pStyle w:val="2"/>
+        <w:numPr>
+          <w:ilvl w:val="1"/>
+          <w:numId w:val="27"/>
+        </w:numPr>
+      </w:pPr>
+      <w:bookmarkStart w:id="12" w:name="_Toc232158922"/>
+      <w:r>
+        <w:lastRenderedPageBreak/>
+        <w:t>Тестовый случай поиска фигур</w:t>
+      </w:r>
+      <w:bookmarkEnd w:id="12"/>
+    </w:p>
+    <w:p>
+      <w:pPr>
         <w:pStyle w:val="af9"/>
       </w:pPr>
       <w:r>
-        <w:lastRenderedPageBreak/>
         <w:drawing>
           <wp:inline distT="0" distB="0" distL="0" distR="0" wp14:anchorId="13B35240" wp14:editId="63C601B2">
             <wp:extent cx="5940425" cy="2265680"/>
@@ -8208,6 +8142,35 @@
     </w:p>
     <w:p>
       <w:pPr>
+        <w:pStyle w:val="aff"/>
+      </w:pPr>
+      <w:r>
+        <w:t xml:space="preserve">Рисунок </w:t>
+      </w:r>
+      <w:r>
+        <w:fldChar w:fldCharType="begin"/>
+      </w:r>
+      <w:r>
+        <w:instrText xml:space="preserve"> SEQ Рисунок \* ARABIC </w:instrText>
+      </w:r>
+      <w:r>
+        <w:fldChar w:fldCharType="separate"/>
+      </w:r>
+      <w:r>
+        <w:rPr>
+          <w:noProof/>
+        </w:rPr>
+        <w:t>18</w:t>
+      </w:r>
+      <w:r>
+        <w:fldChar w:fldCharType="end"/>
+      </w:r>
+      <w:r>
+        <w:t xml:space="preserve"> – Главное окно поиска фигур</w:t>
+      </w:r>
+    </w:p>
+    <w:p>
+      <w:pPr>
         <w:pStyle w:val="af9"/>
       </w:pPr>
     </w:p>
@@ -8255,6 +8218,36 @@
     </w:p>
     <w:p>
       <w:pPr>
+        <w:pStyle w:val="a3"/>
+        <w:jc w:val="center"/>
+      </w:pPr>
+      <w:r>
+        <w:t xml:space="preserve">Рисунок </w:t>
+      </w:r>
+      <w:r>
+        <w:fldChar w:fldCharType="begin"/>
+      </w:r>
+      <w:r>
+        <w:instrText xml:space="preserve"> SEQ Рисунок \* ARABIC </w:instrText>
+      </w:r>
+      <w:r>
+        <w:fldChar w:fldCharType="separate"/>
+      </w:r>
+      <w:r>
+        <w:rPr>
+          <w:noProof/>
+        </w:rPr>
+        <w:t>19</w:t>
+      </w:r>
+      <w:r>
+        <w:fldChar w:fldCharType="end"/>
+      </w:r>
+      <w:r>
+        <w:t xml:space="preserve"> – Результат поиска всех фигур</w:t>
+      </w:r>
+    </w:p>
+    <w:p>
+      <w:pPr>
         <w:pStyle w:val="af9"/>
       </w:pPr>
     </w:p>
@@ -8302,15 +8295,44 @@
     </w:p>
     <w:p>
       <w:pPr>
-        <w:pStyle w:val="af9"/>
-      </w:pPr>
+        <w:pStyle w:val="a3"/>
+        <w:jc w:val="center"/>
+      </w:pPr>
+      <w:r>
+        <w:t xml:space="preserve">Рисунок </w:t>
+      </w:r>
+      <w:r>
+        <w:fldChar w:fldCharType="begin"/>
+      </w:r>
+      <w:r>
+        <w:instrText xml:space="preserve"> SEQ Рисунок \* ARABIC </w:instrText>
+      </w:r>
+      <w:r>
+        <w:fldChar w:fldCharType="separate"/>
+      </w:r>
+      <w:r>
+        <w:rPr>
+          <w:noProof/>
+        </w:rPr>
+        <w:t>20</w:t>
+      </w:r>
+      <w:r>
+        <w:fldChar w:fldCharType="end"/>
+      </w:r>
+      <w:r>
+        <w:t xml:space="preserve"> – Результат поиска фигуры</w:t>
+      </w:r>
     </w:p>
     <w:p>
       <w:pPr>
         <w:pStyle w:val="af9"/>
       </w:pPr>
-      <w:r>
-        <w:lastRenderedPageBreak/>
+    </w:p>
+    <w:p>
+      <w:pPr>
+        <w:pStyle w:val="af9"/>
+      </w:pPr>
+      <w:r>
         <w:drawing>
           <wp:inline distT="0" distB="0" distL="0" distR="0" wp14:anchorId="6157B8B1" wp14:editId="5D4B8E07">
             <wp:extent cx="5940425" cy="2259330"/>
@@ -8350,6 +8372,35 @@
     </w:p>
     <w:p>
       <w:pPr>
+        <w:pStyle w:val="aff"/>
+      </w:pPr>
+      <w:r>
+        <w:t xml:space="preserve">Рисунок </w:t>
+      </w:r>
+      <w:r>
+        <w:fldChar w:fldCharType="begin"/>
+      </w:r>
+      <w:r>
+        <w:instrText xml:space="preserve"> SEQ Рисунок \* ARABIC </w:instrText>
+      </w:r>
+      <w:r>
+        <w:fldChar w:fldCharType="separate"/>
+      </w:r>
+      <w:r>
+        <w:rPr>
+          <w:noProof/>
+        </w:rPr>
+        <w:t>21</w:t>
+      </w:r>
+      <w:r>
+        <w:fldChar w:fldCharType="end"/>
+      </w:r>
+      <w:r>
+        <w:t xml:space="preserve"> – Пустой результат</w:t>
+      </w:r>
+    </w:p>
+    <w:p>
+      <w:pPr>
         <w:pStyle w:val="af9"/>
       </w:pPr>
     </w:p>
@@ -8395,8 +8446,42 @@
         </w:drawing>
       </w:r>
     </w:p>
+    <w:p>
+      <w:pPr>
+        <w:pStyle w:val="aff"/>
+      </w:pPr>
+      <w:r>
+        <w:t xml:space="preserve">Рисунок </w:t>
+      </w:r>
+      <w:r>
+        <w:fldChar w:fldCharType="begin"/>
+      </w:r>
+      <w:r>
+        <w:instrText xml:space="preserve"> SEQ Рисунок \* ARABIC </w:instrText>
+      </w:r>
+      <w:r>
+        <w:fldChar w:fldCharType="separate"/>
+      </w:r>
+      <w:r>
+        <w:rPr>
+          <w:noProof/>
+        </w:rPr>
+        <w:t>22</w:t>
+      </w:r>
+      <w:r>
+        <w:fldChar w:fldCharType="end"/>
+      </w:r>
+      <w:r>
+        <w:t xml:space="preserve"> – Ошибка задания исходных данный в окне поиска фигур</w:t>
+      </w:r>
+    </w:p>
     <w:sectPr>
-      <w:footerReference w:type="default" r:id="rId31"/>
+      <w:headerReference w:type="even" r:id="rId31"/>
+      <w:headerReference w:type="default" r:id="rId32"/>
+      <w:footerReference w:type="even" r:id="rId33"/>
+      <w:footerReference w:type="default" r:id="rId34"/>
+      <w:headerReference w:type="first" r:id="rId35"/>
+      <w:footerReference w:type="first" r:id="rId36"/>
       <w:pgSz w:w="11906" w:h="16838"/>
       <w:pgMar w:top="1134" w:right="850" w:bottom="1134" w:left="1701" w:header="708" w:footer="708" w:gutter="0"/>
       <w:cols w:space="708"/>
@@ -8433,6 +8518,16 @@
 </file>
 
 <file path=word/footer1.xml><?xml version="1.0" encoding="utf-8"?>
+<w:ftr xmlns:wpc="http://schemas.microsoft.com/office/word/2010/wordprocessingCanvas" xmlns:cx="http://schemas.microsoft.com/office/drawing/2014/chartex" xmlns:cx1="http://schemas.microsoft.com/office/drawing/2015/9/8/chartex" xmlns:cx2="http://schemas.microsoft.com/office/drawing/2015/10/21/chartex" xmlns:cx3="http://schemas.microsoft.com/office/drawing/2016/5/9/chartex" xmlns:cx4="http://schemas.microsoft.com/office/drawing/2016/5/10/chartex" xmlns:cx5="http://schemas.microsoft.com/office/drawing/2016/5/11/chartex" xmlns:cx6="http://schemas.microsoft.com/office/drawing/2016/5/12/chartex" xmlns:cx7="http://schemas.microsoft.com/office/drawing/2016/5/13/chartex" xmlns:cx8="http://schemas.microsoft.com/office/drawing/2016/5/14/chartex" xmlns:mc="http://schemas.openxmlformats.org/markup-compatibility/2006" xmlns:aink="http://schemas.microsoft.com/office/drawing/2016/ink" xmlns:am3d="http://schemas.microsoft.com/office/drawing/2017/model3d" xmlns:o="urn:schemas-microsoft-com:office:office" xmlns:oel="http://schemas.microsoft.com/office/2019/extlst" xmlns:r="http://schemas.openxmlformats.org/officeDocument/2006/relationships" xmlns:m="http://schemas.openxmlformats.org/officeDocument/2006/math" xmlns:v="urn:schemas-microsoft-com:vml" xmlns:wp14="http://schemas.microsoft.com/office/word/2010/wordprocessingDrawing" xmlns:wp="http://schemas.openxmlformats.org/drawingml/2006/wordprocessingDrawing" xmlns:w10="urn:schemas-microsoft-com:office:word" xmlns:w="http://schemas.openxmlformats.org/wordprocessingml/2006/main" xmlns:w14="http://schemas.microsoft.com/office/word/2010/wordml" xmlns:w15="http://schemas.microsoft.com/office/word/2012/wordml" xmlns:w16cex="http://schemas.microsoft.com/office/word/2018/wordml/cex" xmlns:w16cid="http://schemas.microsoft.com/office/word/2016/wordml/cid" xmlns:w16="http://schemas.microsoft.com/office/word/2018/wordml" xmlns:w16du="http://schemas.microsoft.com/office/word/2023/wordml/word16du" xmlns:w16sdtdh="http://schemas.microsoft.com/office/word/2020/wordml/sdtdatahash" xmlns:w16sdtfl="http://schemas.microsoft.com/office/word/2024/wordml/sdtformatlock" xmlns:w16se="http://schemas.microsoft.com/office/word/2015/wordml/symex" xmlns:wpg="http://schemas.microsoft.com/office/word/2010/wordprocessingGroup" xmlns:wpi="http://schemas.microsoft.com/office/word/2010/wordprocessingInk" xmlns:wne="http://schemas.microsoft.com/office/word/2006/wordml" xmlns:wps="http://schemas.microsoft.com/office/word/2010/wordprocessingShape" mc:Ignorable="w14 w15 w16se w16cid w16 w16cex w16sdtdh w16sdtfl w16du wp14">
+  <w:p>
+    <w:pPr>
+      <w:pStyle w:val="af"/>
+    </w:pPr>
+  </w:p>
+</w:ftr>
+</file>
+
+<file path=word/footer2.xml><?xml version="1.0" encoding="utf-8"?>
 <w:ftr xmlns:wpc="http://schemas.microsoft.com/office/word/2010/wordprocessingCanvas" xmlns:cx="http://schemas.microsoft.com/office/drawing/2014/chartex" xmlns:cx1="http://schemas.microsoft.com/office/drawing/2015/9/8/chartex" xmlns:cx2="http://schemas.microsoft.com/office/drawing/2015/10/21/chartex" xmlns:cx3="http://schemas.microsoft.com/office/drawing/2016/5/9/chartex" xmlns:cx4="http://schemas.microsoft.com/office/drawing/2016/5/10/chartex" xmlns:cx5="http://schemas.microsoft.com/office/drawing/2016/5/11/chartex" xmlns:cx6="http://schemas.microsoft.com/office/drawing/2016/5/12/chartex" xmlns:cx7="http://schemas.microsoft.com/office/drawing/2016/5/13/chartex" xmlns:cx8="http://schemas.microsoft.com/office/drawing/2016/5/14/chartex" xmlns:mc="http://schemas.openxmlformats.org/markup-compatibility/2006" xmlns:aink="http://schemas.microsoft.com/office/drawing/2016/ink" xmlns:am3d="http://schemas.microsoft.com/office/drawing/2017/model3d" xmlns:o="urn:schemas-microsoft-com:office:office" xmlns:oel="http://schemas.microsoft.com/office/2019/extlst" xmlns:r="http://schemas.openxmlformats.org/officeDocument/2006/relationships" xmlns:m="http://schemas.openxmlformats.org/officeDocument/2006/math" xmlns:v="urn:schemas-microsoft-com:vml" xmlns:wp14="http://schemas.microsoft.com/office/word/2010/wordprocessingDrawing" xmlns:wp="http://schemas.openxmlformats.org/drawingml/2006/wordprocessingDrawing" xmlns:w10="urn:schemas-microsoft-com:office:word" xmlns:w="http://schemas.openxmlformats.org/wordprocessingml/2006/main" xmlns:w14="http://schemas.microsoft.com/office/word/2010/wordml" xmlns:w15="http://schemas.microsoft.com/office/word/2012/wordml" xmlns:w16cex="http://schemas.microsoft.com/office/word/2018/wordml/cex" xmlns:w16cid="http://schemas.microsoft.com/office/word/2016/wordml/cid" xmlns:w16="http://schemas.microsoft.com/office/word/2018/wordml" xmlns:w16du="http://schemas.microsoft.com/office/word/2023/wordml/word16du" xmlns:w16sdtdh="http://schemas.microsoft.com/office/word/2020/wordml/sdtdatahash" xmlns:w16sdtfl="http://schemas.microsoft.com/office/word/2024/wordml/sdtformatlock" xmlns:w16se="http://schemas.microsoft.com/office/word/2015/wordml/symex" xmlns:wpg="http://schemas.microsoft.com/office/word/2010/wordprocessingGroup" xmlns:wpi="http://schemas.microsoft.com/office/word/2010/wordprocessingInk" xmlns:wne="http://schemas.microsoft.com/office/word/2006/wordml" xmlns:wps="http://schemas.microsoft.com/office/word/2010/wordprocessingShape" mc:Ignorable="w14 w15 w16se w16cid w16 w16cex w16sdtdh w16sdtfl w16du wp14">
   <w:sdt>
     <w:sdtPr>
@@ -8469,6 +8564,20 @@
 </w:ftr>
 </file>
 
+<file path=word/footer3.xml><?xml version="1.0" encoding="utf-8"?>
+<w:ftr xmlns:wpc="http://schemas.microsoft.com/office/word/2010/wordprocessingCanvas" xmlns:cx="http://schemas.microsoft.com/office/drawing/2014/chartex" xmlns:cx1="http://schemas.microsoft.com/office/drawing/2015/9/8/chartex" xmlns:cx2="http://schemas.microsoft.com/office/drawing/2015/10/21/chartex" xmlns:cx3="http://schemas.microsoft.com/office/drawing/2016/5/9/chartex" xmlns:cx4="http://schemas.microsoft.com/office/drawing/2016/5/10/chartex" xmlns:cx5="http://schemas.microsoft.com/office/drawing/2016/5/11/chartex" xmlns:cx6="http://schemas.microsoft.com/office/drawing/2016/5/12/chartex" xmlns:cx7="http://schemas.microsoft.com/office/drawing/2016/5/13/chartex" xmlns:cx8="http://schemas.microsoft.com/office/drawing/2016/5/14/chartex" xmlns:mc="http://schemas.openxmlformats.org/markup-compatibility/2006" xmlns:aink="http://schemas.microsoft.com/office/drawing/2016/ink" xmlns:am3d="http://schemas.microsoft.com/office/drawing/2017/model3d" xmlns:o="urn:schemas-microsoft-com:office:office" xmlns:oel="http://schemas.microsoft.com/office/2019/extlst" xmlns:r="http://schemas.openxmlformats.org/officeDocument/2006/relationships" xmlns:m="http://schemas.openxmlformats.org/officeDocument/2006/math" xmlns:v="urn:schemas-microsoft-com:vml" xmlns:wp14="http://schemas.microsoft.com/office/word/2010/wordprocessingDrawing" xmlns:wp="http://schemas.openxmlformats.org/drawingml/2006/wordprocessingDrawing" xmlns:w10="urn:schemas-microsoft-com:office:word" xmlns:w="http://schemas.openxmlformats.org/wordprocessingml/2006/main" xmlns:w14="http://schemas.microsoft.com/office/word/2010/wordml" xmlns:w15="http://schemas.microsoft.com/office/word/2012/wordml" xmlns:w16cex="http://schemas.microsoft.com/office/word/2018/wordml/cex" xmlns:w16cid="http://schemas.microsoft.com/office/word/2016/wordml/cid" xmlns:w16="http://schemas.microsoft.com/office/word/2018/wordml" xmlns:w16du="http://schemas.microsoft.com/office/word/2023/wordml/word16du" xmlns:w16sdtdh="http://schemas.microsoft.com/office/word/2020/wordml/sdtdatahash" xmlns:w16sdtfl="http://schemas.microsoft.com/office/word/2024/wordml/sdtformatlock" xmlns:w16se="http://schemas.microsoft.com/office/word/2015/wordml/symex" xmlns:wpg="http://schemas.microsoft.com/office/word/2010/wordprocessingGroup" xmlns:wpi="http://schemas.microsoft.com/office/word/2010/wordprocessingInk" xmlns:wne="http://schemas.microsoft.com/office/word/2006/wordml" xmlns:wps="http://schemas.microsoft.com/office/word/2010/wordprocessingShape" mc:Ignorable="w14 w15 w16se w16cid w16 w16cex w16sdtdh w16sdtfl w16du wp14">
+  <w:p>
+    <w:pPr>
+      <w:pStyle w:val="af"/>
+      <w:jc w:val="center"/>
+    </w:pPr>
+    <w:r>
+      <w:t>Томск 2026 г.</w:t>
+    </w:r>
+  </w:p>
+</w:ftr>
+</file>
+
 <file path=word/footnotes.xml><?xml version="1.0" encoding="utf-8"?>
 <w:footnotes xmlns:wpc="http://schemas.microsoft.com/office/word/2010/wordprocessingCanvas" xmlns:cx="http://schemas.microsoft.com/office/drawing/2014/chartex" xmlns:cx1="http://schemas.microsoft.com/office/drawing/2015/9/8/chartex" xmlns:cx2="http://schemas.microsoft.com/office/drawing/2015/10/21/chartex" xmlns:cx3="http://schemas.microsoft.com/office/drawing/2016/5/9/chartex" xmlns:cx4="http://schemas.microsoft.com/office/drawing/2016/5/10/chartex" xmlns:cx5="http://schemas.microsoft.com/office/drawing/2016/5/11/chartex" xmlns:cx6="http://schemas.microsoft.com/office/drawing/2016/5/12/chartex" xmlns:cx7="http://schemas.microsoft.com/office/drawing/2016/5/13/chartex" xmlns:cx8="http://schemas.microsoft.com/office/drawing/2016/5/14/chartex" xmlns:mc="http://schemas.openxmlformats.org/markup-compatibility/2006" xmlns:aink="http://schemas.microsoft.com/office/drawing/2016/ink" xmlns:am3d="http://schemas.microsoft.com/office/drawing/2017/model3d" xmlns:o="urn:schemas-microsoft-com:office:office" xmlns:oel="http://schemas.microsoft.com/office/2019/extlst" xmlns:r="http://schemas.openxmlformats.org/officeDocument/2006/relationships" xmlns:m="http://schemas.openxmlformats.org/officeDocument/2006/math" xmlns:v="urn:schemas-microsoft-com:vml" xmlns:wp14="http://schemas.microsoft.com/office/word/2010/wordprocessingDrawing" xmlns:wp="http://schemas.openxmlformats.org/drawingml/2006/wordprocessingDrawing" xmlns:w10="urn:schemas-microsoft-com:office:word" xmlns:w="http://schemas.openxmlformats.org/wordprocessingml/2006/main" xmlns:w14="http://schemas.microsoft.com/office/word/2010/wordml" xmlns:w15="http://schemas.microsoft.com/office/word/2012/wordml" xmlns:w16cex="http://schemas.microsoft.com/office/word/2018/wordml/cex" xmlns:w16cid="http://schemas.microsoft.com/office/word/2016/wordml/cid" xmlns:w16="http://schemas.microsoft.com/office/word/2018/wordml" xmlns:w16du="http://schemas.microsoft.com/office/word/2023/wordml/word16du" xmlns:w16sdtdh="http://schemas.microsoft.com/office/word/2020/wordml/sdtdatahash" xmlns:w16sdtfl="http://schemas.microsoft.com/office/word/2024/wordml/sdtformatlock" xmlns:w16se="http://schemas.microsoft.com/office/word/2015/wordml/symex" xmlns:wpg="http://schemas.microsoft.com/office/word/2010/wordprocessingGroup" xmlns:wpi="http://schemas.microsoft.com/office/word/2010/wordprocessingInk" xmlns:wne="http://schemas.microsoft.com/office/word/2006/wordml" xmlns:wps="http://schemas.microsoft.com/office/word/2010/wordprocessingShape" mc:Ignorable="w14 w15 w16se w16cid w16 w16cex w16sdtdh w16sdtfl w16du wp14">
   <w:footnote w:type="separator" w:id="-1">
@@ -8492,6 +8601,36 @@
     </w:p>
   </w:footnote>
 </w:footnotes>
+</file>
+
+<file path=word/header1.xml><?xml version="1.0" encoding="utf-8"?>
+<w:hdr xmlns:wpc="http://schemas.microsoft.com/office/word/2010/wordprocessingCanvas" xmlns:cx="http://schemas.microsoft.com/office/drawing/2014/chartex" xmlns:cx1="http://schemas.microsoft.com/office/drawing/2015/9/8/chartex" xmlns:cx2="http://schemas.microsoft.com/office/drawing/2015/10/21/chartex" xmlns:cx3="http://schemas.microsoft.com/office/drawing/2016/5/9/chartex" xmlns:cx4="http://schemas.microsoft.com/office/drawing/2016/5/10/chartex" xmlns:cx5="http://schemas.microsoft.com/office/drawing/2016/5/11/chartex" xmlns:cx6="http://schemas.microsoft.com/office/drawing/2016/5/12/chartex" xmlns:cx7="http://schemas.microsoft.com/office/drawing/2016/5/13/chartex" xmlns:cx8="http://schemas.microsoft.com/office/drawing/2016/5/14/chartex" xmlns:mc="http://schemas.openxmlformats.org/markup-compatibility/2006" xmlns:aink="http://schemas.microsoft.com/office/drawing/2016/ink" xmlns:am3d="http://schemas.microsoft.com/office/drawing/2017/model3d" xmlns:o="urn:schemas-microsoft-com:office:office" xmlns:oel="http://schemas.microsoft.com/office/2019/extlst" xmlns:r="http://schemas.openxmlformats.org/officeDocument/2006/relationships" xmlns:m="http://schemas.openxmlformats.org/officeDocument/2006/math" xmlns:v="urn:schemas-microsoft-com:vml" xmlns:wp14="http://schemas.microsoft.com/office/word/2010/wordprocessingDrawing" xmlns:wp="http://schemas.openxmlformats.org/drawingml/2006/wordprocessingDrawing" xmlns:w10="urn:schemas-microsoft-com:office:word" xmlns:w="http://schemas.openxmlformats.org/wordprocessingml/2006/main" xmlns:w14="http://schemas.microsoft.com/office/word/2010/wordml" xmlns:w15="http://schemas.microsoft.com/office/word/2012/wordml" xmlns:w16cex="http://schemas.microsoft.com/office/word/2018/wordml/cex" xmlns:w16cid="http://schemas.microsoft.com/office/word/2016/wordml/cid" xmlns:w16="http://schemas.microsoft.com/office/word/2018/wordml" xmlns:w16du="http://schemas.microsoft.com/office/word/2023/wordml/word16du" xmlns:w16sdtdh="http://schemas.microsoft.com/office/word/2020/wordml/sdtdatahash" xmlns:w16sdtfl="http://schemas.microsoft.com/office/word/2024/wordml/sdtformatlock" xmlns:w16se="http://schemas.microsoft.com/office/word/2015/wordml/symex" xmlns:wpg="http://schemas.microsoft.com/office/word/2010/wordprocessingGroup" xmlns:wpi="http://schemas.microsoft.com/office/word/2010/wordprocessingInk" xmlns:wne="http://schemas.microsoft.com/office/word/2006/wordml" xmlns:wps="http://schemas.microsoft.com/office/word/2010/wordprocessingShape" mc:Ignorable="w14 w15 w16se w16cid w16 w16cex w16sdtdh w16sdtfl w16du wp14">
+  <w:p>
+    <w:pPr>
+      <w:pStyle w:val="ad"/>
+    </w:pPr>
+  </w:p>
+</w:hdr>
+</file>
+
+<file path=word/header2.xml><?xml version="1.0" encoding="utf-8"?>
+<w:hdr xmlns:wpc="http://schemas.microsoft.com/office/word/2010/wordprocessingCanvas" xmlns:cx="http://schemas.microsoft.com/office/drawing/2014/chartex" xmlns:cx1="http://schemas.microsoft.com/office/drawing/2015/9/8/chartex" xmlns:cx2="http://schemas.microsoft.com/office/drawing/2015/10/21/chartex" xmlns:cx3="http://schemas.microsoft.com/office/drawing/2016/5/9/chartex" xmlns:cx4="http://schemas.microsoft.com/office/drawing/2016/5/10/chartex" xmlns:cx5="http://schemas.microsoft.com/office/drawing/2016/5/11/chartex" xmlns:cx6="http://schemas.microsoft.com/office/drawing/2016/5/12/chartex" xmlns:cx7="http://schemas.microsoft.com/office/drawing/2016/5/13/chartex" xmlns:cx8="http://schemas.microsoft.com/office/drawing/2016/5/14/chartex" xmlns:mc="http://schemas.openxmlformats.org/markup-compatibility/2006" xmlns:aink="http://schemas.microsoft.com/office/drawing/2016/ink" xmlns:am3d="http://schemas.microsoft.com/office/drawing/2017/model3d" xmlns:o="urn:schemas-microsoft-com:office:office" xmlns:oel="http://schemas.microsoft.com/office/2019/extlst" xmlns:r="http://schemas.openxmlformats.org/officeDocument/2006/relationships" xmlns:m="http://schemas.openxmlformats.org/officeDocument/2006/math" xmlns:v="urn:schemas-microsoft-com:vml" xmlns:wp14="http://schemas.microsoft.com/office/word/2010/wordprocessingDrawing" xmlns:wp="http://schemas.openxmlformats.org/drawingml/2006/wordprocessingDrawing" xmlns:w10="urn:schemas-microsoft-com:office:word" xmlns:w="http://schemas.openxmlformats.org/wordprocessingml/2006/main" xmlns:w14="http://schemas.microsoft.com/office/word/2010/wordml" xmlns:w15="http://schemas.microsoft.com/office/word/2012/wordml" xmlns:w16cex="http://schemas.microsoft.com/office/word/2018/wordml/cex" xmlns:w16cid="http://schemas.microsoft.com/office/word/2016/wordml/cid" xmlns:w16="http://schemas.microsoft.com/office/word/2018/wordml" xmlns:w16du="http://schemas.microsoft.com/office/word/2023/wordml/word16du" xmlns:w16sdtdh="http://schemas.microsoft.com/office/word/2020/wordml/sdtdatahash" xmlns:w16sdtfl="http://schemas.microsoft.com/office/word/2024/wordml/sdtformatlock" xmlns:w16se="http://schemas.microsoft.com/office/word/2015/wordml/symex" xmlns:wpg="http://schemas.microsoft.com/office/word/2010/wordprocessingGroup" xmlns:wpi="http://schemas.microsoft.com/office/word/2010/wordprocessingInk" xmlns:wne="http://schemas.microsoft.com/office/word/2006/wordml" xmlns:wps="http://schemas.microsoft.com/office/word/2010/wordprocessingShape" mc:Ignorable="w14 w15 w16se w16cid w16 w16cex w16sdtdh w16sdtfl w16du wp14">
+  <w:p>
+    <w:pPr>
+      <w:pStyle w:val="ad"/>
+    </w:pPr>
+  </w:p>
+</w:hdr>
+</file>
+
+<file path=word/header3.xml><?xml version="1.0" encoding="utf-8"?>
+<w:hdr xmlns:wpc="http://schemas.microsoft.com/office/word/2010/wordprocessingCanvas" xmlns:cx="http://schemas.microsoft.com/office/drawing/2014/chartex" xmlns:cx1="http://schemas.microsoft.com/office/drawing/2015/9/8/chartex" xmlns:cx2="http://schemas.microsoft.com/office/drawing/2015/10/21/chartex" xmlns:cx3="http://schemas.microsoft.com/office/drawing/2016/5/9/chartex" xmlns:cx4="http://schemas.microsoft.com/office/drawing/2016/5/10/chartex" xmlns:cx5="http://schemas.microsoft.com/office/drawing/2016/5/11/chartex" xmlns:cx6="http://schemas.microsoft.com/office/drawing/2016/5/12/chartex" xmlns:cx7="http://schemas.microsoft.com/office/drawing/2016/5/13/chartex" xmlns:cx8="http://schemas.microsoft.com/office/drawing/2016/5/14/chartex" xmlns:mc="http://schemas.openxmlformats.org/markup-compatibility/2006" xmlns:aink="http://schemas.microsoft.com/office/drawing/2016/ink" xmlns:am3d="http://schemas.microsoft.com/office/drawing/2017/model3d" xmlns:o="urn:schemas-microsoft-com:office:office" xmlns:oel="http://schemas.microsoft.com/office/2019/extlst" xmlns:r="http://schemas.openxmlformats.org/officeDocument/2006/relationships" xmlns:m="http://schemas.openxmlformats.org/officeDocument/2006/math" xmlns:v="urn:schemas-microsoft-com:vml" xmlns:wp14="http://schemas.microsoft.com/office/word/2010/wordprocessingDrawing" xmlns:wp="http://schemas.openxmlformats.org/drawingml/2006/wordprocessingDrawing" xmlns:w10="urn:schemas-microsoft-com:office:word" xmlns:w="http://schemas.openxmlformats.org/wordprocessingml/2006/main" xmlns:w14="http://schemas.microsoft.com/office/word/2010/wordml" xmlns:w15="http://schemas.microsoft.com/office/word/2012/wordml" xmlns:w16cex="http://schemas.microsoft.com/office/word/2018/wordml/cex" xmlns:w16cid="http://schemas.microsoft.com/office/word/2016/wordml/cid" xmlns:w16="http://schemas.microsoft.com/office/word/2018/wordml" xmlns:w16du="http://schemas.microsoft.com/office/word/2023/wordml/word16du" xmlns:w16sdtdh="http://schemas.microsoft.com/office/word/2020/wordml/sdtdatahash" xmlns:w16sdtfl="http://schemas.microsoft.com/office/word/2024/wordml/sdtformatlock" xmlns:w16se="http://schemas.microsoft.com/office/word/2015/wordml/symex" xmlns:wpg="http://schemas.microsoft.com/office/word/2010/wordprocessingGroup" xmlns:wpi="http://schemas.microsoft.com/office/word/2010/wordprocessingInk" xmlns:wne="http://schemas.microsoft.com/office/word/2006/wordml" xmlns:wps="http://schemas.microsoft.com/office/word/2010/wordprocessingShape" mc:Ignorable="w14 w15 w16se w16cid w16 w16cex w16sdtdh w16sdtfl w16du wp14">
+  <w:p>
+    <w:pPr>
+      <w:pStyle w:val="ad"/>
+    </w:pPr>
+  </w:p>
+</w:hdr>
 </file>
 
 <file path=word/numbering.xml><?xml version="1.0" encoding="utf-8"?>

</xml_diff>